<commit_message>
docs + dist: v1.4.0 release
CHANGELOG, handbook per-section engines, V14 handoff; bump root to 1.4.0; fix tritonicRealisation import for desktop bundle; refresh app dist + build stamp.

Co-authored-by: Cursor <cursoragent@cursor.com>
</commit_message>
<xml_diff>
--- a/docs/COMPOSER_HANDBOOK.docx
+++ b/docs/COMPOSER_HANDBOOK.docx
@@ -8441,6 +8441,1164 @@
       </w:r>
       <w:r>
         <w:t xml:space="preserve"> (bar-by-bar progressions + engine/behaviour notes): blues, ii–V–I, Shorter, Messiaen, cinematic, minimalist, and more. Do not duplicate those recipes here; use them as musical targets and map dials + mode to match.</w:t>
+      </w:r>
+    </w:p>
+    <w:p>
+      <w:pPr>
+        <w:pStyle w:val="Heading2"/>
+        <w:spacing w:after="100" w:before="180"/>
+      </w:pPr>
+      <w:r>
+        <w:t xml:space="preserve">Song Mode — per-section engines</w:t>
+      </w:r>
+    </w:p>
+    <w:p>
+      <w:pPr>
+        <w:spacing w:after="160"/>
+      </w:pPr>
+      <w:r>
+        <w:t xml:space="preserve">Long-form Song Mode can </w:t>
+      </w:r>
+      <w:r>
+        <w:rPr>
+          <w:b/>
+          <w:bCs/>
+        </w:rPr>
+        <w:t xml:space="preserve">change engine family at section boundaries</w:t>
+      </w:r>
+      <w:r>
+        <w:t xml:space="preserve"> while keeping one chart. Think of each section as answering three questions before you generate.</w:t>
+      </w:r>
+    </w:p>
+    <w:p>
+      <w:pPr>
+        <w:pStyle w:val="Heading3"/>
+        <w:spacing w:after="80" w:before="140"/>
+      </w:pPr>
+      <w:r>
+        <w:t xml:space="preserve">1. What should this section feel like?</w:t>
+      </w:r>
+    </w:p>
+    <w:p>
+      <w:pPr>
+        <w:spacing w:after="160"/>
+      </w:pPr>
+      <w:r>
+        <w:t xml:space="preserve">Pick the emotional posture first — not the dropdown label.</w:t>
+      </w:r>
+    </w:p>
+    <w:tbl>
+      <w:tblPr>
+        <w:tblW w:type="pct" w:w="100%"/>
+        <w:tblBorders>
+          <w:top w:val="single" w:color="auto" w:sz="4"/>
+          <w:left w:val="single" w:color="auto" w:sz="4"/>
+          <w:bottom w:val="single" w:color="auto" w:sz="4"/>
+          <w:right w:val="single" w:color="auto" w:sz="4"/>
+          <w:insideH w:val="single" w:color="auto" w:sz="4"/>
+          <w:insideV w:val="single" w:color="auto" w:sz="4"/>
+        </w:tblBorders>
+      </w:tblPr>
+      <w:tblGrid>
+        <w:gridCol w:w="3000"/>
+        <w:gridCol w:w="3000"/>
+        <w:gridCol w:w="3000"/>
+      </w:tblGrid>
+      <w:tr>
+        <w:tc>
+          <w:tcPr>
+            <w:tcW w:type="pct" w:w="3000%"/>
+            <w:shd w:fill="E8EEF4"/>
+          </w:tcPr>
+          <w:p>
+            <w:pPr>
+              <w:spacing w:after="60"/>
+            </w:pPr>
+            <w:r>
+              <w:t xml:space="preserve">Feel</w:t>
+            </w:r>
+          </w:p>
+        </w:tc>
+        <w:tc>
+          <w:tcPr>
+            <w:tcW w:type="pct" w:w="3000%"/>
+            <w:shd w:fill="E8EEF4"/>
+          </w:tcPr>
+          <w:p>
+            <w:pPr>
+              <w:spacing w:after="60"/>
+            </w:pPr>
+            <w:r>
+              <w:t xml:space="preserve">What you hear</w:t>
+            </w:r>
+          </w:p>
+        </w:tc>
+        <w:tc>
+          <w:tcPr>
+            <w:tcW w:type="pct" w:w="3000%"/>
+            <w:shd w:fill="E8EEF4"/>
+          </w:tcPr>
+          <w:p>
+            <w:pPr>
+              <w:spacing w:after="60"/>
+            </w:pPr>
+            <w:r>
+              <w:t xml:space="preserve">Typical section</w:t>
+            </w:r>
+          </w:p>
+        </w:tc>
+      </w:tr>
+      <w:tr>
+        <w:tc>
+          <w:tcPr>
+            <w:tcW w:type="pct" w:w="3000%"/>
+          </w:tcPr>
+          <w:p>
+            <w:pPr>
+              <w:spacing w:after="60"/>
+            </w:pPr>
+            <w:r>
+              <w:rPr>
+                <w:b/>
+                <w:bCs/>
+              </w:rPr>
+              <w:t xml:space="preserve">Stable</w:t>
+            </w:r>
+          </w:p>
+        </w:tc>
+        <w:tc>
+          <w:tcPr>
+            <w:tcW w:type="pct" w:w="3000%"/>
+          </w:tcPr>
+          <w:p>
+            <w:pPr>
+              <w:spacing w:after="60"/>
+            </w:pPr>
+            <w:r>
+              <w:t xml:space="preserve">Locked harmony, songwriter slice owns the bars</w:t>
+            </w:r>
+          </w:p>
+        </w:tc>
+        <w:tc>
+          <w:tcPr>
+            <w:tcW w:type="pct" w:w="3000%"/>
+          </w:tcPr>
+          <w:p>
+            <w:pPr>
+              <w:spacing w:after="60"/>
+            </w:pPr>
+            <w:r>
+              <w:t xml:space="preserve">Intro, outro, tag</w:t>
+            </w:r>
+          </w:p>
+        </w:tc>
+      </w:tr>
+      <w:tr>
+        <w:tc>
+          <w:tcPr>
+            <w:tcW w:type="pct" w:w="3000%"/>
+          </w:tcPr>
+          <w:p>
+            <w:pPr>
+              <w:spacing w:after="60"/>
+            </w:pPr>
+            <w:r>
+              <w:rPr>
+                <w:b/>
+                <w:bCs/>
+              </w:rPr>
+              <w:t xml:space="preserve">Suspended</w:t>
+            </w:r>
+          </w:p>
+        </w:tc>
+        <w:tc>
+          <w:tcPr>
+            <w:tcW w:type="pct" w:w="3000%"/>
+          </w:tcPr>
+          <w:p>
+            <w:pPr>
+              <w:spacing w:after="60"/>
+            </w:pPr>
+            <w:r>
+              <w:t xml:space="preserve">Modal hover, delayed cadence, space between chords</w:t>
+            </w:r>
+          </w:p>
+        </w:tc>
+        <w:tc>
+          <w:tcPr>
+            <w:tcW w:type="pct" w:w="3000%"/>
+          </w:tcPr>
+          <w:p>
+            <w:pPr>
+              <w:spacing w:after="60"/>
+            </w:pPr>
+            <w:r>
+              <w:t xml:space="preserve">Verse (ballad), bridge (ECM)</w:t>
+            </w:r>
+          </w:p>
+        </w:tc>
+      </w:tr>
+      <w:tr>
+        <w:tc>
+          <w:tcPr>
+            <w:tcW w:type="pct" w:w="3000%"/>
+          </w:tcPr>
+          <w:p>
+            <w:pPr>
+              <w:spacing w:after="60"/>
+            </w:pPr>
+            <w:r>
+              <w:rPr>
+                <w:b/>
+                <w:bCs/>
+              </w:rPr>
+              <w:t xml:space="preserve">Eruptive</w:t>
+            </w:r>
+          </w:p>
+        </w:tc>
+        <w:tc>
+          <w:tcPr>
+            <w:tcW w:type="pct" w:w="3000%"/>
+          </w:tcPr>
+          <w:p>
+            <w:pPr>
+              <w:spacing w:after="60"/>
+            </w:pPr>
+            <w:r>
+              <w:t xml:space="preserve">Brass punch, dense comping, forward motion</w:t>
+            </w:r>
+          </w:p>
+        </w:tc>
+        <w:tc>
+          <w:tcPr>
+            <w:tcW w:type="pct" w:w="3000%"/>
+          </w:tcPr>
+          <w:p>
+            <w:pPr>
+              <w:spacing w:after="60"/>
+            </w:pPr>
+            <w:r>
+              <w:t xml:space="preserve">Chorus, shout</w:t>
+            </w:r>
+          </w:p>
+        </w:tc>
+      </w:tr>
+      <w:tr>
+        <w:tc>
+          <w:tcPr>
+            <w:tcW w:type="pct" w:w="3000%"/>
+          </w:tcPr>
+          <w:p>
+            <w:pPr>
+              <w:spacing w:after="60"/>
+            </w:pPr>
+            <w:r>
+              <w:rPr>
+                <w:b/>
+                <w:bCs/>
+              </w:rPr>
+              <w:t xml:space="preserve">Floating</w:t>
+            </w:r>
+          </w:p>
+        </w:tc>
+        <w:tc>
+          <w:tcPr>
+            <w:tcW w:type="pct" w:w="3000%"/>
+          </w:tcPr>
+          <w:p>
+            <w:pPr>
+              <w:spacing w:after="60"/>
+            </w:pPr>
+            <w:r>
+              <w:t xml:space="preserve">Upper-structure colour over unchanged anchors</w:t>
+            </w:r>
+          </w:p>
+        </w:tc>
+        <w:tc>
+          <w:tcPr>
+            <w:tcW w:type="pct" w:w="3000%"/>
+          </w:tcPr>
+          <w:p>
+            <w:pPr>
+              <w:spacing w:after="60"/>
+            </w:pPr>
+            <w:r>
+              <w:t xml:space="preserve">Bridge, Wayne-style interlude</w:t>
+            </w:r>
+          </w:p>
+        </w:tc>
+      </w:tr>
+      <w:tr>
+        <w:tc>
+          <w:tcPr>
+            <w:tcW w:type="pct" w:w="3000%"/>
+          </w:tcPr>
+          <w:p>
+            <w:pPr>
+              <w:spacing w:after="60"/>
+            </w:pPr>
+            <w:r>
+              <w:rPr>
+                <w:b/>
+                <w:bCs/>
+              </w:rPr>
+              <w:t xml:space="preserve">Singable</w:t>
+            </w:r>
+          </w:p>
+        </w:tc>
+        <w:tc>
+          <w:tcPr>
+            <w:tcW w:type="pct" w:w="3000%"/>
+          </w:tcPr>
+          <w:p>
+            <w:pPr>
+              <w:spacing w:after="60"/>
+            </w:pPr>
+            <w:r>
+              <w:t xml:space="preserve">Narrow-range motif you can hum; harmony stays underneath</w:t>
+            </w:r>
+          </w:p>
+        </w:tc>
+        <w:tc>
+          <w:tcPr>
+            <w:tcW w:type="pct" w:w="3000%"/>
+          </w:tcPr>
+          <w:p>
+            <w:pPr>
+              <w:spacing w:after="60"/>
+            </w:pPr>
+            <w:r>
+              <w:t xml:space="preserve">Melodic trace, vocal demo</w:t>
+            </w:r>
+          </w:p>
+        </w:tc>
+      </w:tr>
+    </w:tbl>
+    <w:p>
+      <w:pPr>
+        <w:spacing w:after="160"/>
+      </w:pPr>
+    </w:p>
+    <w:p>
+      <w:pPr>
+        <w:pStyle w:val="Heading3"/>
+        <w:spacing w:after="80" w:before="140"/>
+      </w:pPr>
+      <w:r>
+        <w:t xml:space="preserve">2. What carries continuity across sections?</w:t>
+      </w:r>
+    </w:p>
+    <w:p>
+      <w:pPr>
+        <w:spacing w:after="160"/>
+      </w:pPr>
+      <w:r>
+        <w:t xml:space="preserve">Not everything resets at a rehearsal mark. Decide what </w:t>
+      </w:r>
+      <w:r>
+        <w:rPr>
+          <w:b/>
+          <w:bCs/>
+        </w:rPr>
+        <w:t xml:space="preserve">must</w:t>
+      </w:r>
+      <w:r>
+        <w:t xml:space="preserve"> persist:</w:t>
+      </w:r>
+    </w:p>
+    <w:p>
+      <w:pPr>
+        <w:spacing w:after="80"/>
+        <w:ind w:left="360" w:hanging="260"/>
+      </w:pPr>
+      <w:r>
+        <w:t xml:space="preserve">• </w:t>
+      </w:r>
+      <w:r>
+        <w:rPr>
+          <w:b/>
+          <w:bCs/>
+        </w:rPr>
+        <w:t xml:space="preserve">Rhythm</w:t>
+      </w:r>
+      <w:r>
+        <w:t xml:space="preserve"> — pulse, swing feel, bossa subdivision, odd-meter map</w:t>
+      </w:r>
+    </w:p>
+    <w:p>
+      <w:pPr>
+        <w:spacing w:after="80"/>
+        <w:ind w:left="360" w:hanging="260"/>
+      </w:pPr>
+      <w:r>
+        <w:t xml:space="preserve">• </w:t>
+      </w:r>
+      <w:r>
+        <w:rPr>
+          <w:b/>
+          <w:bCs/>
+        </w:rPr>
+        <w:t xml:space="preserve">Interval family</w:t>
+      </w:r>
+      <w:r>
+        <w:t xml:space="preserve"> — quartal vs stepwise vs cluster vocabulary (Tritonic cell family)</w:t>
+      </w:r>
+    </w:p>
+    <w:p>
+      <w:pPr>
+        <w:spacing w:after="80"/>
+        <w:ind w:left="360" w:hanging="260"/>
+      </w:pPr>
+      <w:r>
+        <w:t xml:space="preserve">• </w:t>
+      </w:r>
+      <w:r>
+        <w:rPr>
+          <w:b/>
+          <w:bCs/>
+        </w:rPr>
+        <w:t xml:space="preserve">Motif contour</w:t>
+      </w:r>
+      <w:r>
+        <w:t xml:space="preserve"> — phrase memory and singer-safe line shape</w:t>
+      </w:r>
+    </w:p>
+    <w:p>
+      <w:pPr>
+        <w:spacing w:after="80"/>
+        <w:ind w:left="360" w:hanging="260"/>
+      </w:pPr>
+      <w:r>
+        <w:t xml:space="preserve">• </w:t>
+      </w:r>
+      <w:r>
+        <w:rPr>
+          <w:b/>
+          <w:bCs/>
+        </w:rPr>
+        <w:t xml:space="preserve">Harmony colour</w:t>
+      </w:r>
+      <w:r>
+        <w:t xml:space="preserve"> — same chord roots with different upper-structure treatment</w:t>
+      </w:r>
+    </w:p>
+    <w:p>
+      <w:pPr>
+        <w:spacing w:after="160"/>
+      </w:pPr>
+      <w:r>
+        <w:t xml:space="preserve">If you change engine at a boundary but keep </w:t>
+      </w:r>
+      <w:r>
+        <w:rPr>
+          <w:b/>
+          <w:bCs/>
+        </w:rPr>
+        <w:t xml:space="preserve">rhythm + harmony roots</w:t>
+      </w:r>
+      <w:r>
+        <w:t xml:space="preserve">, the form still reads as one song. If you change </w:t>
+      </w:r>
+      <w:r>
+        <w:rPr>
+          <w:b/>
+          <w:bCs/>
+        </w:rPr>
+        <w:t xml:space="preserve">interval family + motif contour</w:t>
+      </w:r>
+      <w:r>
+        <w:t xml:space="preserve"> without a transition, listeners hear a hard cut — sometimes intentional (Scenario Cookbook §1.1), sometimes jarring.</w:t>
+      </w:r>
+    </w:p>
+    <w:p>
+      <w:pPr>
+        <w:pStyle w:val="Heading3"/>
+        <w:spacing w:after="80" w:before="140"/>
+      </w:pPr>
+      <w:r>
+        <w:t xml:space="preserve">3. What is allowed to change at the section boundary?</w:t>
+      </w:r>
+    </w:p>
+    <w:p>
+      <w:pPr>
+        <w:spacing w:after="160"/>
+      </w:pPr>
+      <w:r>
+        <w:t xml:space="preserve">These may switch per section without breaking LOCK:</w:t>
+      </w:r>
+    </w:p>
+    <w:p>
+      <w:pPr>
+        <w:spacing w:after="80"/>
+        <w:ind w:left="360" w:hanging="260"/>
+      </w:pPr>
+      <w:r>
+        <w:t xml:space="preserve">• </w:t>
+      </w:r>
+      <w:r>
+        <w:rPr>
+          <w:b/>
+          <w:bCs/>
+        </w:rPr>
+        <w:t xml:space="preserve">Engine family</w:t>
+      </w:r>
+      <w:r>
+        <w:t xml:space="preserve"> — </w:t>
+      </w:r>
+      <w:r>
+        <w:rPr>
+          <w:rFonts w:ascii="Consolas" w:cs="Consolas" w:eastAsia="Consolas" w:hAnsi="Consolas"/>
+          <w:sz w:val="20"/>
+          <w:szCs w:val="20"/>
+        </w:rPr>
+        <w:t xml:space="preserve">song_mode</w:t>
+      </w:r>
+      <w:r>
+        <w:t xml:space="preserve"> · </w:t>
+      </w:r>
+      <w:r>
+        <w:rPr>
+          <w:rFonts w:ascii="Consolas" w:cs="Consolas" w:eastAsia="Consolas" w:hAnsi="Consolas"/>
+          <w:sz w:val="20"/>
+          <w:szCs w:val="20"/>
+        </w:rPr>
+        <w:t xml:space="preserve">ecm_chamber</w:t>
+      </w:r>
+      <w:r>
+        <w:t xml:space="preserve"> · </w:t>
+      </w:r>
+      <w:r>
+        <w:rPr>
+          <w:rFonts w:ascii="Consolas" w:cs="Consolas" w:eastAsia="Consolas" w:hAnsi="Consolas"/>
+          <w:sz w:val="20"/>
+          <w:szCs w:val="20"/>
+        </w:rPr>
+        <w:t xml:space="preserve">big_band</w:t>
+      </w:r>
+      <w:r>
+        <w:t xml:space="preserve"> · </w:t>
+      </w:r>
+      <w:r>
+        <w:rPr>
+          <w:rFonts w:ascii="Consolas" w:cs="Consolas" w:eastAsia="Consolas" w:hAnsi="Consolas"/>
+          <w:sz w:val="20"/>
+          <w:szCs w:val="20"/>
+        </w:rPr>
+        <w:t xml:space="preserve">tritonic_vault</w:t>
+      </w:r>
+      <w:r>
+        <w:t xml:space="preserve"> · </w:t>
+      </w:r>
+      <w:r>
+        <w:rPr>
+          <w:rFonts w:ascii="Consolas" w:cs="Consolas" w:eastAsia="Consolas" w:hAnsi="Consolas"/>
+          <w:sz w:val="20"/>
+          <w:szCs w:val="20"/>
+        </w:rPr>
+        <w:t xml:space="preserve">wayne_shorter</w:t>
+      </w:r>
+    </w:p>
+    <w:p>
+      <w:pPr>
+        <w:spacing w:after="80"/>
+        <w:ind w:left="360" w:hanging="260"/>
+      </w:pPr>
+      <w:r>
+        <w:t xml:space="preserve">• </w:t>
+      </w:r>
+      <w:r>
+        <w:rPr>
+          <w:b/>
+          <w:bCs/>
+        </w:rPr>
+        <w:t xml:space="preserve">Behaviour dial profile</w:t>
+      </w:r>
+      <w:r>
+        <w:t xml:space="preserve"> — nine Tritonic biases (0–1); e.g. high </w:t>
+      </w:r>
+      <w:r>
+        <w:rPr>
+          <w:rFonts w:ascii="Consolas" w:cs="Consolas" w:eastAsia="Consolas" w:hAnsi="Consolas"/>
+          <w:sz w:val="20"/>
+          <w:szCs w:val="20"/>
+        </w:rPr>
+        <w:t xml:space="preserve">cadenceAvoidance</w:t>
+      </w:r>
+      <w:r>
+        <w:t xml:space="preserve"> on bridge, low on chorus</w:t>
+      </w:r>
+    </w:p>
+    <w:p>
+      <w:pPr>
+        <w:spacing w:after="80"/>
+        <w:ind w:left="360" w:hanging="260"/>
+      </w:pPr>
+      <w:r>
+        <w:t xml:space="preserve">• </w:t>
+      </w:r>
+      <w:r>
+        <w:rPr>
+          <w:b/>
+          <w:bCs/>
+        </w:rPr>
+        <w:t xml:space="preserve">Strand priority</w:t>
+      </w:r>
+      <w:r>
+        <w:t xml:space="preserve"> — harmonic float (</w:t>
+      </w:r>
+      <w:r>
+        <w:rPr>
+          <w:rFonts w:ascii="Consolas" w:cs="Consolas" w:eastAsia="Consolas" w:hAnsi="Consolas"/>
+          <w:sz w:val="20"/>
+          <w:szCs w:val="20"/>
+        </w:rPr>
+        <w:t xml:space="preserve">voicingTop</w:t>
+      </w:r>
+      <w:r>
+        <w:t xml:space="preserve">) vs melodic trace (</w:t>
+      </w:r>
+      <w:r>
+        <w:rPr>
+          <w:rFonts w:ascii="Consolas" w:cs="Consolas" w:eastAsia="Consolas" w:hAnsi="Consolas"/>
+          <w:sz w:val="20"/>
+          <w:szCs w:val="20"/>
+        </w:rPr>
+        <w:t xml:space="preserve">singerSafeMotif</w:t>
+      </w:r>
+      <w:r>
+        <w:t xml:space="preserve">) vs voice-led line (</w:t>
+      </w:r>
+      <w:r>
+        <w:rPr>
+          <w:rFonts w:ascii="Consolas" w:cs="Consolas" w:eastAsia="Consolas" w:hAnsi="Consolas"/>
+          <w:sz w:val="20"/>
+          <w:szCs w:val="20"/>
+        </w:rPr>
+        <w:t xml:space="preserve">projectedStrand</w:t>
+      </w:r>
+      <w:r>
+        <w:t xml:space="preserve">)</w:t>
+      </w:r>
+    </w:p>
+    <w:p>
+      <w:pPr>
+        <w:spacing w:after="160"/>
+      </w:pPr>
+      <w:r>
+        <w:t xml:space="preserve">Harmony </w:t>
+      </w:r>
+      <w:r>
+        <w:rPr>
+          <w:b/>
+          <w:bCs/>
+        </w:rPr>
+        <w:t xml:space="preserve">checksum</w:t>
+      </w:r>
+      <w:r>
+        <w:t xml:space="preserve"> still locks after normalisation — section engines colour or realise bars; they do not silently rewrite pasted symbols.</w:t>
+      </w:r>
+    </w:p>
+    <w:p>
+      <w:pPr>
+        <w:pStyle w:val="Heading3"/>
+        <w:spacing w:after="80" w:before="140"/>
+      </w:pPr>
+      <w:r>
+        <w:t xml:space="preserve">Section type → recommended engine → feel</w:t>
+      </w:r>
+    </w:p>
+    <w:p>
+      <w:pPr>
+        <w:spacing w:after="160"/>
+      </w:pPr>
+      <w:r>
+        <w:t xml:space="preserve">Illustrative defaults when you do not set </w:t>
+      </w:r>
+      <w:r>
+        <w:rPr>
+          <w:rFonts w:ascii="Consolas" w:cs="Consolas" w:eastAsia="Consolas" w:hAnsi="Consolas"/>
+          <w:sz w:val="20"/>
+          <w:szCs w:val="20"/>
+        </w:rPr>
+        <w:t xml:space="preserve">sectionEngine</w:t>
+      </w:r>
+      <w:r>
+        <w:t xml:space="preserve"> explicitly. Override any row when the dramaturgy demands it.</w:t>
+      </w:r>
+    </w:p>
+    <w:tbl>
+      <w:tblPr>
+        <w:tblW w:type="pct" w:w="100%"/>
+        <w:tblBorders>
+          <w:top w:val="single" w:color="auto" w:sz="4"/>
+          <w:left w:val="single" w:color="auto" w:sz="4"/>
+          <w:bottom w:val="single" w:color="auto" w:sz="4"/>
+          <w:right w:val="single" w:color="auto" w:sz="4"/>
+          <w:insideH w:val="single" w:color="auto" w:sz="4"/>
+          <w:insideV w:val="single" w:color="auto" w:sz="4"/>
+        </w:tblBorders>
+      </w:tblPr>
+      <w:tblGrid>
+        <w:gridCol w:w="3000"/>
+        <w:gridCol w:w="3000"/>
+        <w:gridCol w:w="3000"/>
+      </w:tblGrid>
+      <w:tr>
+        <w:tc>
+          <w:tcPr>
+            <w:tcW w:type="pct" w:w="3000%"/>
+            <w:shd w:fill="E8EEF4"/>
+          </w:tcPr>
+          <w:p>
+            <w:pPr>
+              <w:spacing w:after="60"/>
+            </w:pPr>
+            <w:r>
+              <w:t xml:space="preserve">Section type</w:t>
+            </w:r>
+          </w:p>
+        </w:tc>
+        <w:tc>
+          <w:tcPr>
+            <w:tcW w:type="pct" w:w="3000%"/>
+            <w:shd w:fill="E8EEF4"/>
+          </w:tcPr>
+          <w:p>
+            <w:pPr>
+              <w:spacing w:after="60"/>
+            </w:pPr>
+            <w:r>
+              <w:t xml:space="preserve">Recommended engine</w:t>
+            </w:r>
+          </w:p>
+        </w:tc>
+        <w:tc>
+          <w:tcPr>
+            <w:tcW w:type="pct" w:w="3000%"/>
+            <w:shd w:fill="E8EEF4"/>
+          </w:tcPr>
+          <w:p>
+            <w:pPr>
+              <w:spacing w:after="60"/>
+            </w:pPr>
+            <w:r>
+              <w:t xml:space="preserve">Feel</w:t>
+            </w:r>
+          </w:p>
+        </w:tc>
+      </w:tr>
+      <w:tr>
+        <w:tc>
+          <w:tcPr>
+            <w:tcW w:type="pct" w:w="3000%"/>
+          </w:tcPr>
+          <w:p>
+            <w:pPr>
+              <w:spacing w:after="60"/>
+            </w:pPr>
+            <w:r>
+              <w:rPr>
+                <w:b/>
+                <w:bCs/>
+              </w:rPr>
+              <w:t xml:space="preserve">Intro / tag</w:t>
+            </w:r>
+          </w:p>
+        </w:tc>
+        <w:tc>
+          <w:tcPr>
+            <w:tcW w:type="pct" w:w="3000%"/>
+          </w:tcPr>
+          <w:p>
+            <w:pPr>
+              <w:spacing w:after="60"/>
+            </w:pPr>
+            <w:r>
+              <w:rPr>
+                <w:rFonts w:ascii="Consolas" w:cs="Consolas" w:eastAsia="Consolas" w:hAnsi="Consolas"/>
+                <w:sz w:val="20"/>
+                <w:szCs w:val="20"/>
+              </w:rPr>
+              <w:t xml:space="preserve">song_mode</w:t>
+            </w:r>
+          </w:p>
+        </w:tc>
+        <w:tc>
+          <w:tcPr>
+            <w:tcW w:type="pct" w:w="3000%"/>
+          </w:tcPr>
+          <w:p>
+            <w:pPr>
+              <w:spacing w:after="60"/>
+            </w:pPr>
+            <w:r>
+              <w:t xml:space="preserve">Stable — songwriter slice harmony, familiar entry</w:t>
+            </w:r>
+          </w:p>
+        </w:tc>
+      </w:tr>
+      <w:tr>
+        <w:tc>
+          <w:tcPr>
+            <w:tcW w:type="pct" w:w="3000%"/>
+          </w:tcPr>
+          <w:p>
+            <w:pPr>
+              <w:spacing w:after="60"/>
+            </w:pPr>
+            <w:r>
+              <w:rPr>
+                <w:b/>
+                <w:bCs/>
+              </w:rPr>
+              <w:t xml:space="preserve">Verse</w:t>
+            </w:r>
+          </w:p>
+        </w:tc>
+        <w:tc>
+          <w:tcPr>
+            <w:tcW w:type="pct" w:w="3000%"/>
+          </w:tcPr>
+          <w:p>
+            <w:pPr>
+              <w:spacing w:after="60"/>
+            </w:pPr>
+            <w:r>
+              <w:rPr>
+                <w:rFonts w:ascii="Consolas" w:cs="Consolas" w:eastAsia="Consolas" w:hAnsi="Consolas"/>
+                <w:sz w:val="20"/>
+                <w:szCs w:val="20"/>
+              </w:rPr>
+              <w:t xml:space="preserve">ecm_chamber</w:t>
+            </w:r>
+          </w:p>
+        </w:tc>
+        <w:tc>
+          <w:tcPr>
+            <w:tcW w:type="pct" w:w="3000%"/>
+          </w:tcPr>
+          <w:p>
+            <w:pPr>
+              <w:spacing w:after="60"/>
+            </w:pPr>
+            <w:r>
+              <w:t xml:space="preserve">Suspended — sparse or resonant ECM texture over verse changes</w:t>
+            </w:r>
+          </w:p>
+        </w:tc>
+      </w:tr>
+      <w:tr>
+        <w:tc>
+          <w:tcPr>
+            <w:tcW w:type="pct" w:w="3000%"/>
+          </w:tcPr>
+          <w:p>
+            <w:pPr>
+              <w:spacing w:after="60"/>
+            </w:pPr>
+            <w:r>
+              <w:rPr>
+                <w:b/>
+                <w:bCs/>
+              </w:rPr>
+              <w:t xml:space="preserve">Pre-chorus</w:t>
+            </w:r>
+          </w:p>
+        </w:tc>
+        <w:tc>
+          <w:tcPr>
+            <w:tcW w:type="pct" w:w="3000%"/>
+          </w:tcPr>
+          <w:p>
+            <w:pPr>
+              <w:spacing w:after="60"/>
+            </w:pPr>
+            <w:r>
+              <w:rPr>
+                <w:rFonts w:ascii="Consolas" w:cs="Consolas" w:eastAsia="Consolas" w:hAnsi="Consolas"/>
+                <w:sz w:val="20"/>
+                <w:szCs w:val="20"/>
+              </w:rPr>
+              <w:t xml:space="preserve">song_mode</w:t>
+            </w:r>
+            <w:r>
+              <w:t xml:space="preserve"> or </w:t>
+            </w:r>
+            <w:r>
+              <w:rPr>
+                <w:rFonts w:ascii="Consolas" w:cs="Consolas" w:eastAsia="Consolas" w:hAnsi="Consolas"/>
+                <w:sz w:val="20"/>
+                <w:szCs w:val="20"/>
+              </w:rPr>
+              <w:t xml:space="preserve">ecm_chamber</w:t>
+            </w:r>
+          </w:p>
+        </w:tc>
+        <w:tc>
+          <w:tcPr>
+            <w:tcW w:type="pct" w:w="3000%"/>
+          </w:tcPr>
+          <w:p>
+            <w:pPr>
+              <w:spacing w:after="60"/>
+            </w:pPr>
+            <w:r>
+              <w:t xml:space="preserve">Stable → suspended lift; keep roots, thin the texture</w:t>
+            </w:r>
+          </w:p>
+        </w:tc>
+      </w:tr>
+      <w:tr>
+        <w:tc>
+          <w:tcPr>
+            <w:tcW w:type="pct" w:w="3000%"/>
+          </w:tcPr>
+          <w:p>
+            <w:pPr>
+              <w:spacing w:after="60"/>
+            </w:pPr>
+            <w:r>
+              <w:rPr>
+                <w:b/>
+                <w:bCs/>
+              </w:rPr>
+              <w:t xml:space="preserve">Chorus</w:t>
+            </w:r>
+          </w:p>
+        </w:tc>
+        <w:tc>
+          <w:tcPr>
+            <w:tcW w:type="pct" w:w="3000%"/>
+          </w:tcPr>
+          <w:p>
+            <w:pPr>
+              <w:spacing w:after="60"/>
+            </w:pPr>
+            <w:r>
+              <w:rPr>
+                <w:rFonts w:ascii="Consolas" w:cs="Consolas" w:eastAsia="Consolas" w:hAnsi="Consolas"/>
+                <w:sz w:val="20"/>
+                <w:szCs w:val="20"/>
+              </w:rPr>
+              <w:t xml:space="preserve">big_band</w:t>
+            </w:r>
+          </w:p>
+        </w:tc>
+        <w:tc>
+          <w:tcPr>
+            <w:tcW w:type="pct" w:w="3000%"/>
+          </w:tcPr>
+          <w:p>
+            <w:pPr>
+              <w:spacing w:after="60"/>
+            </w:pPr>
+            <w:r>
+              <w:t xml:space="preserve">Eruptive — brass punch or Freddie Green shell, forward energy</w:t>
+            </w:r>
+          </w:p>
+        </w:tc>
+      </w:tr>
+      <w:tr>
+        <w:tc>
+          <w:tcPr>
+            <w:tcW w:type="pct" w:w="3000%"/>
+          </w:tcPr>
+          <w:p>
+            <w:pPr>
+              <w:spacing w:after="60"/>
+            </w:pPr>
+            <w:r>
+              <w:rPr>
+                <w:b/>
+                <w:bCs/>
+              </w:rPr>
+              <w:t xml:space="preserve">Bridge</w:t>
+            </w:r>
+          </w:p>
+        </w:tc>
+        <w:tc>
+          <w:tcPr>
+            <w:tcW w:type="pct" w:w="3000%"/>
+          </w:tcPr>
+          <w:p>
+            <w:pPr>
+              <w:spacing w:after="60"/>
+            </w:pPr>
+            <w:r>
+              <w:rPr>
+                <w:rFonts w:ascii="Consolas" w:cs="Consolas" w:eastAsia="Consolas" w:hAnsi="Consolas"/>
+                <w:sz w:val="20"/>
+                <w:szCs w:val="20"/>
+              </w:rPr>
+              <w:t xml:space="preserve">tritonic_vault</w:t>
+            </w:r>
+          </w:p>
+        </w:tc>
+        <w:tc>
+          <w:tcPr>
+            <w:tcW w:type="pct" w:w="3000%"/>
+          </w:tcPr>
+          <w:p>
+            <w:pPr>
+              <w:spacing w:after="60"/>
+            </w:pPr>
+            <w:r>
+              <w:t xml:space="preserve">Floating — Vault anchors + Tritonic cells above (ECM or SQ mode)</w:t>
+            </w:r>
+          </w:p>
+        </w:tc>
+      </w:tr>
+      <w:tr>
+        <w:tc>
+          <w:tcPr>
+            <w:tcW w:type="pct" w:w="3000%"/>
+          </w:tcPr>
+          <w:p>
+            <w:pPr>
+              <w:spacing w:after="60"/>
+            </w:pPr>
+            <w:r>
+              <w:rPr>
+                <w:b/>
+                <w:bCs/>
+              </w:rPr>
+              <w:t xml:space="preserve">Wayne interlude</w:t>
+            </w:r>
+          </w:p>
+        </w:tc>
+        <w:tc>
+          <w:tcPr>
+            <w:tcW w:type="pct" w:w="3000%"/>
+          </w:tcPr>
+          <w:p>
+            <w:pPr>
+              <w:spacing w:after="60"/>
+            </w:pPr>
+            <w:r>
+              <w:rPr>
+                <w:rFonts w:ascii="Consolas" w:cs="Consolas" w:eastAsia="Consolas" w:hAnsi="Consolas"/>
+                <w:sz w:val="20"/>
+                <w:szCs w:val="20"/>
+              </w:rPr>
+              <w:t xml:space="preserve">wayne_shorter</w:t>
+            </w:r>
+          </w:p>
+        </w:tc>
+        <w:tc>
+          <w:tcPr>
+            <w:tcW w:type="pct" w:w="3000%"/>
+          </w:tcPr>
+          <w:p>
+            <w:pPr>
+              <w:spacing w:after="60"/>
+            </w:pPr>
+            <w:r>
+              <w:t xml:space="preserve">Floating — Python bridge compile; modal colour, delayed resolution</w:t>
+            </w:r>
+          </w:p>
+        </w:tc>
+      </w:tr>
+      <w:tr>
+        <w:tc>
+          <w:tcPr>
+            <w:tcW w:type="pct" w:w="3000%"/>
+          </w:tcPr>
+          <w:p>
+            <w:pPr>
+              <w:spacing w:after="60"/>
+            </w:pPr>
+            <w:r>
+              <w:rPr>
+                <w:b/>
+                <w:bCs/>
+              </w:rPr>
+              <w:t xml:space="preserve">Outro / coda</w:t>
+            </w:r>
+          </w:p>
+        </w:tc>
+        <w:tc>
+          <w:tcPr>
+            <w:tcW w:type="pct" w:w="3000%"/>
+          </w:tcPr>
+          <w:p>
+            <w:pPr>
+              <w:spacing w:after="60"/>
+            </w:pPr>
+            <w:r>
+              <w:rPr>
+                <w:rFonts w:ascii="Consolas" w:cs="Consolas" w:eastAsia="Consolas" w:hAnsi="Consolas"/>
+                <w:sz w:val="20"/>
+                <w:szCs w:val="20"/>
+              </w:rPr>
+              <w:t xml:space="preserve">ecm_chamber</w:t>
+            </w:r>
+            <w:r>
+              <w:t xml:space="preserve"> or </w:t>
+            </w:r>
+            <w:r>
+              <w:rPr>
+                <w:rFonts w:ascii="Consolas" w:cs="Consolas" w:eastAsia="Consolas" w:hAnsi="Consolas"/>
+                <w:sz w:val="20"/>
+                <w:szCs w:val="20"/>
+              </w:rPr>
+              <w:t xml:space="preserve">song_mode</w:t>
+            </w:r>
+          </w:p>
+        </w:tc>
+        <w:tc>
+          <w:tcPr>
+            <w:tcW w:type="pct" w:w="3000%"/>
+          </w:tcPr>
+          <w:p>
+            <w:pPr>
+              <w:spacing w:after="60"/>
+            </w:pPr>
+            <w:r>
+              <w:t xml:space="preserve">Suspended or stable — release tension, do not re-shout</w:t>
+            </w:r>
+          </w:p>
+        </w:tc>
+      </w:tr>
+    </w:tbl>
+    <w:p>
+      <w:pPr>
+        <w:spacing w:after="160"/>
+      </w:pPr>
+    </w:p>
+    <w:p>
+      <w:pPr>
+        <w:spacing w:after="160"/>
+      </w:pPr>
+      <w:r>
+        <w:rPr>
+          <w:b/>
+          <w:bCs/>
+        </w:rPr>
+        <w:t xml:space="preserve">Practical pairing:</w:t>
+      </w:r>
+      <w:r>
+        <w:t xml:space="preserve"> verse ECM + chorus Big Band + bridge Tritonic vault is the shipped illustration (feel: intimate → anthem → float). For a vocal demo, set bridge to Tritonic </w:t>
+      </w:r>
+      <w:r>
+        <w:rPr>
+          <w:b/>
+          <w:bCs/>
+        </w:rPr>
+        <w:t xml:space="preserve">Melodic Trace</w:t>
+      </w:r>
+      <w:r>
+        <w:t xml:space="preserve"> and raise </w:t>
+      </w:r>
+      <w:r>
+        <w:rPr>
+          <w:rFonts w:ascii="Consolas" w:cs="Consolas" w:eastAsia="Consolas" w:hAnsi="Consolas"/>
+          <w:sz w:val="20"/>
+          <w:szCs w:val="20"/>
+        </w:rPr>
+        <w:t xml:space="preserve">motifSingability</w:t>
+      </w:r>
+      <w:r>
+        <w:t xml:space="preserve"> on the dials.</w:t>
       </w:r>
     </w:p>
     <w:p>

</xml_diff>

<commit_message>
docs(handbook): Tritonic UI ensemble guide (same screen, different ensembles)
Co-authored-by: Cursor <cursoragent@cursor.com>
</commit_message>
<xml_diff>
--- a/docs/COMPOSER_HANDBOOK.docx
+++ b/docs/COMPOSER_HANDBOOK.docx
@@ -9600,6 +9600,1574 @@
       <w:r>
         <w:t xml:space="preserve"> on the dials.</w:t>
       </w:r>
+    </w:p>
+    <w:p>
+      <w:pPr>
+        <w:pStyle w:val="Heading2"/>
+        <w:spacing w:after="100" w:before="180"/>
+      </w:pPr>
+      <w:r>
+        <w:t xml:space="preserve">String Quartet — Generate panel</w:t>
+      </w:r>
+    </w:p>
+    <w:p>
+      <w:pPr>
+        <w:spacing w:after="160"/>
+      </w:pPr>
+      <w:r>
+        <w:t xml:space="preserve">When you choose the </w:t>
+      </w:r>
+      <w:r>
+        <w:rPr>
+          <w:b/>
+          <w:bCs/>
+        </w:rPr>
+        <w:t xml:space="preserve">String Quartet</w:t>
+      </w:r>
+      <w:r>
+        <w:t xml:space="preserve"> preset, the primary panel shapes </w:t>
+      </w:r>
+      <w:r>
+        <w:rPr>
+          <w:b/>
+          <w:bCs/>
+        </w:rPr>
+        <w:t xml:space="preserve">how the four voices behave</w:t>
+      </w:r>
+      <w:r>
+        <w:t xml:space="preserve"> before you hit Generate. Pick a </w:t>
+      </w:r>
+      <w:r>
+        <w:rPr>
+          <w:b/>
+          <w:bCs/>
+        </w:rPr>
+        <w:t xml:space="preserve">texture</w:t>
+      </w:r>
+      <w:r>
+        <w:t xml:space="preserve"> first — that is the musical goal. Key, tempo, and Tritonic colour refine the same plan; they do not replace it.</w:t>
+      </w:r>
+    </w:p>
+    <w:p>
+      <w:pPr>
+        <w:spacing w:after="160"/>
+      </w:pPr>
+      <w:r>
+        <w:rPr>
+          <w:b/>
+          <w:bCs/>
+        </w:rPr>
+        <w:t xml:space="preserve">Defaults:</w:t>
+      </w:r>
+      <w:r>
+        <w:t xml:space="preserve"> texture </w:t>
+      </w:r>
+      <w:r>
+        <w:rPr>
+          <w:b/>
+          <w:bCs/>
+        </w:rPr>
+        <w:t xml:space="preserve">Arco melody + accompaniment</w:t>
+      </w:r>
+      <w:r>
+        <w:t xml:space="preserve"> · Tritonic colour </w:t>
+      </w:r>
+      <w:r>
+        <w:rPr>
+          <w:b/>
+          <w:bCs/>
+        </w:rPr>
+        <w:t xml:space="preserve">Subtle</w:t>
+      </w:r>
+      <w:r>
+        <w:t xml:space="preserve"> · key and tempo follow your project settings (empty key → </w:t>
+      </w:r>
+      <w:r>
+        <w:rPr>
+          <w:b/>
+          <w:bCs/>
+        </w:rPr>
+        <w:t xml:space="preserve">C</w:t>
+      </w:r>
+      <w:r>
+        <w:t xml:space="preserve">).</w:t>
+      </w:r>
+    </w:p>
+    <w:p>
+      <w:pPr>
+        <w:pStyle w:val="Heading3"/>
+        <w:spacing w:after="80" w:before="140"/>
+      </w:pPr>
+      <w:r>
+        <w:t xml:space="preserve">Texture cards (pick one)</w:t>
+      </w:r>
+    </w:p>
+    <w:p>
+      <w:pPr>
+        <w:spacing w:after="160"/>
+      </w:pPr>
+      <w:r>
+        <w:t xml:space="preserve">Each card is a whole ensemble posture for the run. One line under the row updates when you change selection.</w:t>
+      </w:r>
+    </w:p>
+    <w:tbl>
+      <w:tblPr>
+        <w:tblW w:type="pct" w:w="100%"/>
+        <w:tblBorders>
+          <w:top w:val="single" w:color="auto" w:sz="4"/>
+          <w:left w:val="single" w:color="auto" w:sz="4"/>
+          <w:bottom w:val="single" w:color="auto" w:sz="4"/>
+          <w:right w:val="single" w:color="auto" w:sz="4"/>
+          <w:insideH w:val="single" w:color="auto" w:sz="4"/>
+          <w:insideV w:val="single" w:color="auto" w:sz="4"/>
+        </w:tblBorders>
+      </w:tblPr>
+      <w:tblGrid>
+        <w:gridCol w:w="4500"/>
+        <w:gridCol w:w="4500"/>
+      </w:tblGrid>
+      <w:tr>
+        <w:tc>
+          <w:tcPr>
+            <w:tcW w:type="pct" w:w="4500%"/>
+            <w:shd w:fill="E8EEF4"/>
+          </w:tcPr>
+          <w:p>
+            <w:pPr>
+              <w:spacing w:after="60"/>
+            </w:pPr>
+            <w:r>
+              <w:t xml:space="preserve">Card</w:t>
+            </w:r>
+          </w:p>
+        </w:tc>
+        <w:tc>
+          <w:tcPr>
+            <w:tcW w:type="pct" w:w="4500%"/>
+            <w:shd w:fill="E8EEF4"/>
+          </w:tcPr>
+          <w:p>
+            <w:pPr>
+              <w:spacing w:after="60"/>
+            </w:pPr>
+            <w:r>
+              <w:t xml:space="preserve">What you hear</w:t>
+            </w:r>
+          </w:p>
+        </w:tc>
+      </w:tr>
+      <w:tr>
+        <w:tc>
+          <w:tcPr>
+            <w:tcW w:type="pct" w:w="4500%"/>
+          </w:tcPr>
+          <w:p>
+            <w:pPr>
+              <w:spacing w:after="60"/>
+            </w:pPr>
+            <w:r>
+              <w:rPr>
+                <w:b/>
+                <w:bCs/>
+              </w:rPr>
+              <w:t xml:space="preserve">Chorale</w:t>
+            </w:r>
+          </w:p>
+        </w:tc>
+        <w:tc>
+          <w:tcPr>
+            <w:tcW w:type="pct" w:w="4500%"/>
+          </w:tcPr>
+          <w:p>
+            <w:pPr>
+              <w:spacing w:after="60"/>
+            </w:pPr>
+            <w:r>
+              <w:t xml:space="preserve">Four voices breathe as one sustained blend — hymn-like vertical warmth.</w:t>
+            </w:r>
+          </w:p>
+        </w:tc>
+      </w:tr>
+      <w:tr>
+        <w:tc>
+          <w:tcPr>
+            <w:tcW w:type="pct" w:w="4500%"/>
+          </w:tcPr>
+          <w:p>
+            <w:pPr>
+              <w:spacing w:after="60"/>
+            </w:pPr>
+            <w:r>
+              <w:rPr>
+                <w:b/>
+                <w:bCs/>
+              </w:rPr>
+              <w:t xml:space="preserve">Arco melody + accompaniment</w:t>
+            </w:r>
+          </w:p>
+        </w:tc>
+        <w:tc>
+          <w:tcPr>
+            <w:tcW w:type="pct" w:w="4500%"/>
+          </w:tcPr>
+          <w:p>
+            <w:pPr>
+              <w:spacing w:after="60"/>
+            </w:pPr>
+            <w:r>
+              <w:t xml:space="preserve">A singing top line over supportive inner parts (default).</w:t>
+            </w:r>
+          </w:p>
+        </w:tc>
+      </w:tr>
+      <w:tr>
+        <w:tc>
+          <w:tcPr>
+            <w:tcW w:type="pct" w:w="4500%"/>
+          </w:tcPr>
+          <w:p>
+            <w:pPr>
+              <w:spacing w:after="60"/>
+            </w:pPr>
+            <w:r>
+              <w:rPr>
+                <w:b/>
+                <w:bCs/>
+              </w:rPr>
+              <w:t xml:space="preserve">Pad suspension</w:t>
+            </w:r>
+          </w:p>
+        </w:tc>
+        <w:tc>
+          <w:tcPr>
+            <w:tcW w:type="pct" w:w="4500%"/>
+          </w:tcPr>
+          <w:p>
+            <w:pPr>
+              <w:spacing w:after="60"/>
+            </w:pPr>
+            <w:r>
+              <w:t xml:space="preserve">Long tones and suspended colour; air between chord changes.</w:t>
+            </w:r>
+          </w:p>
+        </w:tc>
+      </w:tr>
+      <w:tr>
+        <w:tc>
+          <w:tcPr>
+            <w:tcW w:type="pct" w:w="4500%"/>
+          </w:tcPr>
+          <w:p>
+            <w:pPr>
+              <w:spacing w:after="60"/>
+            </w:pPr>
+            <w:r>
+              <w:rPr>
+                <w:b/>
+                <w:bCs/>
+              </w:rPr>
+              <w:t xml:space="preserve">Pizzicato pulse</w:t>
+            </w:r>
+          </w:p>
+        </w:tc>
+        <w:tc>
+          <w:tcPr>
+            <w:tcW w:type="pct" w:w="4500%"/>
+          </w:tcPr>
+          <w:p>
+            <w:pPr>
+              <w:spacing w:after="60"/>
+            </w:pPr>
+            <w:r>
+              <w:t xml:space="preserve">Short, articulated rhythm in the lower three; lift in the top if needed.</w:t>
+            </w:r>
+          </w:p>
+        </w:tc>
+      </w:tr>
+      <w:tr>
+        <w:tc>
+          <w:tcPr>
+            <w:tcW w:type="pct" w:w="4500%"/>
+          </w:tcPr>
+          <w:p>
+            <w:pPr>
+              <w:spacing w:after="60"/>
+            </w:pPr>
+            <w:r>
+              <w:rPr>
+                <w:b/>
+                <w:bCs/>
+              </w:rPr>
+              <w:t xml:space="preserve">Tremolo wash</w:t>
+            </w:r>
+          </w:p>
+        </w:tc>
+        <w:tc>
+          <w:tcPr>
+            <w:tcW w:type="pct" w:w="4500%"/>
+          </w:tcPr>
+          <w:p>
+            <w:pPr>
+              <w:spacing w:after="60"/>
+            </w:pPr>
+            <w:r>
+              <w:t xml:space="preserve">Shimmer and energy matter more than spelling every chord change.</w:t>
+            </w:r>
+          </w:p>
+        </w:tc>
+      </w:tr>
+      <w:tr>
+        <w:tc>
+          <w:tcPr>
+            <w:tcW w:type="pct" w:w="4500%"/>
+          </w:tcPr>
+          <w:p>
+            <w:pPr>
+              <w:spacing w:after="60"/>
+            </w:pPr>
+            <w:r>
+              <w:rPr>
+                <w:b/>
+                <w:bCs/>
+              </w:rPr>
+              <w:t xml:space="preserve">Contrapuntal weave</w:t>
+            </w:r>
+          </w:p>
+        </w:tc>
+        <w:tc>
+          <w:tcPr>
+            <w:tcW w:type="pct" w:w="4500%"/>
+          </w:tcPr>
+          <w:p>
+            <w:pPr>
+              <w:spacing w:after="60"/>
+            </w:pPr>
+            <w:r>
+              <w:t xml:space="preserve">Independent lines that imply harmony through motion.</w:t>
+            </w:r>
+          </w:p>
+        </w:tc>
+      </w:tr>
+      <w:tr>
+        <w:tc>
+          <w:tcPr>
+            <w:tcW w:type="pct" w:w="4500%"/>
+          </w:tcPr>
+          <w:p>
+            <w:pPr>
+              <w:spacing w:after="60"/>
+            </w:pPr>
+            <w:r>
+              <w:rPr>
+                <w:b/>
+                <w:bCs/>
+              </w:rPr>
+              <w:t xml:space="preserve">Duet support</w:t>
+            </w:r>
+          </w:p>
+        </w:tc>
+        <w:tc>
+          <w:tcPr>
+            <w:tcW w:type="pct" w:w="4500%"/>
+          </w:tcPr>
+          <w:p>
+            <w:pPr>
+              <w:spacing w:after="60"/>
+            </w:pPr>
+            <w:r>
+              <w:t xml:space="preserve">Two voices in front; viola and cello anchor register and pulse.</w:t>
+            </w:r>
+          </w:p>
+        </w:tc>
+      </w:tr>
+    </w:tbl>
+    <w:p>
+      <w:pPr>
+        <w:spacing w:after="160"/>
+      </w:pPr>
+    </w:p>
+    <w:p>
+      <w:pPr>
+        <w:pStyle w:val="Heading3"/>
+        <w:spacing w:after="80" w:before="140"/>
+      </w:pPr>
+      <w:r>
+        <w:t xml:space="preserve">Tritonic colour</w:t>
+      </w:r>
+    </w:p>
+    <w:p>
+      <w:pPr>
+        <w:spacing w:after="160"/>
+      </w:pPr>
+      <w:r>
+        <w:t xml:space="preserve">Three settings — how much </w:t>
+      </w:r>
+      <w:r>
+        <w:rPr>
+          <w:b/>
+          <w:bCs/>
+        </w:rPr>
+        <w:t xml:space="preserve">floating upper colour</w:t>
+      </w:r>
+      <w:r>
+        <w:t xml:space="preserve"> sits above the locked harmony:</w:t>
+      </w:r>
+    </w:p>
+    <w:p>
+      <w:pPr>
+        <w:spacing w:after="80"/>
+        <w:ind w:left="360" w:hanging="260"/>
+      </w:pPr>
+      <w:r>
+        <w:t xml:space="preserve">• </w:t>
+      </w:r>
+      <w:r>
+        <w:rPr>
+          <w:b/>
+          <w:bCs/>
+        </w:rPr>
+        <w:t xml:space="preserve">None</w:t>
+      </w:r>
+      <w:r>
+        <w:t xml:space="preserve"> — grounded quartet only; no Tritonic float (even on suspended or contrapuntal textures).</w:t>
+      </w:r>
+    </w:p>
+    <w:p>
+      <w:pPr>
+        <w:spacing w:after="80"/>
+        <w:ind w:left="360" w:hanging="260"/>
+      </w:pPr>
+      <w:r>
+        <w:t xml:space="preserve">• </w:t>
+      </w:r>
+      <w:r>
+        <w:rPr>
+          <w:b/>
+          <w:bCs/>
+        </w:rPr>
+        <w:t xml:space="preserve">Subtle</w:t>
+      </w:r>
+      <w:r>
+        <w:t xml:space="preserve"> — light harmonic colour on the top line and one inner voice (default).</w:t>
+      </w:r>
+    </w:p>
+    <w:p>
+      <w:pPr>
+        <w:spacing w:after="80"/>
+        <w:ind w:left="360" w:hanging="260"/>
+      </w:pPr>
+      <w:r>
+        <w:t xml:space="preserve">• </w:t>
+      </w:r>
+      <w:r>
+        <w:rPr>
+          <w:b/>
+          <w:bCs/>
+        </w:rPr>
+        <w:t xml:space="preserve">Active</w:t>
+      </w:r>
+      <w:r>
+        <w:t xml:space="preserve"> — stronger float; use when you want Wayne-style upper-structure motion without rewriting the chart.</w:t>
+      </w:r>
+    </w:p>
+    <w:p>
+      <w:pPr>
+        <w:spacing w:after="160"/>
+      </w:pPr>
+      <w:r>
+        <w:t xml:space="preserve">With </w:t>
+      </w:r>
+      <w:r>
+        <w:rPr>
+          <w:b/>
+          <w:bCs/>
+        </w:rPr>
+        <w:t xml:space="preserve">Subtle</w:t>
+      </w:r>
+      <w:r>
+        <w:t xml:space="preserve"> or </w:t>
+      </w:r>
+      <w:r>
+        <w:rPr>
+          <w:b/>
+          <w:bCs/>
+        </w:rPr>
+        <w:t xml:space="preserve">Active</w:t>
+      </w:r>
+      <w:r>
+        <w:t xml:space="preserve">, open </w:t>
+      </w:r>
+      <w:r>
+        <w:rPr>
+          <w:b/>
+          <w:bCs/>
+        </w:rPr>
+        <w:t xml:space="preserve">Edit behaviour ▼</w:t>
+      </w:r>
+      <w:r>
+        <w:t xml:space="preserve"> to nudge nine musical dials (tension, spacing, cadence delay, and similar). These steer feel; they do not replace the texture card.</w:t>
+      </w:r>
+    </w:p>
+    <w:p>
+      <w:pPr>
+        <w:pStyle w:val="Heading3"/>
+        <w:spacing w:after="80" w:before="140"/>
+      </w:pPr>
+      <w:r>
+        <w:t xml:space="preserve">Seed and Variation</w:t>
+      </w:r>
+    </w:p>
+    <w:p>
+      <w:pPr>
+        <w:spacing w:after="160"/>
+      </w:pPr>
+      <w:r>
+        <w:t xml:space="preserve">The seed stays fixed until you press </w:t>
+      </w:r>
+      <w:r>
+        <w:rPr>
+          <w:b/>
+          <w:bCs/>
+        </w:rPr>
+        <w:t xml:space="preserve">Variation</w:t>
+      </w:r>
+      <w:r>
+        <w:t xml:space="preserve"> — same seed, same plan. Use Variation when you want a fresh layout without changing texture or colour.</w:t>
+      </w:r>
+    </w:p>
+    <w:p>
+      <w:pPr>
+        <w:pStyle w:val="Heading3"/>
+        <w:spacing w:after="80" w:before="140"/>
+      </w:pPr>
+      <w:r>
+        <w:t xml:space="preserve">After Generate — status chips</w:t>
+      </w:r>
+    </w:p>
+    <w:p>
+      <w:pPr>
+        <w:spacing w:after="160"/>
+      </w:pPr>
+      <w:r>
+        <w:t xml:space="preserve">When export succeeds, three chips summarise the realisation:</w:t>
+      </w:r>
+    </w:p>
+    <w:tbl>
+      <w:tblPr>
+        <w:tblW w:type="pct" w:w="100%"/>
+        <w:tblBorders>
+          <w:top w:val="single" w:color="auto" w:sz="4"/>
+          <w:left w:val="single" w:color="auto" w:sz="4"/>
+          <w:bottom w:val="single" w:color="auto" w:sz="4"/>
+          <w:right w:val="single" w:color="auto" w:sz="4"/>
+          <w:insideH w:val="single" w:color="auto" w:sz="4"/>
+          <w:insideV w:val="single" w:color="auto" w:sz="4"/>
+        </w:tblBorders>
+      </w:tblPr>
+      <w:tblGrid>
+        <w:gridCol w:w="3000"/>
+        <w:gridCol w:w="3000"/>
+        <w:gridCol w:w="3000"/>
+      </w:tblGrid>
+      <w:tr>
+        <w:tc>
+          <w:tcPr>
+            <w:tcW w:type="pct" w:w="3000%"/>
+            <w:shd w:fill="E8EEF4"/>
+          </w:tcPr>
+          <w:p>
+            <w:pPr>
+              <w:spacing w:after="60"/>
+            </w:pPr>
+            <w:r>
+              <w:t xml:space="preserve">Chip</w:t>
+            </w:r>
+          </w:p>
+        </w:tc>
+        <w:tc>
+          <w:tcPr>
+            <w:tcW w:type="pct" w:w="3000%"/>
+            <w:shd w:fill="E8EEF4"/>
+          </w:tcPr>
+          <w:p>
+            <w:pPr>
+              <w:spacing w:after="60"/>
+            </w:pPr>
+            <w:r>
+              <w:t xml:space="preserve">Good sign</w:t>
+            </w:r>
+          </w:p>
+        </w:tc>
+        <w:tc>
+          <w:tcPr>
+            <w:tcW w:type="pct" w:w="3000%"/>
+            <w:shd w:fill="E8EEF4"/>
+          </w:tcPr>
+          <w:p>
+            <w:pPr>
+              <w:spacing w:after="60"/>
+            </w:pPr>
+            <w:r>
+              <w:t xml:space="preserve">Watch for</w:t>
+            </w:r>
+          </w:p>
+        </w:tc>
+      </w:tr>
+      <w:tr>
+        <w:tc>
+          <w:tcPr>
+            <w:tcW w:type="pct" w:w="3000%"/>
+          </w:tcPr>
+          <w:p>
+            <w:pPr>
+              <w:spacing w:after="60"/>
+            </w:pPr>
+            <w:r>
+              <w:rPr>
+                <w:b/>
+                <w:bCs/>
+              </w:rPr>
+              <w:t xml:space="preserve">Smooth lines</w:t>
+            </w:r>
+          </w:p>
+        </w:tc>
+        <w:tc>
+          <w:tcPr>
+            <w:tcW w:type="pct" w:w="3000%"/>
+          </w:tcPr>
+          <w:p>
+            <w:pPr>
+              <w:spacing w:after="60"/>
+            </w:pPr>
+            <w:r>
+              <w:t xml:space="preserve">Stepwise, singable motion in the parts</w:t>
+            </w:r>
+          </w:p>
+        </w:tc>
+        <w:tc>
+          <w:tcPr>
+            <w:tcW w:type="pct" w:w="3000%"/>
+          </w:tcPr>
+          <w:p>
+            <w:pPr>
+              <w:spacing w:after="60"/>
+            </w:pPr>
+            <w:r>
+              <w:rPr>
+                <w:b/>
+                <w:bCs/>
+              </w:rPr>
+              <w:t xml:space="preserve">Rough</w:t>
+            </w:r>
+            <w:r>
+              <w:t xml:space="preserve"> — many leaps; try a calmer texture or lower tension</w:t>
+            </w:r>
+          </w:p>
+        </w:tc>
+      </w:tr>
+      <w:tr>
+        <w:tc>
+          <w:tcPr>
+            <w:tcW w:type="pct" w:w="3000%"/>
+          </w:tcPr>
+          <w:p>
+            <w:pPr>
+              <w:spacing w:after="60"/>
+            </w:pPr>
+            <w:r>
+              <w:rPr>
+                <w:b/>
+                <w:bCs/>
+              </w:rPr>
+              <w:t xml:space="preserve">Spacing</w:t>
+            </w:r>
+          </w:p>
+        </w:tc>
+        <w:tc>
+          <w:tcPr>
+            <w:tcW w:type="pct" w:w="3000%"/>
+          </w:tcPr>
+          <w:p>
+            <w:pPr>
+              <w:spacing w:after="60"/>
+            </w:pPr>
+            <w:r>
+              <w:t xml:space="preserve">Registers stay open; bass not crowded</w:t>
+            </w:r>
+          </w:p>
+        </w:tc>
+        <w:tc>
+          <w:tcPr>
+            <w:tcW w:type="pct" w:w="3000%"/>
+          </w:tcPr>
+          <w:p>
+            <w:pPr>
+              <w:spacing w:after="60"/>
+            </w:pPr>
+            <w:r>
+              <w:rPr>
+                <w:b/>
+                <w:bCs/>
+              </w:rPr>
+              <w:t xml:space="preserve">Crowded</w:t>
+            </w:r>
+            <w:r>
+              <w:t xml:space="preserve"> — inner voices too tight in the low register</w:t>
+            </w:r>
+          </w:p>
+        </w:tc>
+      </w:tr>
+      <w:tr>
+        <w:tc>
+          <w:tcPr>
+            <w:tcW w:type="pct" w:w="3000%"/>
+          </w:tcPr>
+          <w:p>
+            <w:pPr>
+              <w:spacing w:after="60"/>
+            </w:pPr>
+            <w:r>
+              <w:rPr>
+                <w:b/>
+                <w:bCs/>
+              </w:rPr>
+              <w:t xml:space="preserve">Crossings &amp; parallels</w:t>
+            </w:r>
+          </w:p>
+        </w:tc>
+        <w:tc>
+          <w:tcPr>
+            <w:tcW w:type="pct" w:w="3000%"/>
+          </w:tcPr>
+          <w:p>
+            <w:pPr>
+              <w:spacing w:after="60"/>
+            </w:pPr>
+            <w:r>
+              <w:t xml:space="preserve">Clean voice order and outer-voice motion</w:t>
+            </w:r>
+          </w:p>
+        </w:tc>
+        <w:tc>
+          <w:tcPr>
+            <w:tcW w:type="pct" w:w="3000%"/>
+          </w:tcPr>
+          <w:p>
+            <w:pPr>
+              <w:spacing w:after="60"/>
+            </w:pPr>
+            <w:r>
+              <w:rPr>
+                <w:b/>
+                <w:bCs/>
+              </w:rPr>
+              <w:t xml:space="preserve">Needs attention</w:t>
+            </w:r>
+            <w:r>
+              <w:t xml:space="preserve"> — crossings or exposed parallel fifths/octaves</w:t>
+            </w:r>
+          </w:p>
+        </w:tc>
+      </w:tr>
+    </w:tbl>
+    <w:p>
+      <w:pPr>
+        <w:spacing w:after="160"/>
+      </w:pPr>
+    </w:p>
+    <w:p>
+      <w:pPr>
+        <w:pStyle w:val="Heading3"/>
+        <w:spacing w:after="80" w:before="140"/>
+      </w:pPr>
+      <w:r>
+        <w:t xml:space="preserve">Advanced panel</w:t>
+      </w:r>
+    </w:p>
+    <w:p>
+      <w:pPr>
+        <w:spacing w:after="160"/>
+      </w:pPr>
+      <w:r>
+        <w:t xml:space="preserve">Collapsed by default. After a run it lists the full diagnostic readout (crossings, crowding, leap averages, harmonic completeness, texture stability). If Tritonic colour is on, the same panel repeats the </w:t>
+      </w:r>
+      <w:r>
+        <w:rPr>
+          <w:b/>
+          <w:bCs/>
+        </w:rPr>
+        <w:t xml:space="preserve">behaviour sliders</w:t>
+      </w:r>
+      <w:r>
+        <w:t xml:space="preserve"> for fine tuning between takes.</w:t>
+      </w:r>
+    </w:p>
+    <w:p>
+      <w:pPr>
+        <w:pStyle w:val="Heading2"/>
+        <w:spacing w:after="100" w:before="180"/>
+      </w:pPr>
+      <w:r>
+        <w:t xml:space="preserve">Tritonic UI — Generate monitor</w:t>
+      </w:r>
+    </w:p>
+    <w:p>
+      <w:pPr>
+        <w:spacing w:after="160"/>
+      </w:pPr>
+      <w:r>
+        <w:t xml:space="preserve">After Generate, a </w:t>
+      </w:r>
+      <w:r>
+        <w:rPr>
+          <w:b/>
+          <w:bCs/>
+        </w:rPr>
+        <w:t xml:space="preserve">Tritonic monitor</w:t>
+      </w:r>
+      <w:r>
+        <w:t xml:space="preserve"> stacks on the right when the run used Tritonic float (</w:t>
+      </w:r>
+      <w:r>
+        <w:rPr>
+          <w:rFonts w:ascii="Consolas" w:cs="Consolas" w:eastAsia="Consolas" w:hAnsi="Consolas"/>
+          <w:sz w:val="20"/>
+          <w:szCs w:val="20"/>
+        </w:rPr>
+        <w:t xml:space="preserve">tritonic</w:t>
+      </w:r>
+      <w:r>
+        <w:t xml:space="preserve">, </w:t>
+      </w:r>
+      <w:r>
+        <w:rPr>
+          <w:rFonts w:ascii="Consolas" w:cs="Consolas" w:eastAsia="Consolas" w:hAnsi="Consolas"/>
+          <w:sz w:val="20"/>
+          <w:szCs w:val="20"/>
+        </w:rPr>
+        <w:t xml:space="preserve">vault_tritonic</w:t>
+      </w:r>
+      <w:r>
+        <w:t xml:space="preserve">, or </w:t>
+      </w:r>
+      <w:r>
+        <w:rPr>
+          <w:rFonts w:ascii="Consolas" w:cs="Consolas" w:eastAsia="Consolas" w:hAnsi="Consolas"/>
+          <w:sz w:val="20"/>
+          <w:szCs w:val="20"/>
+        </w:rPr>
+        <w:t xml:space="preserve">wyble_tritonic</w:t>
+      </w:r>
+      <w:r>
+        <w:t xml:space="preserve">) or when </w:t>
+      </w:r>
+      <w:r>
+        <w:rPr>
+          <w:b/>
+          <w:bCs/>
+        </w:rPr>
+        <w:t xml:space="preserve">String Quartet</w:t>
+      </w:r>
+      <w:r>
+        <w:t xml:space="preserve"> has Tritonic colour set to </w:t>
+      </w:r>
+      <w:r>
+        <w:rPr>
+          <w:b/>
+          <w:bCs/>
+        </w:rPr>
+        <w:t xml:space="preserve">Subtle</w:t>
+      </w:r>
+      <w:r>
+        <w:t xml:space="preserve"> or </w:t>
+      </w:r>
+      <w:r>
+        <w:rPr>
+          <w:b/>
+          <w:bCs/>
+        </w:rPr>
+        <w:t xml:space="preserve">Active</w:t>
+      </w:r>
+      <w:r>
+        <w:t xml:space="preserve">. Same layout every time: </w:t>
+      </w:r>
+      <w:r>
+        <w:rPr>
+          <w:b/>
+          <w:bCs/>
+        </w:rPr>
+        <w:t xml:space="preserve">Harmonic Float</w:t>
+      </w:r>
+      <w:r>
+        <w:t xml:space="preserve"> (scrolling anchor columns) · </w:t>
+      </w:r>
+      <w:r>
+        <w:rPr>
+          <w:b/>
+          <w:bCs/>
+        </w:rPr>
+        <w:t xml:space="preserve">active cell</w:t>
+      </w:r>
+      <w:r>
+        <w:t xml:space="preserve"> card (family, tension, resolution badge, sparkline) · </w:t>
+      </w:r>
+      <w:r>
+        <w:rPr>
+          <w:b/>
+          <w:bCs/>
+        </w:rPr>
+        <w:t xml:space="preserve">Melodic Trace</w:t>
+      </w:r>
+      <w:r>
+        <w:t xml:space="preserve"> (contour, hover-only detail) · </w:t>
+      </w:r>
+      <w:r>
+        <w:rPr>
+          <w:b/>
+          <w:bCs/>
+        </w:rPr>
+        <w:t xml:space="preserve">bias side rail</w:t>
+      </w:r>
+      <w:r>
+        <w:t xml:space="preserve"> (full sliders before generate, compact strip after) · </w:t>
+      </w:r>
+      <w:r>
+        <w:rPr>
+          <w:b/>
+          <w:bCs/>
+        </w:rPr>
+        <w:t xml:space="preserve">Diagnostics</w:t>
+      </w:r>
+      <w:r>
+        <w:t xml:space="preserve"> (collapsed strip).</w:t>
+      </w:r>
+    </w:p>
+    <w:p>
+      <w:pPr>
+        <w:pStyle w:val="Heading3"/>
+        <w:spacing w:after="80" w:before="140"/>
+      </w:pPr>
+      <w:r>
+        <w:t xml:space="preserve">Scenario 1 — Locked chart, harmonic float</w:t>
+      </w:r>
+    </w:p>
+    <w:p>
+      <w:pPr>
+        <w:spacing w:after="160"/>
+      </w:pPr>
+      <w:r>
+        <w:t xml:space="preserve">You imported a chart from iReal Pro or Tonality Vault. After Generate, </w:t>
+      </w:r>
+      <w:r>
+        <w:rPr>
+          <w:b/>
+          <w:bCs/>
+        </w:rPr>
+        <w:t xml:space="preserve">Harmonic Float</w:t>
+      </w:r>
+      <w:r>
+        <w:t xml:space="preserve"> shows one column per anchor bar: chord symbol at the base, cell glyph above, colour for stable · colouristic · unresolved · cadence-ready, vertical position for register. Scroll the strip before export — a glowing edge on a quiet bar is a natural breath or a Bartók-style delayed landing.</w:t>
+      </w:r>
+    </w:p>
+    <w:p>
+      <w:pPr>
+        <w:pStyle w:val="Heading3"/>
+        <w:spacing w:after="80" w:before="140"/>
+      </w:pPr>
+      <w:r>
+        <w:t xml:space="preserve">Scenario 2 — Melodic trace for a vocal line</w:t>
+      </w:r>
+    </w:p>
+    <w:p>
+      <w:pPr>
+        <w:spacing w:after="160"/>
+      </w:pPr>
+      <w:r>
+        <w:t xml:space="preserve">In the same run, </w:t>
+      </w:r>
+      <w:r>
+        <w:rPr>
+          <w:b/>
+          <w:bCs/>
+        </w:rPr>
+        <w:t xml:space="preserve">Melodic Trace</w:t>
+      </w:r>
+      <w:r>
+        <w:t xml:space="preserve"> draws the singer-safe line bold, the voice-led strand ghosted behind it, faint markers where the voicing top arrives. Hover a column for note name, interval from the previous note, and beat placement — shape first, labels only on demand. If the bold line stair-steps, nudge </w:t>
+      </w:r>
+      <w:r>
+        <w:rPr>
+          <w:b/>
+          <w:bCs/>
+        </w:rPr>
+        <w:t xml:space="preserve">Motif singability</w:t>
+      </w:r>
+      <w:r>
+        <w:t xml:space="preserve"> or </w:t>
+      </w:r>
+      <w:r>
+        <w:rPr>
+          <w:b/>
+          <w:bCs/>
+        </w:rPr>
+        <w:t xml:space="preserve">Contour bias</w:t>
+      </w:r>
+      <w:r>
+        <w:t xml:space="preserve"> on the side rail, then </w:t>
+      </w:r>
+      <w:r>
+        <w:rPr>
+          <w:b/>
+          <w:bCs/>
+        </w:rPr>
+        <w:t xml:space="preserve">Variation</w:t>
+      </w:r>
+      <w:r>
+        <w:t xml:space="preserve">.</w:t>
+      </w:r>
+    </w:p>
+    <w:p>
+      <w:pPr>
+        <w:pStyle w:val="Heading3"/>
+        <w:spacing w:after="80" w:before="140"/>
+      </w:pPr>
+      <w:r>
+        <w:t xml:space="preserve">Scenario 3 — Active cell, dials, and diagnostics</w:t>
+      </w:r>
+    </w:p>
+    <w:p>
+      <w:pPr>
+        <w:spacing w:after="160"/>
+      </w:pPr>
+      <w:r>
+        <w:t xml:space="preserve">Before a second take, read the </w:t>
+      </w:r>
+      <w:r>
+        <w:rPr>
+          <w:b/>
+          <w:bCs/>
+        </w:rPr>
+        <w:t xml:space="preserve">active cell</w:t>
+      </w:r>
+      <w:r>
+        <w:t xml:space="preserve"> card: cell family, tension, resolution badge (</w:t>
+      </w:r>
+      <w:r>
+        <w:rPr>
+          <w:b/>
+          <w:bCs/>
+        </w:rPr>
+        <w:t xml:space="preserve">locked</w:t>
+      </w:r>
+      <w:r>
+        <w:t xml:space="preserve"> · </w:t>
+      </w:r>
+      <w:r>
+        <w:rPr>
+          <w:b/>
+          <w:bCs/>
+        </w:rPr>
+        <w:t xml:space="preserve">near</w:t>
+      </w:r>
+      <w:r>
+        <w:t xml:space="preserve"> · </w:t>
+      </w:r>
+      <w:r>
+        <w:rPr>
+          <w:b/>
+          <w:bCs/>
+        </w:rPr>
+        <w:t xml:space="preserve">eligible</w:t>
+      </w:r>
+      <w:r>
+        <w:t xml:space="preserve"> · </w:t>
+      </w:r>
+      <w:r>
+        <w:rPr>
+          <w:b/>
+          <w:bCs/>
+        </w:rPr>
+        <w:t xml:space="preserve">resolving</w:t>
+      </w:r>
+      <w:r>
+        <w:t xml:space="preserve">), and a tension sparkline over the last two phrases. Open </w:t>
+      </w:r>
+      <w:r>
+        <w:rPr>
+          <w:b/>
+          <w:bCs/>
+        </w:rPr>
+        <w:t xml:space="preserve">Diagnostics</w:t>
+      </w:r>
+      <w:r>
+        <w:t xml:space="preserve"> for unresolved tones, contour variety, cadence strength, and rhythmic offset mix. The rail highlights the most influential bias and the one you changed last.</w:t>
+      </w:r>
+    </w:p>
+    <w:p>
+      <w:pPr>
+        <w:pStyle w:val="Heading3"/>
+        <w:spacing w:after="80" w:before="140"/>
+      </w:pPr>
+      <w:r>
+        <w:t xml:space="preserve">The same screen, different ensembles</w:t>
+      </w:r>
+    </w:p>
+    <w:p>
+      <w:pPr>
+        <w:spacing w:after="160"/>
+      </w:pPr>
+      <w:r>
+        <w:t xml:space="preserve">The Tritonic monitor speaks differently depending on what you are writing for. Same panels, different questions.</w:t>
+      </w:r>
+    </w:p>
+    <w:p>
+      <w:pPr>
+        <w:pStyle w:val="Heading4"/>
+        <w:spacing w:after="60" w:before="100"/>
+      </w:pPr>
+      <w:r>
+        <w:t xml:space="preserve">String quartet — blend and line</w:t>
+      </w:r>
+    </w:p>
+    <w:p>
+      <w:pPr>
+        <w:spacing w:after="160"/>
+      </w:pPr>
+      <w:r>
+        <w:t xml:space="preserve">Close-knit, voice-sensitive. The question is not just “how tense is this chord?” but “which voice is creating the colour, and is the blend still singing as one body?”</w:t>
+      </w:r>
+    </w:p>
+    <w:p>
+      <w:pPr>
+        <w:spacing w:after="160"/>
+      </w:pPr>
+      <w:r>
+        <w:rPr>
+          <w:b/>
+          <w:bCs/>
+        </w:rPr>
+        <w:t xml:space="preserve">Scenario:</w:t>
+      </w:r>
+      <w:r>
+        <w:t xml:space="preserve"> You are writing a warm floating intro for the four players. You check Harmonic Float to see where the colour is being created — is it the viola carrying the tension or the second violin? Then you look at Melodic Trace to make sure the first violin line still has a graceful arc rather than turning into a scale exercise. A glowing edge on a quiet chord tells you the phrase could resolve here — you might hold it one bar longer for the Bartók-style delayed arrival.</w:t>
+      </w:r>
+    </w:p>
+    <w:p>
+      <w:pPr>
+        <w:pStyle w:val="Heading4"/>
+        <w:spacing w:after="60" w:before="100"/>
+      </w:pPr>
+      <w:r>
+        <w:t xml:space="preserve">Big band — section weight and arrival</w:t>
+      </w:r>
+    </w:p>
+    <w:p>
+      <w:pPr>
+        <w:spacing w:after="160"/>
+      </w:pPr>
+      <w:r>
+        <w:t xml:space="preserve">Sectional, weight-sensitive. A warm bright cluster over one anchor may mean “the brass are pressing.” A cooler wider colour suggests the reeds are carrying a smoother body of sound.</w:t>
+      </w:r>
+    </w:p>
+    <w:p>
+      <w:pPr>
+        <w:spacing w:after="160"/>
+      </w:pPr>
+      <w:r>
+        <w:rPr>
+          <w:b/>
+          <w:bCs/>
+        </w:rPr>
+        <w:t xml:space="preserve">Scenario:</w:t>
+      </w:r>
+      <w:r>
+        <w:t xml:space="preserve"> You are writing a shout chorus and need to decide when to let the band land. The central card tells you whether the phrase is still building or ready to arrive. The floating colours show accumulated heat — three bars of warm saturation means the band has been suspended long enough. One bar with a glowing edge: that is your hit point.</w:t>
+      </w:r>
+    </w:p>
+    <w:p>
+      <w:pPr>
+        <w:spacing w:after="160"/>
+      </w:pPr>
+      <w:r>
+        <w:rPr>
+          <w:b/>
+          <w:bCs/>
+        </w:rPr>
+        <w:t xml:space="preserve">Scenario:</w:t>
+      </w:r>
+      <w:r>
+        <w:t xml:space="preserve"> You are writing a Thad Jones-style soli for the saxes over a slow groove. Melodic Trace shows whether the soli line has a memorable shape or has wandered into a series of unconnected figures. If the contour keeps climbing without a release, the line will feel exhausting rather than inevitable.</w:t>
+      </w:r>
+    </w:p>
+    <w:p>
+      <w:pPr>
+        <w:pStyle w:val="Heading4"/>
+        <w:spacing w:after="60" w:before="100"/>
+      </w:pPr>
+      <w:r>
+        <w:t xml:space="preserve">Guitar / bass duo — space and implication</w:t>
+      </w:r>
+    </w:p>
+    <w:p>
+      <w:pPr>
+        <w:spacing w:after="160"/>
+      </w:pPr>
+      <w:r>
+        <w:t xml:space="preserve">Exposed, conversational. Two players implying a whole harmonic world with very little material. Space between attacks matters as much as the notes themselves.</w:t>
+      </w:r>
+    </w:p>
+    <w:p>
+      <w:pPr>
+        <w:spacing w:after="160"/>
+      </w:pPr>
+      <w:r>
+        <w:rPr>
+          <w:b/>
+          <w:bCs/>
+        </w:rPr>
+        <w:t xml:space="preserve">Scenario:</w:t>
+      </w:r>
+      <w:r>
+        <w:t xml:space="preserve"> You are writing a rubato opening. The guitar suggests harmony, the bass answers in fragments. Melodic Trace shows whether the phrase feels singable and human. Harmonic Float shows whether the implied harmony glows with intention or simply looks incomplete. Cool settled colour over an ambiguous chord means the music is comfortable in its own mystery — that is often exactly right for this setting.</w:t>
+      </w:r>
+    </w:p>
+    <w:p>
+      <w:pPr>
+        <w:spacing w:after="160"/>
+      </w:pPr>
+      <w:r>
+        <w:rPr>
+          <w:b/>
+          <w:bCs/>
+        </w:rPr>
+        <w:t xml:space="preserve">Scenario:</w:t>
+      </w:r>
+      <w:r>
+        <w:t xml:space="preserve"> Orbit Suite — New Orleans sketch. The bass owns the second-line groove. The guitar floats Tritonic cells on the upper strings. Harmonic Float shows the cells arriving late behind the beat — warm colour blooming after the anchor, not on it. That delay is the whole point. If the colour appears on the downbeat, tighten the </w:t>
+      </w:r>
+      <w:r>
+        <w:rPr>
+          <w:b/>
+          <w:bCs/>
+        </w:rPr>
+        <w:t xml:space="preserve">Rhythmic displacement</w:t>
+      </w:r>
+      <w:r>
+        <w:t xml:space="preserve"> slider.</w:t>
+      </w:r>
+    </w:p>
+    <w:p>
+      <w:pPr>
+        <w:pStyle w:val="Heading4"/>
+        <w:spacing w:after="60" w:before="100"/>
+      </w:pPr>
+      <w:r>
+        <w:t xml:space="preserve">Wayne Shorter quartet — tension and narrative</w:t>
+      </w:r>
+    </w:p>
+    <w:p>
+      <w:pPr>
+        <w:spacing w:after="160"/>
+      </w:pPr>
+      <w:r>
+        <w:t xml:space="preserve">Suspended, story-driven. The question is always: are we moving toward something or deliberately away from it?</w:t>
+      </w:r>
+    </w:p>
+    <w:p>
+      <w:pPr>
+        <w:spacing w:after="160"/>
+      </w:pPr>
+      <w:r>
+        <w:rPr>
+          <w:b/>
+          <w:bCs/>
+        </w:rPr>
+        <w:t xml:space="preserve">Scenario:</w:t>
+      </w:r>
+      <w:r>
+        <w:t xml:space="preserve"> You are writing an Infant Eyes-style ballad. The harmony sits on a maj7 for two bars. Harmonic Float shows sustained warm colour — the cell is hanging above the chord, neither confirming nor contradicting it. The central card shows </w:t>
+      </w:r>
+      <w:r>
+        <w:rPr>
+          <w:b/>
+          <w:bCs/>
+        </w:rPr>
+        <w:t xml:space="preserve">near</w:t>
+      </w:r>
+      <w:r>
+        <w:t xml:space="preserve"> — the phrase could resolve but has not been told to yet. You leave it. Two bars later the card shifts to </w:t>
+      </w:r>
+      <w:r>
+        <w:rPr>
+          <w:b/>
+          <w:bCs/>
+        </w:rPr>
+        <w:t xml:space="preserve">resolving</w:t>
+      </w:r>
+      <w:r>
+        <w:t xml:space="preserve"> on its own. That moment is the composition.</w:t>
+      </w:r>
+    </w:p>
+    <w:p>
+      <w:pPr>
+        <w:pStyle w:val="Heading4"/>
+        <w:spacing w:after="60" w:before="100"/>
+      </w:pPr>
+      <w:r>
+        <w:t xml:space="preserve">ECM / chamber — sparsity and atmosphere</w:t>
+      </w:r>
+    </w:p>
+    <w:p>
+      <w:pPr>
+        <w:spacing w:after="160"/>
+      </w:pPr>
+      <w:r>
+        <w:t xml:space="preserve">Textural, atmospheric. Less is more. Long silences between events are as important as the events themselves.</w:t>
+      </w:r>
+    </w:p>
+    <w:p>
+      <w:pPr>
+        <w:spacing w:after="160"/>
+      </w:pPr>
+      <w:r>
+        <w:rPr>
+          <w:b/>
+          <w:bCs/>
+        </w:rPr>
+        <w:t xml:space="preserve">Scenario:</w:t>
+      </w:r>
+      <w:r>
+        <w:t xml:space="preserve"> You are writing an ECM-style duo for guitar and cello. Most bars have one Tritonic cell, maybe two. Harmonic Float shows long gaps of cool settled colour with occasional warm blooms. The diagnostics strip shows low contour variety — the melody is staying close, almost static. That is not a problem. That is the sound.</w:t>
+      </w:r>
+    </w:p>
+    <w:p>
+      <w:pPr>
+        <w:pStyle w:val="Heading4"/>
+        <w:spacing w:after="60" w:before="100"/>
+      </w:pPr>
+      <w:r>
+        <w:t xml:space="preserve">Diagnostics by ensemble</w:t>
+      </w:r>
+    </w:p>
+    <w:p>
+      <w:pPr>
+        <w:spacing w:after="160"/>
+      </w:pPr>
+      <w:r>
+        <w:t xml:space="preserve">The strip below the panels renames its priorities by context:</w:t>
+      </w:r>
+    </w:p>
+    <w:tbl>
+      <w:tblPr>
+        <w:tblW w:type="pct" w:w="100%"/>
+        <w:tblBorders>
+          <w:top w:val="single" w:color="auto" w:sz="4"/>
+          <w:left w:val="single" w:color="auto" w:sz="4"/>
+          <w:bottom w:val="single" w:color="auto" w:sz="4"/>
+          <w:right w:val="single" w:color="auto" w:sz="4"/>
+          <w:insideH w:val="single" w:color="auto" w:sz="4"/>
+          <w:insideV w:val="single" w:color="auto" w:sz="4"/>
+        </w:tblBorders>
+      </w:tblPr>
+      <w:tblGrid>
+        <w:gridCol w:w="4500"/>
+        <w:gridCol w:w="4500"/>
+      </w:tblGrid>
+      <w:tr>
+        <w:tc>
+          <w:tcPr>
+            <w:tcW w:type="pct" w:w="4500%"/>
+            <w:shd w:fill="E8EEF4"/>
+          </w:tcPr>
+          <w:p>
+            <w:pPr>
+              <w:spacing w:after="60"/>
+            </w:pPr>
+            <w:r>
+              <w:t xml:space="preserve">Context</w:t>
+            </w:r>
+          </w:p>
+        </w:tc>
+        <w:tc>
+          <w:tcPr>
+            <w:tcW w:type="pct" w:w="4500%"/>
+            <w:shd w:fill="E8EEF4"/>
+          </w:tcPr>
+          <w:p>
+            <w:pPr>
+              <w:spacing w:after="60"/>
+            </w:pPr>
+            <w:r>
+              <w:t xml:space="preserve">Read first</w:t>
+            </w:r>
+          </w:p>
+        </w:tc>
+      </w:tr>
+      <w:tr>
+        <w:tc>
+          <w:tcPr>
+            <w:tcW w:type="pct" w:w="4500%"/>
+          </w:tcPr>
+          <w:p>
+            <w:pPr>
+              <w:spacing w:after="60"/>
+            </w:pPr>
+            <w:r>
+              <w:rPr>
+                <w:b/>
+                <w:bCs/>
+              </w:rPr>
+              <w:t xml:space="preserve">String quartet</w:t>
+            </w:r>
+          </w:p>
+        </w:tc>
+        <w:tc>
+          <w:tcPr>
+            <w:tcW w:type="pct" w:w="4500%"/>
+          </w:tcPr>
+          <w:p>
+            <w:pPr>
+              <w:spacing w:after="60"/>
+            </w:pPr>
+            <w:r>
+              <w:t xml:space="preserve">Unresolved tones · line independence</w:t>
+            </w:r>
+          </w:p>
+        </w:tc>
+      </w:tr>
+      <w:tr>
+        <w:tc>
+          <w:tcPr>
+            <w:tcW w:type="pct" w:w="4500%"/>
+          </w:tcPr>
+          <w:p>
+            <w:pPr>
+              <w:spacing w:after="60"/>
+            </w:pPr>
+            <w:r>
+              <w:rPr>
+                <w:b/>
+                <w:bCs/>
+              </w:rPr>
+              <w:t xml:space="preserve">Big band</w:t>
+            </w:r>
+          </w:p>
+        </w:tc>
+        <w:tc>
+          <w:tcPr>
+            <w:tcW w:type="pct" w:w="4500%"/>
+          </w:tcPr>
+          <w:p>
+            <w:pPr>
+              <w:spacing w:after="60"/>
+            </w:pPr>
+            <w:r>
+              <w:t xml:space="preserve">Cadence strength · section balance</w:t>
+            </w:r>
+          </w:p>
+        </w:tc>
+      </w:tr>
+      <w:tr>
+        <w:tc>
+          <w:tcPr>
+            <w:tcW w:type="pct" w:w="4500%"/>
+          </w:tcPr>
+          <w:p>
+            <w:pPr>
+              <w:spacing w:after="60"/>
+            </w:pPr>
+            <w:r>
+              <w:rPr>
+                <w:b/>
+                <w:bCs/>
+              </w:rPr>
+              <w:t xml:space="preserve">Guitar / bass duo</w:t>
+            </w:r>
+          </w:p>
+        </w:tc>
+        <w:tc>
+          <w:tcPr>
+            <w:tcW w:type="pct" w:w="4500%"/>
+          </w:tcPr>
+          <w:p>
+            <w:pPr>
+              <w:spacing w:after="60"/>
+            </w:pPr>
+            <w:r>
+              <w:t xml:space="preserve">Contour variety · rhythmic offset</w:t>
+            </w:r>
+          </w:p>
+        </w:tc>
+      </w:tr>
+      <w:tr>
+        <w:tc>
+          <w:tcPr>
+            <w:tcW w:type="pct" w:w="4500%"/>
+          </w:tcPr>
+          <w:p>
+            <w:pPr>
+              <w:spacing w:after="60"/>
+            </w:pPr>
+            <w:r>
+              <w:rPr>
+                <w:b/>
+                <w:bCs/>
+              </w:rPr>
+              <w:t xml:space="preserve">Wayne Shorter</w:t>
+            </w:r>
+          </w:p>
+        </w:tc>
+        <w:tc>
+          <w:tcPr>
+            <w:tcW w:type="pct" w:w="4500%"/>
+          </w:tcPr>
+          <w:p>
+            <w:pPr>
+              <w:spacing w:after="60"/>
+            </w:pPr>
+            <w:r>
+              <w:t xml:space="preserve">Resolution delay · anchor adhesion</w:t>
+            </w:r>
+          </w:p>
+        </w:tc>
+      </w:tr>
+      <w:tr>
+        <w:tc>
+          <w:tcPr>
+            <w:tcW w:type="pct" w:w="4500%"/>
+          </w:tcPr>
+          <w:p>
+            <w:pPr>
+              <w:spacing w:after="60"/>
+            </w:pPr>
+            <w:r>
+              <w:rPr>
+                <w:b/>
+                <w:bCs/>
+              </w:rPr>
+              <w:t xml:space="preserve">ECM</w:t>
+            </w:r>
+          </w:p>
+        </w:tc>
+        <w:tc>
+          <w:tcPr>
+            <w:tcW w:type="pct" w:w="4500%"/>
+          </w:tcPr>
+          <w:p>
+            <w:pPr>
+              <w:spacing w:after="60"/>
+            </w:pPr>
+            <w:r>
+              <w:t xml:space="preserve">Sparsity (low event density) · registral spread</w:t>
+            </w:r>
+          </w:p>
+        </w:tc>
+      </w:tr>
+    </w:tbl>
+    <w:p>
+      <w:pPr>
+        <w:spacing w:after="160"/>
+      </w:pPr>
     </w:p>
     <w:p>
       <w:pPr>

</xml_diff>

<commit_message>
docs + dist: v1.5.0 release
Co-authored-by: Cursor <cursoragent@cursor.com>
</commit_message>
<xml_diff>
--- a/docs/COMPOSER_HANDBOOK.docx
+++ b/docs/COMPOSER_HANDBOOK.docx
@@ -122,6 +122,278 @@
     <w:p>
       <w:r>
         <w:br w:type="page"/>
+      </w:r>
+    </w:p>
+    <w:p>
+      <w:pPr>
+        <w:pStyle w:val="Heading2"/>
+        <w:spacing w:after="100" w:before="180"/>
+      </w:pPr>
+      <w:r>
+        <w:t xml:space="preserve">ECM VRB — room character (header chip)</w:t>
+      </w:r>
+    </w:p>
+    <w:p>
+      <w:pPr>
+        <w:spacing w:after="160"/>
+      </w:pPr>
+      <w:r>
+        <w:rPr>
+          <w:b/>
+          <w:bCs/>
+        </w:rPr>
+        <w:t xml:space="preserve">VRB</w:t>
+      </w:r>
+      <w:r>
+        <w:t xml:space="preserve"> in the app header (</w:t>
+      </w:r>
+      <w:r>
+        <w:rPr>
+          <w:b/>
+          <w:bCs/>
+        </w:rPr>
+        <w:t xml:space="preserve">`VRB: Nordic Studio`</w:t>
+      </w:r>
+      <w:r>
+        <w:t xml:space="preserve">) is </w:t>
+      </w:r>
+      <w:r>
+        <w:rPr>
+          <w:b/>
+          <w:bCs/>
+        </w:rPr>
+        <w:t xml:space="preserve">not</w:t>
+      </w:r>
+      <w:r>
+        <w:t xml:space="preserve"> a reverb plugin and </w:t>
+      </w:r>
+      <w:r>
+        <w:rPr>
+          <w:b/>
+          <w:bCs/>
+        </w:rPr>
+        <w:t xml:space="preserve">not</w:t>
+      </w:r>
+      <w:r>
+        <w:t xml:space="preserve"> the harmonic </w:t>
+      </w:r>
+      <w:r>
+        <w:rPr>
+          <w:b/>
+          <w:bCs/>
+        </w:rPr>
+        <w:t xml:space="preserve">VoiceRuleBundle</w:t>
+      </w:r>
+      <w:r>
+        <w:t xml:space="preserve"> roster below. It is an </w:t>
+      </w:r>
+      <w:r>
+        <w:rPr>
+          <w:b/>
+          <w:bCs/>
+        </w:rPr>
+        <w:t xml:space="preserve">ECM Records–style room profile</w:t>
+      </w:r>
+      <w:r>
+        <w:t xml:space="preserve">: how dry or spacious the generated material should feel — room size, decay tail, early reflections, damping. Composer OS passes this as metadata on every generate call so exports and downstream scoring share one acoustic “stage.”</w:t>
+      </w:r>
+    </w:p>
+    <w:p>
+      <w:pPr>
+        <w:spacing w:after="160"/>
+      </w:pPr>
+      <w:r>
+        <w:rPr>
+          <w:b/>
+          <w:bCs/>
+        </w:rPr>
+        <w:t xml:space="preserve">Default — Nordic Studio</w:t>
+      </w:r>
+      <w:r>
+        <w:t xml:space="preserve"> — Manfred Eicher signature sound: dry focus, long tail, restrained early reflections. </w:t>
+      </w:r>
+      <w:r>
+        <w:rPr>
+          <w:b/>
+          <w:bCs/>
+        </w:rPr>
+        <w:t xml:space="preserve">roomSize 0.42</w:t>
+      </w:r>
+      <w:r>
+        <w:t xml:space="preserve"> · </w:t>
+      </w:r>
+      <w:r>
+        <w:rPr>
+          <w:b/>
+          <w:bCs/>
+        </w:rPr>
+        <w:t xml:space="preserve">decay 1.8 s</w:t>
+      </w:r>
+      <w:r>
+        <w:t xml:space="preserve"> · </w:t>
+      </w:r>
+      <w:r>
+        <w:rPr>
+          <w:b/>
+          <w:bCs/>
+        </w:rPr>
+        <w:t xml:space="preserve">predelay 12 ms</w:t>
+      </w:r>
+      <w:r>
+        <w:t xml:space="preserve"> · damping 0.55 · diffusion 0.62.</w:t>
+      </w:r>
+    </w:p>
+    <w:p>
+      <w:pPr>
+        <w:spacing w:after="160"/>
+      </w:pPr>
+      <w:r>
+        <w:rPr>
+          <w:b/>
+          <w:bCs/>
+        </w:rPr>
+        <w:t xml:space="preserve">Other rooms:</w:t>
+      </w:r>
+      <w:r>
+        <w:t xml:space="preserve"> Stone Church Oslo · Infinite Hall · Close Dry · Distant Bloom · Cathedral Fade · </w:t>
+      </w:r>
+      <w:r>
+        <w:rPr>
+          <w:b/>
+          <w:bCs/>
+        </w:rPr>
+        <w:t xml:space="preserve">— Off —</w:t>
+      </w:r>
+      <w:r>
+        <w:t xml:space="preserve"> (no VRB on generate).</w:t>
+      </w:r>
+    </w:p>
+    <w:p>
+      <w:pPr>
+        <w:spacing w:after="160"/>
+      </w:pPr>
+      <w:r>
+        <w:rPr>
+          <w:b/>
+          <w:bCs/>
+        </w:rPr>
+        <w:t xml:space="preserve">Where to change it:</w:t>
+      </w:r>
+      <w:r>
+        <w:t xml:space="preserve"> </w:t>
+      </w:r>
+      <w:r>
+        <w:rPr>
+          <w:b/>
+          <w:bCs/>
+        </w:rPr>
+        <w:t xml:space="preserve">Structure</w:t>
+      </w:r>
+      <w:r>
+        <w:t xml:space="preserve"> tab → </w:t>
+      </w:r>
+      <w:r>
+        <w:rPr>
+          <w:b/>
+          <w:bCs/>
+        </w:rPr>
+        <w:t xml:space="preserve">ECM VRB</w:t>
+      </w:r>
+      <w:r>
+        <w:t xml:space="preserve"> panel (</w:t>
+      </w:r>
+      <w:r>
+        <w:rPr>
+          <w:b/>
+          <w:bCs/>
+        </w:rPr>
+        <w:t xml:space="preserve">`VrbPanel`</w:t>
+      </w:r>
+      <w:r>
+        <w:t xml:space="preserve">). Header chip click jumps there. Sliders unlock when </w:t>
+      </w:r>
+      <w:r>
+        <w:rPr>
+          <w:b/>
+          <w:bCs/>
+        </w:rPr>
+        <w:t xml:space="preserve">Lock to Preset</w:t>
+      </w:r>
+      <w:r>
+        <w:t xml:space="preserve"> is off.</w:t>
+      </w:r>
+    </w:p>
+    <w:p>
+      <w:pPr>
+        <w:spacing w:after="160"/>
+      </w:pPr>
+      <w:r>
+        <w:rPr>
+          <w:b/>
+          <w:bCs/>
+        </w:rPr>
+        <w:t xml:space="preserve">Generation:</w:t>
+      </w:r>
+      <w:r>
+        <w:t xml:space="preserve"> Active profile is sent as </w:t>
+      </w:r>
+      <w:r>
+        <w:rPr>
+          <w:b/>
+          <w:bCs/>
+        </w:rPr>
+        <w:t xml:space="preserve">`vrbProfile`</w:t>
+      </w:r>
+      <w:r>
+        <w:t xml:space="preserve"> on every </w:t>
+      </w:r>
+      <w:r>
+        <w:rPr>
+          <w:b/>
+          <w:bCs/>
+        </w:rPr>
+        <w:t xml:space="preserve">`GenerateRequest`</w:t>
+      </w:r>
+      <w:r>
+        <w:t xml:space="preserve"> (preset id, name, room params, character string). Off = field omitted.</w:t>
+      </w:r>
+    </w:p>
+    <w:p>
+      <w:pPr>
+        <w:spacing w:after="160"/>
+      </w:pPr>
+      <w:r>
+        <w:t xml:space="preserve">Presets live in </w:t>
+      </w:r>
+      <w:r>
+        <w:rPr>
+          <w:b/>
+          <w:bCs/>
+        </w:rPr>
+        <w:t xml:space="preserve">`src/engine/ecmVrb.js`</w:t>
+      </w:r>
+      <w:r>
+        <w:t xml:space="preserve">; app state in </w:t>
+      </w:r>
+      <w:r>
+        <w:rPr>
+          <w:b/>
+          <w:bCs/>
+        </w:rPr>
+        <w:t xml:space="preserve">`VrbProfileContext`</w:t>
+      </w:r>
+      <w:r>
+        <w:t xml:space="preserve"> (default </w:t>
+      </w:r>
+      <w:r>
+        <w:rPr>
+          <w:b/>
+          <w:bCs/>
+        </w:rPr>
+        <w:t xml:space="preserve">`nordic_studio`</w:t>
+      </w:r>
+      <w:r>
+        <w:t xml:space="preserve">).</w:t>
       </w:r>
     </w:p>
     <w:p>

</xml_diff>

<commit_message>
fix(tritonic): bar density for Orbit solo export (v1.7p6)
noteDensityPerBar min 3, tension-scaled 4-8 via tritonicBarDensity.ts. solo_01: 28 to 164 notes (~5.9/bar). orbitSoloBatchExport.test.ts 8/8 PASS.

Co-authored-by: Cursor <cursoragent@cursor.com>
</commit_message>
<xml_diff>
--- a/docs/COMPOSER_HANDBOOK.docx
+++ b/docs/COMPOSER_HANDBOOK.docx
@@ -6861,6 +6861,465 @@
       </w:r>
       <w:r>
         <w:t xml:space="preserve">).</w:t>
+      </w:r>
+    </w:p>
+    <w:p>
+      <w:pPr>
+        <w:pStyle w:val="Heading3"/>
+        <w:spacing w:after="80" w:before="140"/>
+      </w:pPr>
+      <w:r>
+        <w:t xml:space="preserve">Orbit 28-bar solo export (v1.7p4–p6)</w:t>
+      </w:r>
+    </w:p>
+    <w:p>
+      <w:pPr>
+        <w:spacing w:after="160"/>
+      </w:pPr>
+      <w:r>
+        <w:rPr>
+          <w:b/>
+          <w:bCs/>
+        </w:rPr>
+        <w:t xml:space="preserve">Script:</w:t>
+      </w:r>
+      <w:r>
+        <w:t xml:space="preserve"> </w:t>
+      </w:r>
+      <w:r>
+        <w:rPr>
+          <w:rFonts w:ascii="Consolas" w:cs="Consolas" w:eastAsia="Consolas" w:hAnsi="Consolas"/>
+          <w:sz w:val="20"/>
+          <w:szCs w:val="20"/>
+        </w:rPr>
+        <w:t xml:space="preserve">scripts/orbitSoloBatchExport28.ts</w:t>
+      </w:r>
+      <w:r>
+        <w:t xml:space="preserve"> — four lead-sheet MusicXML solos for the Orbit 28-bar chart (90 BPM, 4/4). Default output: </w:t>
+      </w:r>
+      <w:r>
+        <w:rPr>
+          <w:b/>
+          <w:bCs/>
+        </w:rPr>
+        <w:t xml:space="preserve">Orbit-Solos</w:t>
+      </w:r>
+      <w:r>
+        <w:t xml:space="preserve"> folder beside your Orbit BB charts.</w:t>
+      </w:r>
+    </w:p>
+    <w:tbl>
+      <w:tblPr>
+        <w:tblW w:type="pct" w:w="100%"/>
+        <w:tblBorders>
+          <w:top w:val="single" w:color="auto" w:sz="4"/>
+          <w:left w:val="single" w:color="auto" w:sz="4"/>
+          <w:bottom w:val="single" w:color="auto" w:sz="4"/>
+          <w:right w:val="single" w:color="auto" w:sz="4"/>
+          <w:insideH w:val="single" w:color="auto" w:sz="4"/>
+          <w:insideV w:val="single" w:color="auto" w:sz="4"/>
+        </w:tblBorders>
+      </w:tblPr>
+      <w:tblGrid>
+        <w:gridCol w:w="4500"/>
+        <w:gridCol w:w="4500"/>
+      </w:tblGrid>
+      <w:tr>
+        <w:tc>
+          <w:tcPr>
+            <w:tcW w:type="pct" w:w="4500%"/>
+            <w:shd w:fill="E8EEF4"/>
+          </w:tcPr>
+          <w:p>
+            <w:pPr>
+              <w:spacing w:after="60"/>
+            </w:pPr>
+            <w:r>
+              <w:t xml:space="preserve">File</w:t>
+            </w:r>
+          </w:p>
+        </w:tc>
+        <w:tc>
+          <w:tcPr>
+            <w:tcW w:type="pct" w:w="4500%"/>
+            <w:shd w:fill="E8EEF4"/>
+          </w:tcPr>
+          <w:p>
+            <w:pPr>
+              <w:spacing w:after="60"/>
+            </w:pPr>
+            <w:r>
+              <w:t xml:space="preserve">Engine</w:t>
+            </w:r>
+          </w:p>
+        </w:tc>
+      </w:tr>
+      <w:tr>
+        <w:tc>
+          <w:tcPr>
+            <w:tcW w:type="pct" w:w="4500%"/>
+          </w:tcPr>
+          <w:p>
+            <w:pPr>
+              <w:spacing w:after="60"/>
+            </w:pPr>
+            <w:r>
+              <w:rPr>
+                <w:rFonts w:ascii="Consolas" w:cs="Consolas" w:eastAsia="Consolas" w:hAnsi="Consolas"/>
+                <w:sz w:val="20"/>
+                <w:szCs w:val="20"/>
+              </w:rPr>
+              <w:t xml:space="preserve">solo_01_tritonic.musicxml</w:t>
+            </w:r>
+          </w:p>
+        </w:tc>
+        <w:tc>
+          <w:tcPr>
+            <w:tcW w:type="pct" w:w="4500%"/>
+          </w:tcPr>
+          <w:p>
+            <w:pPr>
+              <w:spacing w:after="60"/>
+            </w:pPr>
+            <w:r>
+              <w:t xml:space="preserve">Tritonic vault-anchored float (</w:t>
+            </w:r>
+            <w:r>
+              <w:rPr>
+                <w:rFonts w:ascii="Consolas" w:cs="Consolas" w:eastAsia="Consolas" w:hAnsi="Consolas"/>
+                <w:sz w:val="20"/>
+                <w:szCs w:val="20"/>
+              </w:rPr>
+              <w:t xml:space="preserve">buildMusicContextFromTritonic</w:t>
+            </w:r>
+            <w:r>
+              <w:t xml:space="preserve">)</w:t>
+            </w:r>
+          </w:p>
+        </w:tc>
+      </w:tr>
+      <w:tr>
+        <w:tc>
+          <w:tcPr>
+            <w:tcW w:type="pct" w:w="4500%"/>
+          </w:tcPr>
+          <w:p>
+            <w:pPr>
+              <w:spacing w:after="60"/>
+            </w:pPr>
+            <w:r>
+              <w:rPr>
+                <w:rFonts w:ascii="Consolas" w:cs="Consolas" w:eastAsia="Consolas" w:hAnsi="Consolas"/>
+                <w:sz w:val="20"/>
+                <w:szCs w:val="20"/>
+              </w:rPr>
+              <w:t xml:space="preserve">solo_02_vault_triad_pairs.musicxml</w:t>
+            </w:r>
+          </w:p>
+        </w:tc>
+        <w:tc>
+          <w:tcPr>
+            <w:tcW w:type="pct" w:w="4500%"/>
+          </w:tcPr>
+          <w:p>
+            <w:pPr>
+              <w:spacing w:after="60"/>
+            </w:pPr>
+            <w:r>
+              <w:t xml:space="preserve">Vault triad pairs (</w:t>
+            </w:r>
+            <w:r>
+              <w:rPr>
+                <w:rFonts w:ascii="Consolas" w:cs="Consolas" w:eastAsia="Consolas" w:hAnsi="Consolas"/>
+                <w:sz w:val="20"/>
+                <w:szCs w:val="20"/>
+              </w:rPr>
+              <w:t xml:space="preserve">buildMusicContextFromVault</w:t>
+            </w:r>
+            <w:r>
+              <w:t xml:space="preserve">)</w:t>
+            </w:r>
+          </w:p>
+        </w:tc>
+      </w:tr>
+      <w:tr>
+        <w:tc>
+          <w:tcPr>
+            <w:tcW w:type="pct" w:w="4500%"/>
+          </w:tcPr>
+          <w:p>
+            <w:pPr>
+              <w:spacing w:after="60"/>
+            </w:pPr>
+            <w:r>
+              <w:rPr>
+                <w:rFonts w:ascii="Consolas" w:cs="Consolas" w:eastAsia="Consolas" w:hAnsi="Consolas"/>
+                <w:sz w:val="20"/>
+                <w:szCs w:val="20"/>
+              </w:rPr>
+              <w:t xml:space="preserve">solo_03_martino_linear.musicxml</w:t>
+            </w:r>
+          </w:p>
+        </w:tc>
+        <w:tc>
+          <w:tcPr>
+            <w:tcW w:type="pct" w:w="4500%"/>
+          </w:tcPr>
+          <w:p>
+            <w:pPr>
+              <w:spacing w:after="60"/>
+            </w:pPr>
+            <w:r>
+              <w:t xml:space="preserve">Martino linear (</w:t>
+            </w:r>
+            <w:r>
+              <w:rPr>
+                <w:rFonts w:ascii="Consolas" w:cs="Consolas" w:eastAsia="Consolas" w:hAnsi="Consolas"/>
+                <w:sz w:val="20"/>
+                <w:szCs w:val="20"/>
+              </w:rPr>
+              <w:t xml:space="preserve">realiseMartinoSolo</w:t>
+            </w:r>
+            <w:r>
+              <w:t xml:space="preserve">)</w:t>
+            </w:r>
+          </w:p>
+        </w:tc>
+      </w:tr>
+      <w:tr>
+        <w:tc>
+          <w:tcPr>
+            <w:tcW w:type="pct" w:w="4500%"/>
+          </w:tcPr>
+          <w:p>
+            <w:pPr>
+              <w:spacing w:after="60"/>
+            </w:pPr>
+            <w:r>
+              <w:rPr>
+                <w:rFonts w:ascii="Consolas" w:cs="Consolas" w:eastAsia="Consolas" w:hAnsi="Consolas"/>
+                <w:sz w:val="20"/>
+                <w:szCs w:val="20"/>
+              </w:rPr>
+              <w:t xml:space="preserve">solo_04_zappa.musicxml</w:t>
+            </w:r>
+          </w:p>
+        </w:tc>
+        <w:tc>
+          <w:tcPr>
+            <w:tcW w:type="pct" w:w="4500%"/>
+          </w:tcPr>
+          <w:p>
+            <w:pPr>
+              <w:spacing w:after="60"/>
+            </w:pPr>
+            <w:r>
+              <w:t xml:space="preserve">Zappa solo (</w:t>
+            </w:r>
+            <w:r>
+              <w:rPr>
+                <w:rFonts w:ascii="Consolas" w:cs="Consolas" w:eastAsia="Consolas" w:hAnsi="Consolas"/>
+                <w:sz w:val="20"/>
+                <w:szCs w:val="20"/>
+              </w:rPr>
+              <w:t xml:space="preserve">realiseZappaSoloFromBehaviour</w:t>
+            </w:r>
+            <w:r>
+              <w:t xml:space="preserve">)</w:t>
+            </w:r>
+          </w:p>
+        </w:tc>
+      </w:tr>
+    </w:tbl>
+    <w:p>
+      <w:pPr>
+        <w:spacing w:after="160"/>
+      </w:pPr>
+    </w:p>
+    <w:p>
+      <w:pPr>
+        <w:spacing w:after="160"/>
+      </w:pPr>
+      <w:r>
+        <w:t xml:space="preserve">Each export carries an </w:t>
+      </w:r>
+      <w:r>
+        <w:rPr>
+          <w:b/>
+          <w:bCs/>
+        </w:rPr>
+        <w:t xml:space="preserve">integrity receipt</w:t>
+      </w:r>
+      <w:r>
+        <w:t xml:space="preserve"> (</w:t>
+      </w:r>
+      <w:r>
+        <w:rPr>
+          <w:rFonts w:ascii="Consolas" w:cs="Consolas" w:eastAsia="Consolas" w:hAnsi="Consolas"/>
+          <w:sz w:val="20"/>
+          <w:szCs w:val="20"/>
+        </w:rPr>
+        <w:t xml:space="preserve">exportIntegrityPassed</w:t>
+      </w:r>
+      <w:r>
+        <w:t xml:space="preserve">).</w:t>
+      </w:r>
+    </w:p>
+    <w:p>
+      <w:pPr>
+        <w:spacing w:after="160"/>
+      </w:pPr>
+      <w:r>
+        <w:rPr>
+          <w:b/>
+          <w:bCs/>
+        </w:rPr>
+        <w:t xml:space="preserve">v1.7p6 — Tritonic density fix:</w:t>
+      </w:r>
+      <w:r>
+        <w:t xml:space="preserve"> </w:t>
+      </w:r>
+      <w:r>
+        <w:rPr>
+          <w:rFonts w:ascii="Consolas" w:cs="Consolas" w:eastAsia="Consolas" w:hAnsi="Consolas"/>
+          <w:sz w:val="20"/>
+          <w:szCs w:val="20"/>
+        </w:rPr>
+        <w:t xml:space="preserve">tritonicBarDensity.ts</w:t>
+      </w:r>
+      <w:r>
+        <w:t xml:space="preserve"> sets </w:t>
+      </w:r>
+      <w:r>
+        <w:rPr>
+          <w:b/>
+          <w:bCs/>
+        </w:rPr>
+        <w:t xml:space="preserve">`noteDensityPerBar`</w:t>
+      </w:r>
+      <w:r>
+        <w:t xml:space="preserve"> (minimum </w:t>
+      </w:r>
+      <w:r>
+        <w:rPr>
+          <w:b/>
+          <w:bCs/>
+        </w:rPr>
+        <w:t xml:space="preserve">3</w:t>
+      </w:r>
+      <w:r>
+        <w:t xml:space="preserve"> notes per bar; tension-scaled target </w:t>
+      </w:r>
+      <w:r>
+        <w:rPr>
+          <w:b/>
+          <w:bCs/>
+        </w:rPr>
+        <w:t xml:space="preserve">4–8</w:t>
+      </w:r>
+      <w:r>
+        <w:t xml:space="preserve">). </w:t>
+      </w:r>
+      <w:r>
+        <w:rPr>
+          <w:rFonts w:ascii="Consolas" w:cs="Consolas" w:eastAsia="Consolas" w:hAnsi="Consolas"/>
+          <w:sz w:val="20"/>
+          <w:szCs w:val="20"/>
+        </w:rPr>
+        <w:t xml:space="preserve">realiseTritonicSolo</w:t>
+      </w:r>
+      <w:r>
+        <w:t xml:space="preserve"> expands the singer-safe strand before MusicXML export (replacing the old 1:1 timeline mapping). </w:t>
+      </w:r>
+      <w:r>
+        <w:rPr>
+          <w:b/>
+          <w:bCs/>
+        </w:rPr>
+        <w:t xml:space="preserve">`solo_01_tritonic.musicxml`:</w:t>
+      </w:r>
+      <w:r>
+        <w:t xml:space="preserve"> </w:t>
+      </w:r>
+      <w:r>
+        <w:rPr>
+          <w:b/>
+          <w:bCs/>
+        </w:rPr>
+        <w:t xml:space="preserve">28 → 164</w:t>
+      </w:r>
+      <w:r>
+        <w:t xml:space="preserve"> notes · average </w:t>
+      </w:r>
+      <w:r>
+        <w:rPr>
+          <w:b/>
+          <w:bCs/>
+        </w:rPr>
+        <w:t xml:space="preserve">~5.9</w:t>
+      </w:r>
+      <w:r>
+        <w:t xml:space="preserve"> notes/bar · per-bar range </w:t>
+      </w:r>
+      <w:r>
+        <w:rPr>
+          <w:b/>
+          <w:bCs/>
+        </w:rPr>
+        <w:t xml:space="preserve">3–8</w:t>
+      </w:r>
+      <w:r>
+        <w:t xml:space="preserve">. </w:t>
+      </w:r>
+      <w:r>
+        <w:rPr>
+          <w:b/>
+          <w:bCs/>
+        </w:rPr>
+        <w:t xml:space="preserve">`orbitSoloBatchExport.test.ts`:</w:t>
+      </w:r>
+      <w:r>
+        <w:t xml:space="preserve"> </w:t>
+      </w:r>
+      <w:r>
+        <w:rPr>
+          <w:b/>
+          <w:bCs/>
+        </w:rPr>
+        <w:t xml:space="preserve">8/8</w:t>
+      </w:r>
+      <w:r>
+        <w:t xml:space="preserve"> PASS.</w:t>
+      </w:r>
+    </w:p>
+    <w:p>
+      <w:pPr>
+        <w:spacing w:after="160"/>
+      </w:pPr>
+      <w:r>
+        <w:t xml:space="preserve">Optional preset override: </w:t>
+      </w:r>
+      <w:r>
+        <w:rPr>
+          <w:rFonts w:ascii="Consolas" w:cs="Consolas" w:eastAsia="Consolas" w:hAnsi="Consolas"/>
+          <w:sz w:val="20"/>
+          <w:szCs w:val="20"/>
+        </w:rPr>
+        <w:t xml:space="preserve">noteDensityPerBar: { min, targetLow, targetHigh }</w:t>
+      </w:r>
+      <w:r>
+        <w:t xml:space="preserve"> on </w:t>
+      </w:r>
+      <w:r>
+        <w:rPr>
+          <w:rFonts w:ascii="Consolas" w:cs="Consolas" w:eastAsia="Consolas" w:hAnsi="Consolas"/>
+          <w:sz w:val="20"/>
+          <w:szCs w:val="20"/>
+        </w:rPr>
+        <w:t xml:space="preserve">TritonicMusicContextPreset</w:t>
+      </w:r>
+      <w:r>
+        <w:t xml:space="preserve">.</w:t>
       </w:r>
     </w:p>
     <w:p>

</xml_diff>

<commit_message>
fix(orbit): pre-Sibelius solo hardening pass (v1.7p7)
soloTreblePitchRange C4-G6 clamp and soloSibeliusHardening on all four Orbit solos. Validator orbitSoloSibeliusValidate.ts. 8/8 tests PASS.

Co-authored-by: Cursor <cursoragent@cursor.com>
</commit_message>
<xml_diff>
--- a/docs/COMPOSER_HANDBOOK.docx
+++ b/docs/COMPOSER_HANDBOOK.docx
@@ -6869,7 +6869,7 @@
         <w:spacing w:after="80" w:before="140"/>
       </w:pPr>
       <w:r>
-        <w:t xml:space="preserve">Orbit 28-bar solo export (v1.7p4–p6)</w:t>
+        <w:t xml:space="preserve">Orbit 28-bar solo export (v1.7p4–p7)</w:t>
       </w:r>
     </w:p>
     <w:p>
@@ -7270,6 +7270,371 @@
       </w:r>
       <w:r>
         <w:t xml:space="preserve">. </w:t>
+      </w:r>
+      <w:r>
+        <w:rPr>
+          <w:b/>
+          <w:bCs/>
+        </w:rPr>
+        <w:t xml:space="preserve">`orbitSoloBatchExport.test.ts`:</w:t>
+      </w:r>
+      <w:r>
+        <w:t xml:space="preserve"> </w:t>
+      </w:r>
+      <w:r>
+        <w:rPr>
+          <w:b/>
+          <w:bCs/>
+        </w:rPr>
+        <w:t xml:space="preserve">8/8</w:t>
+      </w:r>
+      <w:r>
+        <w:t xml:space="preserve"> PASS.</w:t>
+      </w:r>
+    </w:p>
+    <w:p>
+      <w:pPr>
+        <w:spacing w:after="160"/>
+      </w:pPr>
+      <w:r>
+        <w:rPr>
+          <w:b/>
+          <w:bCs/>
+        </w:rPr>
+        <w:t xml:space="preserve">v1.7p7 — Pre-Sibelius hardening:</w:t>
+      </w:r>
+      <w:r>
+        <w:t xml:space="preserve"> </w:t>
+      </w:r>
+      <w:r>
+        <w:rPr>
+          <w:rFonts w:ascii="Consolas" w:cs="Consolas" w:eastAsia="Consolas" w:hAnsi="Consolas"/>
+          <w:sz w:val="20"/>
+          <w:szCs w:val="20"/>
+        </w:rPr>
+        <w:t xml:space="preserve">soloTreblePitchRange.ts</w:t>
+      </w:r>
+      <w:r>
+        <w:t xml:space="preserve"> — treble concert range </w:t>
+      </w:r>
+      <w:r>
+        <w:rPr>
+          <w:b/>
+          <w:bCs/>
+        </w:rPr>
+        <w:t xml:space="preserve">C4–G6</w:t>
+      </w:r>
+      <w:r>
+        <w:t xml:space="preserve"> (MIDI 60–91). </w:t>
+      </w:r>
+      <w:r>
+        <w:rPr>
+          <w:rFonts w:ascii="Consolas" w:cs="Consolas" w:eastAsia="Consolas" w:hAnsi="Consolas"/>
+          <w:sz w:val="20"/>
+          <w:szCs w:val="20"/>
+        </w:rPr>
+        <w:t xml:space="preserve">soloSibeliusHardening.ts</w:t>
+      </w:r>
+      <w:r>
+        <w:t xml:space="preserve"> — harmony root sanitize · pitch clamp (inline + multiline </w:t>
+      </w:r>
+      <w:r>
+        <w:rPr>
+          <w:rFonts w:ascii="Consolas" w:cs="Consolas" w:eastAsia="Consolas" w:hAnsi="Consolas"/>
+          <w:sz w:val="20"/>
+          <w:szCs w:val="20"/>
+        </w:rPr>
+        <w:t xml:space="preserve">&lt;pitch&gt;</w:t>
+      </w:r>
+      <w:r>
+        <w:t xml:space="preserve">) · voice overflow trim · optional silence fill. Validator: </w:t>
+      </w:r>
+      <w:r>
+        <w:rPr>
+          <w:rFonts w:ascii="Consolas" w:cs="Consolas" w:eastAsia="Consolas" w:hAnsi="Consolas"/>
+          <w:sz w:val="20"/>
+          <w:szCs w:val="20"/>
+        </w:rPr>
+        <w:t xml:space="preserve">scripts/orbitSoloSibeliusValidate.ts</w:t>
+      </w:r>
+      <w:r>
+        <w:t xml:space="preserve">. Batch export runs hardening on all four solos automatically.</w:t>
+      </w:r>
+    </w:p>
+    <w:tbl>
+      <w:tblPr>
+        <w:tblW w:type="pct" w:w="100%"/>
+        <w:tblBorders>
+          <w:top w:val="single" w:color="auto" w:sz="4"/>
+          <w:left w:val="single" w:color="auto" w:sz="4"/>
+          <w:bottom w:val="single" w:color="auto" w:sz="4"/>
+          <w:right w:val="single" w:color="auto" w:sz="4"/>
+          <w:insideH w:val="single" w:color="auto" w:sz="4"/>
+          <w:insideV w:val="single" w:color="auto" w:sz="4"/>
+        </w:tblBorders>
+      </w:tblPr>
+      <w:tblGrid>
+        <w:gridCol w:w="3000"/>
+        <w:gridCol w:w="3000"/>
+        <w:gridCol w:w="3000"/>
+      </w:tblGrid>
+      <w:tr>
+        <w:tc>
+          <w:tcPr>
+            <w:tcW w:type="pct" w:w="3000%"/>
+            <w:shd w:fill="E8EEF4"/>
+          </w:tcPr>
+          <w:p>
+            <w:pPr>
+              <w:spacing w:after="60"/>
+            </w:pPr>
+            <w:r>
+              <w:t xml:space="preserve">Fix</w:t>
+            </w:r>
+          </w:p>
+        </w:tc>
+        <w:tc>
+          <w:tcPr>
+            <w:tcW w:type="pct" w:w="3000%"/>
+            <w:shd w:fill="E8EEF4"/>
+          </w:tcPr>
+          <w:p>
+            <w:pPr>
+              <w:spacing w:after="60"/>
+            </w:pPr>
+            <w:r>
+              <w:t xml:space="preserve">File</w:t>
+            </w:r>
+          </w:p>
+        </w:tc>
+        <w:tc>
+          <w:tcPr>
+            <w:tcW w:type="pct" w:w="3000%"/>
+            <w:shd w:fill="E8EEF4"/>
+          </w:tcPr>
+          <w:p>
+            <w:pPr>
+              <w:spacing w:after="60"/>
+            </w:pPr>
+            <w:r>
+              <w:t xml:space="preserve">Result</w:t>
+            </w:r>
+          </w:p>
+        </w:tc>
+      </w:tr>
+      <w:tr>
+        <w:tc>
+          <w:tcPr>
+            <w:tcW w:type="pct" w:w="3000%"/>
+          </w:tcPr>
+          <w:p>
+            <w:pPr>
+              <w:spacing w:after="60"/>
+            </w:pPr>
+            <w:r>
+              <w:t xml:space="preserve">4× B3→B4</w:t>
+            </w:r>
+          </w:p>
+        </w:tc>
+        <w:tc>
+          <w:tcPr>
+            <w:tcW w:type="pct" w:w="3000%"/>
+          </w:tcPr>
+          <w:p>
+            <w:pPr>
+              <w:spacing w:after="60"/>
+            </w:pPr>
+            <w:r>
+              <w:rPr>
+                <w:rFonts w:ascii="Consolas" w:cs="Consolas" w:eastAsia="Consolas" w:hAnsi="Consolas"/>
+                <w:sz w:val="20"/>
+                <w:szCs w:val="20"/>
+              </w:rPr>
+              <w:t xml:space="preserve">solo_01_tritonic</w:t>
+            </w:r>
+          </w:p>
+        </w:tc>
+        <w:tc>
+          <w:tcPr>
+            <w:tcW w:type="pct" w:w="3000%"/>
+          </w:tcPr>
+          <w:p>
+            <w:pPr>
+              <w:spacing w:after="60"/>
+            </w:pPr>
+            <w:r>
+              <w:t xml:space="preserve">CHECK 1–4 PASS</w:t>
+            </w:r>
+          </w:p>
+        </w:tc>
+      </w:tr>
+      <w:tr>
+        <w:tc>
+          <w:tcPr>
+            <w:tcW w:type="pct" w:w="3000%"/>
+          </w:tcPr>
+          <w:p>
+            <w:pPr>
+              <w:spacing w:after="60"/>
+            </w:pPr>
+            <w:r>
+              <w:t xml:space="preserve">285 pitches octave-shifted</w:t>
+            </w:r>
+          </w:p>
+        </w:tc>
+        <w:tc>
+          <w:tcPr>
+            <w:tcW w:type="pct" w:w="3000%"/>
+          </w:tcPr>
+          <w:p>
+            <w:pPr>
+              <w:spacing w:after="60"/>
+            </w:pPr>
+            <w:r>
+              <w:rPr>
+                <w:rFonts w:ascii="Consolas" w:cs="Consolas" w:eastAsia="Consolas" w:hAnsi="Consolas"/>
+                <w:sz w:val="20"/>
+                <w:szCs w:val="20"/>
+              </w:rPr>
+              <w:t xml:space="preserve">solo_02_vault_triad_pairs</w:t>
+            </w:r>
+          </w:p>
+        </w:tc>
+        <w:tc>
+          <w:tcPr>
+            <w:tcW w:type="pct" w:w="3000%"/>
+          </w:tcPr>
+          <w:p>
+            <w:pPr>
+              <w:spacing w:after="60"/>
+            </w:pPr>
+            <w:r>
+              <w:t xml:space="preserve">CHECK 1–4 PASS</w:t>
+            </w:r>
+          </w:p>
+        </w:tc>
+      </w:tr>
+      <w:tr>
+        <w:tc>
+          <w:tcPr>
+            <w:tcW w:type="pct" w:w="3000%"/>
+          </w:tcPr>
+          <w:p>
+            <w:pPr>
+              <w:spacing w:after="60"/>
+            </w:pPr>
+            <w:r>
+              <w:t xml:space="preserve">Sub-C4 clamp + bar-1 trim </w:t>
+            </w:r>
+            <w:r>
+              <w:rPr>
+                <w:b/>
+                <w:bCs/>
+              </w:rPr>
+              <w:t xml:space="preserve">361→353</w:t>
+            </w:r>
+          </w:p>
+        </w:tc>
+        <w:tc>
+          <w:tcPr>
+            <w:tcW w:type="pct" w:w="3000%"/>
+          </w:tcPr>
+          <w:p>
+            <w:pPr>
+              <w:spacing w:after="60"/>
+            </w:pPr>
+            <w:r>
+              <w:rPr>
+                <w:rFonts w:ascii="Consolas" w:cs="Consolas" w:eastAsia="Consolas" w:hAnsi="Consolas"/>
+                <w:sz w:val="20"/>
+                <w:szCs w:val="20"/>
+              </w:rPr>
+              <w:t xml:space="preserve">solo_03_martino_linear</w:t>
+            </w:r>
+          </w:p>
+        </w:tc>
+        <w:tc>
+          <w:tcPr>
+            <w:tcW w:type="pct" w:w="3000%"/>
+          </w:tcPr>
+          <w:p>
+            <w:pPr>
+              <w:spacing w:after="60"/>
+            </w:pPr>
+            <w:r>
+              <w:t xml:space="preserve">CHECK 1–4 PASS</w:t>
+            </w:r>
+          </w:p>
+        </w:tc>
+      </w:tr>
+      <w:tr>
+        <w:tc>
+          <w:tcPr>
+            <w:tcW w:type="pct" w:w="3000%"/>
+          </w:tcPr>
+          <w:p>
+            <w:pPr>
+              <w:spacing w:after="60"/>
+            </w:pPr>
+            <w:r>
+              <w:t xml:space="preserve">No change</w:t>
+            </w:r>
+          </w:p>
+        </w:tc>
+        <w:tc>
+          <w:tcPr>
+            <w:tcW w:type="pct" w:w="3000%"/>
+          </w:tcPr>
+          <w:p>
+            <w:pPr>
+              <w:spacing w:after="60"/>
+            </w:pPr>
+            <w:r>
+              <w:rPr>
+                <w:rFonts w:ascii="Consolas" w:cs="Consolas" w:eastAsia="Consolas" w:hAnsi="Consolas"/>
+                <w:sz w:val="20"/>
+                <w:szCs w:val="20"/>
+              </w:rPr>
+              <w:t xml:space="preserve">solo_04_zappa</w:t>
+            </w:r>
+          </w:p>
+        </w:tc>
+        <w:tc>
+          <w:tcPr>
+            <w:tcW w:type="pct" w:w="3000%"/>
+          </w:tcPr>
+          <w:p>
+            <w:pPr>
+              <w:spacing w:after="60"/>
+            </w:pPr>
+            <w:r>
+              <w:t xml:space="preserve">CHECK 1–4 PASS</w:t>
+            </w:r>
+          </w:p>
+        </w:tc>
+      </w:tr>
+    </w:tbl>
+    <w:p>
+      <w:pPr>
+        <w:spacing w:after="160"/>
+      </w:pPr>
+    </w:p>
+    <w:p>
+      <w:pPr>
+        <w:spacing w:after="160"/>
+      </w:pPr>
+      <w:r>
+        <w:t xml:space="preserve">All four files: </w:t>
+      </w:r>
+      <w:r>
+        <w:rPr>
+          <w:b/>
+          <w:bCs/>
+        </w:rPr>
+        <w:t xml:space="preserve">integrity PASS</w:t>
+      </w:r>
+      <w:r>
+        <w:t xml:space="preserve"> · </w:t>
       </w:r>
       <w:r>
         <w:rPr>

</xml_diff>

<commit_message>
fix(orbit): MusicXML type/dot/divisions hardening for Sibelius (v1.7p11)
Normalize all four Orbit solos to divisions=480, write explicit note types and dot markers, and validate duration/type consistency before export.

Co-authored-by: Cursor <cursoragent@cursor.com>
</commit_message>
<xml_diff>
--- a/docs/COMPOSER_HANDBOOK.docx
+++ b/docs/COMPOSER_HANDBOOK.docx
@@ -6869,7 +6869,7 @@
         <w:spacing w:after="80" w:before="140"/>
       </w:pPr>
       <w:r>
-        <w:t xml:space="preserve">Orbit 28-bar solo export (v1.7p4–p7)</w:t>
+        <w:t xml:space="preserve">Orbit 28-bar solo export (v1.7p4–p11)</w:t>
       </w:r>
     </w:p>
     <w:p>
@@ -7167,6 +7167,255 @@
     </w:p>
     <w:p>
       <w:pPr>
+        <w:pStyle w:val="Heading4"/>
+        <w:spacing w:after="60" w:before="100"/>
+      </w:pPr>
+      <w:r>
+        <w:t xml:space="preserve">ORBIT SOLO BATCH EXPORT — WHAT WAS FIXED (v1.7p11)</w:t>
+      </w:r>
+    </w:p>
+    <w:p>
+      <w:pPr>
+        <w:spacing w:after="160"/>
+      </w:pPr>
+      <w:r>
+        <w:rPr>
+          <w:b/>
+          <w:bCs/>
+        </w:rPr>
+        <w:t xml:space="preserve">The Problem</w:t>
+      </w:r>
+    </w:p>
+    <w:p>
+      <w:pPr>
+        <w:spacing w:after="160"/>
+      </w:pPr>
+      <w:r>
+        <w:t xml:space="preserve">All four solo files were opening in Sibelius with incorrect bar lengths — notes and rests were not grouping correctly into 4/4 bars. The music looked wrong on the page even though the files were passing internal tests.</w:t>
+      </w:r>
+    </w:p>
+    <w:p>
+      <w:pPr>
+        <w:spacing w:after="160"/>
+      </w:pPr>
+      <w:r>
+        <w:rPr>
+          <w:b/>
+          <w:bCs/>
+        </w:rPr>
+        <w:t xml:space="preserve">Why It Happened</w:t>
+      </w:r>
+    </w:p>
+    <w:p>
+      <w:pPr>
+        <w:spacing w:after="160"/>
+      </w:pPr>
+      <w:r>
+        <w:t xml:space="preserve">MusicXML files contain two separate pieces of information for every note: the duration (how many time units long the note is) and the type (whether it is a quarter, eighth, dotted quarter, etc.). Sibelius uses the TYPE to draw the note on the page, not the duration number. Our export pipeline was writing the duration correctly but not always including the type — so Sibelius was guessing, and guessing wrong.</w:t>
+      </w:r>
+    </w:p>
+    <w:p>
+      <w:pPr>
+        <w:spacing w:after="160"/>
+      </w:pPr>
+      <w:r>
+        <w:t xml:space="preserve">A second problem was that dotted notes were missing their dot instruction in the file. A dotted quarter at 720 units needs an explicit dot marker — without it, Sibelius reads it as a plain quarter and the bar comes up short.</w:t>
+      </w:r>
+    </w:p>
+    <w:p>
+      <w:pPr>
+        <w:spacing w:after="160"/>
+      </w:pPr>
+      <w:r>
+        <w:t xml:space="preserve">A third problem was the Martino engine using a different internal time grid (divisions=2) from the other three engines (divisions=480). This caused Sibelius to misread all Martino bar lengths from bar 2 onwards.</w:t>
+      </w:r>
+    </w:p>
+    <w:p>
+      <w:pPr>
+        <w:spacing w:after="160"/>
+      </w:pPr>
+      <w:r>
+        <w:rPr>
+          <w:b/>
+          <w:bCs/>
+        </w:rPr>
+        <w:t xml:space="preserve">What Was Fixed</w:t>
+      </w:r>
+    </w:p>
+    <w:p>
+      <w:pPr>
+        <w:spacing w:after="80"/>
+        <w:ind w:left="360" w:hanging="260"/>
+      </w:pPr>
+      <w:r>
+        <w:t xml:space="preserve">All four engines now use divisions=480 — one universal time grid throughout all files</w:t>
+      </w:r>
+    </w:p>
+    <w:p>
+      <w:pPr>
+        <w:spacing w:after="80"/>
+        <w:ind w:left="360" w:hanging="260"/>
+      </w:pPr>
+      <w:r>
+        <w:t xml:space="preserve">Every note and rest now carries an explicit type (quarter, eighth, half, whole)</w:t>
+      </w:r>
+    </w:p>
+    <w:p>
+      <w:pPr>
+        <w:spacing w:after="80"/>
+        <w:ind w:left="360" w:hanging="260"/>
+      </w:pPr>
+      <w:r>
+        <w:t xml:space="preserve">Every dotted note now carries an explicit dot marker so Sibelius draws it correctly</w:t>
+      </w:r>
+    </w:p>
+    <w:p>
+      <w:pPr>
+        <w:spacing w:after="80"/>
+        <w:ind w:left="360" w:hanging="260"/>
+      </w:pPr>
+      <w:r>
+        <w:t xml:space="preserve">A new validation gate checks type/dot/duration consistency on every note before any file is written — the export will throw an error rather than produce a file Sibelius cannot read</w:t>
+      </w:r>
+    </w:p>
+    <w:p>
+      <w:pPr>
+        <w:spacing w:after="160"/>
+      </w:pPr>
+      <w:r>
+        <w:rPr>
+          <w:b/>
+          <w:bCs/>
+        </w:rPr>
+        <w:t xml:space="preserve">Result</w:t>
+      </w:r>
+    </w:p>
+    <w:p>
+      <w:pPr>
+        <w:spacing w:after="160"/>
+      </w:pPr>
+      <w:r>
+        <w:t xml:space="preserve">All four solo files now open in Sibelius with clean 4/4 bar groupings, correct note values, and no import warnings. The files are ready for use in the Orbit big band arrangement.</w:t>
+      </w:r>
+    </w:p>
+    <w:p>
+      <w:pPr>
+        <w:spacing w:after="160"/>
+      </w:pPr>
+      <w:r>
+        <w:rPr>
+          <w:b/>
+          <w:bCs/>
+        </w:rPr>
+        <w:t xml:space="preserve">The Four Solos — Current State</w:t>
+      </w:r>
+    </w:p>
+    <w:p>
+      <w:pPr>
+        <w:spacing w:after="80"/>
+        <w:ind w:left="360" w:hanging="260"/>
+      </w:pPr>
+      <w:r>
+        <w:t xml:space="preserve">• </w:t>
+      </w:r>
+      <w:r>
+        <w:rPr>
+          <w:rFonts w:ascii="Consolas" w:cs="Consolas" w:eastAsia="Consolas" w:hAnsi="Consolas"/>
+          <w:sz w:val="20"/>
+          <w:szCs w:val="20"/>
+        </w:rPr>
+        <w:t xml:space="preserve">solo_01_tritonic.musicxml</w:t>
+      </w:r>
+      <w:r>
+        <w:t xml:space="preserve"> — Floating chromatic cells, syncopated, spacious</w:t>
+      </w:r>
+    </w:p>
+    <w:p>
+      <w:pPr>
+        <w:spacing w:after="80"/>
+        <w:ind w:left="360" w:hanging="260"/>
+      </w:pPr>
+      <w:r>
+        <w:t xml:space="preserve">• </w:t>
+      </w:r>
+      <w:r>
+        <w:rPr>
+          <w:rFonts w:ascii="Consolas" w:cs="Consolas" w:eastAsia="Consolas" w:hAnsi="Consolas"/>
+          <w:sz w:val="20"/>
+          <w:szCs w:val="20"/>
+        </w:rPr>
+        <w:t xml:space="preserve">solo_02_vault_triad_pairs.musicxml</w:t>
+      </w:r>
+      <w:r>
+        <w:t xml:space="preserve"> — Arpeggiated upper structure triads, lyrical</w:t>
+      </w:r>
+    </w:p>
+    <w:p>
+      <w:pPr>
+        <w:spacing w:after="80"/>
+        <w:ind w:left="360" w:hanging="260"/>
+      </w:pPr>
+      <w:r>
+        <w:t xml:space="preserve">• </w:t>
+      </w:r>
+      <w:r>
+        <w:rPr>
+          <w:rFonts w:ascii="Consolas" w:cs="Consolas" w:eastAsia="Consolas" w:hAnsi="Consolas"/>
+          <w:sz w:val="20"/>
+          <w:szCs w:val="20"/>
+        </w:rPr>
+        <w:t xml:space="preserve">solo_03_martino_linear.musicxml</w:t>
+      </w:r>
+      <w:r>
+        <w:t xml:space="preserve"> — Linear eighth-note lines with phrase gaps</w:t>
+      </w:r>
+    </w:p>
+    <w:p>
+      <w:pPr>
+        <w:spacing w:after="80"/>
+        <w:ind w:left="360" w:hanging="260"/>
+      </w:pPr>
+      <w:r>
+        <w:t xml:space="preserve">• </w:t>
+      </w:r>
+      <w:r>
+        <w:rPr>
+          <w:rFonts w:ascii="Consolas" w:cs="Consolas" w:eastAsia="Consolas" w:hAnsi="Consolas"/>
+          <w:sz w:val="20"/>
+          <w:szCs w:val="20"/>
+        </w:rPr>
+        <w:t xml:space="preserve">solo_04_zappa.musicxml</w:t>
+      </w:r>
+      <w:r>
+        <w:t xml:space="preserve"> — Dramatic, sparse, unexpected phrase lengths</w:t>
+      </w:r>
+    </w:p>
+    <w:p>
+      <w:pPr>
+        <w:spacing w:after="160"/>
+      </w:pPr>
+      <w:r>
+        <w:t xml:space="preserve">All solos: 28 bars, 4/4, 90 BPM, concert pitch C</w:t>
+      </w:r>
+    </w:p>
+    <w:p>
+      <w:pPr>
+        <w:spacing w:after="160"/>
+      </w:pPr>
+      <w:r>
+        <w:t xml:space="preserve">Output: </w:t>
+      </w:r>
+      <w:r>
+        <w:rPr>
+          <w:rFonts w:ascii="Consolas" w:cs="Consolas" w:eastAsia="Consolas" w:hAnsi="Consolas"/>
+          <w:sz w:val="20"/>
+          <w:szCs w:val="20"/>
+        </w:rPr>
+        <w:t xml:space="preserve">Mike Composer Files\Orbit Big Band\Orbit-Solos\</w:t>
+      </w:r>
+    </w:p>
+    <w:p>
+      <w:pPr>
         <w:spacing w:after="160"/>
       </w:pPr>
       <w:r>
@@ -7301,7 +7550,7 @@
           <w:b/>
           <w:bCs/>
         </w:rPr>
-        <w:t xml:space="preserve">v1.7p7 — Pre-Sibelius hardening:</w:t>
+        <w:t xml:space="preserve">v1.7p8 — Musicality pass (GCE):</w:t>
       </w:r>
       <w:r>
         <w:t xml:space="preserve"> </w:t>
@@ -7312,53 +7561,82 @@
           <w:sz w:val="20"/>
           <w:szCs w:val="20"/>
         </w:rPr>
-        <w:t xml:space="preserve">soloTreblePitchRange.ts</w:t>
-      </w:r>
-      <w:r>
-        <w:t xml:space="preserve"> — treble concert range </w:t>
-      </w:r>
-      <w:r>
-        <w:rPr>
-          <w:b/>
-          <w:bCs/>
-        </w:rPr>
-        <w:t xml:space="preserve">C4–G6</w:t>
-      </w:r>
-      <w:r>
-        <w:t xml:space="preserve"> (MIDI 60–91). </w:t>
-      </w:r>
-      <w:r>
-        <w:rPr>
-          <w:rFonts w:ascii="Consolas" w:cs="Consolas" w:eastAsia="Consolas" w:hAnsi="Consolas"/>
-          <w:sz w:val="20"/>
-          <w:szCs w:val="20"/>
-        </w:rPr>
-        <w:t xml:space="preserve">soloSibeliusHardening.ts</w:t>
-      </w:r>
-      <w:r>
-        <w:t xml:space="preserve"> — harmony root sanitize · pitch clamp (inline + multiline </w:t>
-      </w:r>
-      <w:r>
-        <w:rPr>
-          <w:rFonts w:ascii="Consolas" w:cs="Consolas" w:eastAsia="Consolas" w:hAnsi="Consolas"/>
-          <w:sz w:val="20"/>
-          <w:szCs w:val="20"/>
-        </w:rPr>
-        <w:t xml:space="preserve">&lt;pitch&gt;</w:t>
-      </w:r>
-      <w:r>
-        <w:t xml:space="preserve">) · voice overflow trim · optional silence fill. Validator: </w:t>
-      </w:r>
-      <w:r>
-        <w:rPr>
-          <w:rFonts w:ascii="Consolas" w:cs="Consolas" w:eastAsia="Consolas" w:hAnsi="Consolas"/>
-          <w:sz w:val="20"/>
-          <w:szCs w:val="20"/>
-        </w:rPr>
-        <w:t xml:space="preserve">scripts/orbitSoloSibeliusValidate.ts</w:t>
-      </w:r>
-      <w:r>
-        <w:t xml:space="preserve">. Batch export runs hardening on all four solos automatically.</w:t>
+        <w:t xml:space="preserve">soloMusicality.ts</w:t>
+      </w:r>
+      <w:r>
+        <w:t xml:space="preserve"> + </w:t>
+      </w:r>
+      <w:r>
+        <w:rPr>
+          <w:rFonts w:ascii="Consolas" w:cs="Consolas" w:eastAsia="Consolas" w:hAnsi="Consolas"/>
+          <w:sz w:val="20"/>
+          <w:szCs w:val="20"/>
+        </w:rPr>
+        <w:t xml:space="preserve">soloMusicalityXml.ts</w:t>
+      </w:r>
+      <w:r>
+        <w:t xml:space="preserve"> — monophonic </w:t>
+      </w:r>
+      <w:r>
+        <w:rPr>
+          <w:b/>
+          <w:bCs/>
+        </w:rPr>
+        <w:t xml:space="preserve">D4–D6</w:t>
+      </w:r>
+      <w:r>
+        <w:t xml:space="preserve"> · min </w:t>
+      </w:r>
+      <w:r>
+        <w:rPr>
+          <w:b/>
+          <w:bCs/>
+        </w:rPr>
+        <w:t xml:space="preserve">eighth</w:t>
+      </w:r>
+      <w:r>
+        <w:t xml:space="preserve"> · phrase breath · </w:t>
+      </w:r>
+      <w:r>
+        <w:rPr>
+          <w:b/>
+          <w:bCs/>
+        </w:rPr>
+        <w:t xml:space="preserve">`orbitSoloMusicality.test.ts`</w:t>
+      </w:r>
+      <w:r>
+        <w:t xml:space="preserve"> </w:t>
+      </w:r>
+      <w:r>
+        <w:rPr>
+          <w:b/>
+          <w:bCs/>
+        </w:rPr>
+        <w:t xml:space="preserve">28/28</w:t>
+      </w:r>
+      <w:r>
+        <w:t xml:space="preserve"> (7 GCE criteria × 4 solos). Vault: monophonic triad-pair upward arpeggio (</w:t>
+      </w:r>
+      <w:r>
+        <w:rPr>
+          <w:rFonts w:ascii="Consolas" w:cs="Consolas" w:eastAsia="Consolas" w:hAnsi="Consolas"/>
+          <w:sz w:val="20"/>
+          <w:szCs w:val="20"/>
+        </w:rPr>
+        <w:t xml:space="preserve">vaultSoloMonophonic.ts</w:t>
+      </w:r>
+      <w:r>
+        <w:t xml:space="preserve">). Tritonic: </w:t>
+      </w:r>
+      <w:r>
+        <w:rPr>
+          <w:b/>
+          <w:bCs/>
+        </w:rPr>
+        <w:t xml:space="preserve">3–5</w:t>
+      </w:r>
+      <w:r>
+        <w:t xml:space="preserve"> notes/bar floating cells (no 16ths). Martino: breath rests + rhythm variety + harmony snap. Zappa: note-timeline export with musicality clamp.</w:t>
       </w:r>
     </w:p>
     <w:tbl>
@@ -7389,7 +7667,7 @@
               <w:spacing w:after="60"/>
             </w:pPr>
             <w:r>
-              <w:t xml:space="preserve">Fix</w:t>
+              <w:t xml:space="preserve">File</w:t>
             </w:r>
           </w:p>
         </w:tc>
@@ -7403,7 +7681,7 @@
               <w:spacing w:after="60"/>
             </w:pPr>
             <w:r>
-              <w:t xml:space="preserve">File</w:t>
+              <w:t xml:space="preserve">Notes (v1.7p8)</w:t>
             </w:r>
           </w:p>
         </w:tc>
@@ -7417,25 +7695,12 @@
               <w:spacing w:after="60"/>
             </w:pPr>
             <w:r>
-              <w:t xml:space="preserve">Result</w:t>
+              <w:t xml:space="preserve">GCE</w:t>
             </w:r>
           </w:p>
         </w:tc>
       </w:tr>
       <w:tr>
-        <w:tc>
-          <w:tcPr>
-            <w:tcW w:type="pct" w:w="3000%"/>
-          </w:tcPr>
-          <w:p>
-            <w:pPr>
-              <w:spacing w:after="60"/>
-            </w:pPr>
-            <w:r>
-              <w:t xml:space="preserve">4× B3→B4</w:t>
-            </w:r>
-          </w:p>
-        </w:tc>
         <w:tc>
           <w:tcPr>
             <w:tcW w:type="pct" w:w="3000%"/>
@@ -7463,25 +7728,29 @@
               <w:spacing w:after="60"/>
             </w:pPr>
             <w:r>
-              <w:t xml:space="preserve">CHECK 1–4 PASS</w:t>
+              <w:rPr>
+                <w:b/>
+                <w:bCs/>
+              </w:rPr>
+              <w:t xml:space="preserve">65</w:t>
+            </w:r>
+          </w:p>
+        </w:tc>
+        <w:tc>
+          <w:tcPr>
+            <w:tcW w:type="pct" w:w="3000%"/>
+          </w:tcPr>
+          <w:p>
+            <w:pPr>
+              <w:spacing w:after="60"/>
+            </w:pPr>
+            <w:r>
+              <w:t xml:space="preserve">7/7 PASS</w:t>
             </w:r>
           </w:p>
         </w:tc>
       </w:tr>
       <w:tr>
-        <w:tc>
-          <w:tcPr>
-            <w:tcW w:type="pct" w:w="3000%"/>
-          </w:tcPr>
-          <w:p>
-            <w:pPr>
-              <w:spacing w:after="60"/>
-            </w:pPr>
-            <w:r>
-              <w:t xml:space="preserve">285 pitches octave-shifted</w:t>
-            </w:r>
-          </w:p>
-        </w:tc>
         <w:tc>
           <w:tcPr>
             <w:tcW w:type="pct" w:w="3000%"/>
@@ -7509,32 +7778,29 @@
               <w:spacing w:after="60"/>
             </w:pPr>
             <w:r>
-              <w:t xml:space="preserve">CHECK 1–4 PASS</w:t>
-            </w:r>
-          </w:p>
-        </w:tc>
-      </w:tr>
-      <w:tr>
-        <w:tc>
-          <w:tcPr>
-            <w:tcW w:type="pct" w:w="3000%"/>
-          </w:tcPr>
-          <w:p>
-            <w:pPr>
-              <w:spacing w:after="60"/>
-            </w:pPr>
-            <w:r>
-              <w:t xml:space="preserve">Sub-C4 clamp + bar-1 trim </w:t>
-            </w:r>
-            <w:r>
               <w:rPr>
                 <w:b/>
                 <w:bCs/>
               </w:rPr>
-              <w:t xml:space="preserve">361→353</w:t>
-            </w:r>
-          </w:p>
-        </w:tc>
+              <w:t xml:space="preserve">58</w:t>
+            </w:r>
+          </w:p>
+        </w:tc>
+        <w:tc>
+          <w:tcPr>
+            <w:tcW w:type="pct" w:w="3000%"/>
+          </w:tcPr>
+          <w:p>
+            <w:pPr>
+              <w:spacing w:after="60"/>
+            </w:pPr>
+            <w:r>
+              <w:t xml:space="preserve">7/7 PASS</w:t>
+            </w:r>
+          </w:p>
+        </w:tc>
+      </w:tr>
+      <w:tr>
         <w:tc>
           <w:tcPr>
             <w:tcW w:type="pct" w:w="3000%"/>
@@ -7562,25 +7828,29 @@
               <w:spacing w:after="60"/>
             </w:pPr>
             <w:r>
-              <w:t xml:space="preserve">CHECK 1–4 PASS</w:t>
+              <w:rPr>
+                <w:b/>
+                <w:bCs/>
+              </w:rPr>
+              <w:t xml:space="preserve">77</w:t>
+            </w:r>
+          </w:p>
+        </w:tc>
+        <w:tc>
+          <w:tcPr>
+            <w:tcW w:type="pct" w:w="3000%"/>
+          </w:tcPr>
+          <w:p>
+            <w:pPr>
+              <w:spacing w:after="60"/>
+            </w:pPr>
+            <w:r>
+              <w:t xml:space="preserve">7/7 PASS</w:t>
             </w:r>
           </w:p>
         </w:tc>
       </w:tr>
       <w:tr>
-        <w:tc>
-          <w:tcPr>
-            <w:tcW w:type="pct" w:w="3000%"/>
-          </w:tcPr>
-          <w:p>
-            <w:pPr>
-              <w:spacing w:after="60"/>
-            </w:pPr>
-            <w:r>
-              <w:t xml:space="preserve">No change</w:t>
-            </w:r>
-          </w:p>
-        </w:tc>
         <w:tc>
           <w:tcPr>
             <w:tcW w:type="pct" w:w="3000%"/>
@@ -7608,7 +7878,24 @@
               <w:spacing w:after="60"/>
             </w:pPr>
             <w:r>
-              <w:t xml:space="preserve">CHECK 1–4 PASS</w:t>
+              <w:rPr>
+                <w:b/>
+                <w:bCs/>
+              </w:rPr>
+              <w:t xml:space="preserve">49</w:t>
+            </w:r>
+          </w:p>
+        </w:tc>
+        <w:tc>
+          <w:tcPr>
+            <w:tcW w:type="pct" w:w="3000%"/>
+          </w:tcPr>
+          <w:p>
+            <w:pPr>
+              <w:spacing w:after="60"/>
+            </w:pPr>
+            <w:r>
+              <w:t xml:space="preserve">7/7 PASS</w:t>
             </w:r>
           </w:p>
         </w:tc>
@@ -7624,37 +7911,68 @@
         <w:spacing w:after="160"/>
       </w:pPr>
       <w:r>
-        <w:t xml:space="preserve">All four files: </w:t>
-      </w:r>
-      <w:r>
-        <w:rPr>
-          <w:b/>
-          <w:bCs/>
-        </w:rPr>
-        <w:t xml:space="preserve">integrity PASS</w:t>
-      </w:r>
-      <w:r>
-        <w:t xml:space="preserve"> · </w:t>
-      </w:r>
-      <w:r>
-        <w:rPr>
-          <w:b/>
-          <w:bCs/>
-        </w:rPr>
-        <w:t xml:space="preserve">`orbitSoloBatchExport.test.ts`:</w:t>
+        <w:rPr>
+          <w:b/>
+          <w:bCs/>
+        </w:rPr>
+        <w:t xml:space="preserve">v1.7p7 — Pre-Sibelius hardening:</w:t>
       </w:r>
       <w:r>
         <w:t xml:space="preserve"> </w:t>
       </w:r>
       <w:r>
         <w:rPr>
-          <w:b/>
-          <w:bCs/>
-        </w:rPr>
-        <w:t xml:space="preserve">8/8</w:t>
-      </w:r>
-      <w:r>
-        <w:t xml:space="preserve"> PASS.</w:t>
+          <w:rFonts w:ascii="Consolas" w:cs="Consolas" w:eastAsia="Consolas" w:hAnsi="Consolas"/>
+          <w:sz w:val="20"/>
+          <w:szCs w:val="20"/>
+        </w:rPr>
+        <w:t xml:space="preserve">soloTreblePitchRange.ts</w:t>
+      </w:r>
+      <w:r>
+        <w:t xml:space="preserve"> — treble concert range </w:t>
+      </w:r>
+      <w:r>
+        <w:rPr>
+          <w:b/>
+          <w:bCs/>
+        </w:rPr>
+        <w:t xml:space="preserve">C4–G6</w:t>
+      </w:r>
+      <w:r>
+        <w:t xml:space="preserve"> (MIDI 60–91). </w:t>
+      </w:r>
+      <w:r>
+        <w:rPr>
+          <w:rFonts w:ascii="Consolas" w:cs="Consolas" w:eastAsia="Consolas" w:hAnsi="Consolas"/>
+          <w:sz w:val="20"/>
+          <w:szCs w:val="20"/>
+        </w:rPr>
+        <w:t xml:space="preserve">soloSibeliusHardening.ts</w:t>
+      </w:r>
+      <w:r>
+        <w:t xml:space="preserve"> — harmony root sanitize · pitch clamp (inline + multiline </w:t>
+      </w:r>
+      <w:r>
+        <w:rPr>
+          <w:rFonts w:ascii="Consolas" w:cs="Consolas" w:eastAsia="Consolas" w:hAnsi="Consolas"/>
+          <w:sz w:val="20"/>
+          <w:szCs w:val="20"/>
+        </w:rPr>
+        <w:t xml:space="preserve">&lt;pitch&gt;</w:t>
+      </w:r>
+      <w:r>
+        <w:t xml:space="preserve">) · voice overflow trim · optional silence fill. Validator: </w:t>
+      </w:r>
+      <w:r>
+        <w:rPr>
+          <w:rFonts w:ascii="Consolas" w:cs="Consolas" w:eastAsia="Consolas" w:hAnsi="Consolas"/>
+          <w:sz w:val="20"/>
+          <w:szCs w:val="20"/>
+        </w:rPr>
+        <w:t xml:space="preserve">scripts/orbitSoloSibeliusValidate.ts</w:t>
+      </w:r>
+      <w:r>
+        <w:t xml:space="preserve">. Batch export runs hardening on all four solos automatically.</w:t>
       </w:r>
     </w:p>
     <w:p>

</xml_diff>

<commit_message>
V83 three-way reharm auto-test + MusicXML offset schema fix + schema validation; log wayne_shorter export bug
Co-authored-by: Cursor <cursoragent@cursor.com>
</commit_message>
<xml_diff>
--- a/docs/COMPOSER_HANDBOOK.docx
+++ b/docs/COMPOSER_HANDBOOK.docx
@@ -13387,6 +13387,136 @@
           <w:bCs/>
         </w:rPr>
         <w:t xml:space="preserve">`docs/BH_QUICK_GUIDE.md`</w:t>
+      </w:r>
+    </w:p>
+    <w:p>
+      <w:pPr>
+        <w:spacing w:after="160"/>
+      </w:pPr>
+      <w:r>
+        <w:rPr>
+          <w:b/>
+          <w:bCs/>
+        </w:rPr>
+        <w:t xml:space="preserve">Three-way reharm comparison test (V83):</w:t>
+      </w:r>
+      <w:r>
+        <w:t xml:space="preserve"> Script </w:t>
+      </w:r>
+      <w:r>
+        <w:rPr>
+          <w:b/>
+          <w:bCs/>
+        </w:rPr>
+        <w:t xml:space="preserve">`engines/composer-os-v2/scripts/runV83ThreeWayReharmAutoTest.ts`</w:t>
+      </w:r>
+      <w:r>
+        <w:t xml:space="preserve"> feeds one benchmark melody (</w:t>
+      </w:r>
+      <w:r>
+        <w:rPr>
+          <w:rFonts w:ascii="Consolas" w:cs="Consolas" w:eastAsia="Consolas" w:hAnsi="Consolas"/>
+          <w:sz w:val="20"/>
+          <w:szCs w:val="20"/>
+        </w:rPr>
+        <w:t xml:space="preserve">BH_Benchmark_JazzMelody.musicxml</w:t>
+      </w:r>
+      <w:r>
+        <w:t xml:space="preserve">) through three style-transfer composers (</w:t>
+      </w:r>
+      <w:r>
+        <w:rPr>
+          <w:b/>
+          <w:bCs/>
+        </w:rPr>
+        <w:t xml:space="preserve">Barry Harris</w:t>
+      </w:r>
+      <w:r>
+        <w:t xml:space="preserve">, </w:t>
+      </w:r>
+      <w:r>
+        <w:rPr>
+          <w:b/>
+          <w:bCs/>
+        </w:rPr>
+        <w:t xml:space="preserve">Radiohead</w:t>
+      </w:r>
+      <w:r>
+        <w:t xml:space="preserve">, </w:t>
+      </w:r>
+      <w:r>
+        <w:rPr>
+          <w:b/>
+          <w:bCs/>
+        </w:rPr>
+        <w:t xml:space="preserve">Robert Fripp</w:t>
+      </w:r>
+      <w:r>
+        <w:t xml:space="preserve"> / registry id </w:t>
+      </w:r>
+      <w:r>
+        <w:rPr>
+          <w:rFonts w:ascii="Consolas" w:cs="Consolas" w:eastAsia="Consolas" w:hAnsi="Consolas"/>
+          <w:sz w:val="20"/>
+          <w:szCs w:val="20"/>
+        </w:rPr>
+        <w:t xml:space="preserve">fripp</w:t>
+      </w:r>
+      <w:r>
+        <w:t xml:space="preserve">) and writes side-by-side MusicXML to your </w:t>
+      </w:r>
+      <w:r>
+        <w:rPr>
+          <w:b/>
+          <w:bCs/>
+        </w:rPr>
+        <w:t xml:space="preserve">Song Mode</w:t>
+      </w:r>
+      <w:r>
+        <w:t xml:space="preserve"> folder. The test asserts melody lock, real reharm (not pass-through), pairwise harmonic contrast, and </w:t>
+      </w:r>
+      <w:r>
+        <w:rPr>
+          <w:b/>
+          <w:bCs/>
+        </w:rPr>
+        <w:t xml:space="preserve">MusicXML schema validity</w:t>
+      </w:r>
+      <w:r>
+        <w:t xml:space="preserve"> (including no out-of-scope </w:t>
+      </w:r>
+      <w:r>
+        <w:rPr>
+          <w:rFonts w:ascii="Consolas" w:cs="Consolas" w:eastAsia="Consolas" w:hAnsi="Consolas"/>
+          <w:sz w:val="20"/>
+          <w:szCs w:val="20"/>
+        </w:rPr>
+        <w:t xml:space="preserve">&lt;offset&gt;</w:t>
+      </w:r>
+      <w:r>
+        <w:t xml:space="preserve"> inside </w:t>
+      </w:r>
+      <w:r>
+        <w:rPr>
+          <w:rFonts w:ascii="Consolas" w:cs="Consolas" w:eastAsia="Consolas" w:hAnsi="Consolas"/>
+          <w:sz w:val="20"/>
+          <w:szCs w:val="20"/>
+        </w:rPr>
+        <w:t xml:space="preserve">&lt;harmony&gt;</w:t>
+      </w:r>
+      <w:r>
+        <w:t xml:space="preserve"> — Sibelius-safe). Run: </w:t>
+      </w:r>
+      <w:r>
+        <w:rPr>
+          <w:rFonts w:ascii="Consolas" w:cs="Consolas" w:eastAsia="Consolas" w:hAnsi="Consolas"/>
+          <w:sz w:val="20"/>
+          <w:szCs w:val="20"/>
+        </w:rPr>
+        <w:t xml:space="preserve">npx tsx --tsconfig tsconfig.json engines/composer-os-v2/scripts/runV83ThreeWayReharmAutoTest.ts</w:t>
+      </w:r>
+      <w:r>
+        <w:t xml:space="preserve">.</w:t>
       </w:r>
     </w:p>
     <w:p>

</xml_diff>

<commit_message>
V83c notation quality: feel text + chord symbols above staff, measure-1 order, MusicXML schema validators
Co-authored-by: Cursor <cursoragent@cursor.com>
</commit_message>
<xml_diff>
--- a/docs/COMPOSER_HANDBOOK.docx
+++ b/docs/COMPOSER_HANDBOOK.docx
@@ -13517,6 +13517,105 @@
       </w:r>
       <w:r>
         <w:t xml:space="preserve">.</w:t>
+      </w:r>
+    </w:p>
+    <w:p>
+      <w:pPr>
+        <w:spacing w:after="160"/>
+      </w:pPr>
+      <w:r>
+        <w:rPr>
+          <w:b/>
+          <w:bCs/>
+        </w:rPr>
+        <w:t xml:space="preserve">MusicXML export notation (V83c):</w:t>
+      </w:r>
+      <w:r>
+        <w:t xml:space="preserve"> Shareable exports now place </w:t>
+      </w:r>
+      <w:r>
+        <w:rPr>
+          <w:b/>
+          <w:bCs/>
+        </w:rPr>
+        <w:t xml:space="preserve">feel/tempo</w:t>
+      </w:r>
+      <w:r>
+        <w:t xml:space="preserve"> and </w:t>
+      </w:r>
+      <w:r>
+        <w:rPr>
+          <w:b/>
+          <w:bCs/>
+        </w:rPr>
+        <w:t xml:space="preserve">chord symbols</w:t>
+      </w:r>
+      <w:r>
+        <w:t xml:space="preserve"> </w:t>
+      </w:r>
+      <w:r>
+        <w:rPr>
+          <w:b/>
+          <w:bCs/>
+        </w:rPr>
+        <w:t xml:space="preserve">above the staff</w:t>
+      </w:r>
+      <w:r>
+        <w:t xml:space="preserve"> — italic feel text sits in the measure-1 tempo direction next to the metronome mark; harmony blocks use </w:t>
+      </w:r>
+      <w:r>
+        <w:rPr>
+          <w:rFonts w:ascii="Consolas" w:cs="Consolas" w:eastAsia="Consolas" w:hAnsi="Consolas"/>
+          <w:sz w:val="20"/>
+          <w:szCs w:val="20"/>
+        </w:rPr>
+        <w:t xml:space="preserve">placement="above"</w:t>
+      </w:r>
+      <w:r>
+        <w:t xml:space="preserve">. Exports pass Composer OS </w:t>
+      </w:r>
+      <w:r>
+        <w:rPr>
+          <w:b/>
+          <w:bCs/>
+        </w:rPr>
+        <w:t xml:space="preserve">MusicXML schema validation</w:t>
+      </w:r>
+      <w:r>
+        <w:t xml:space="preserve"> (no mixed </w:t>
+      </w:r>
+      <w:r>
+        <w:rPr>
+          <w:rFonts w:ascii="Consolas" w:cs="Consolas" w:eastAsia="Consolas" w:hAnsi="Consolas"/>
+          <w:sz w:val="20"/>
+          <w:szCs w:val="20"/>
+        </w:rPr>
+        <w:t xml:space="preserve">direction-type</w:t>
+      </w:r>
+      <w:r>
+        <w:t xml:space="preserve"> children, no </w:t>
+      </w:r>
+      <w:r>
+        <w:rPr>
+          <w:rFonts w:ascii="Consolas" w:cs="Consolas" w:eastAsia="Consolas" w:hAnsi="Consolas"/>
+          <w:sz w:val="20"/>
+          <w:szCs w:val="20"/>
+        </w:rPr>
+        <w:t xml:space="preserve">&lt;offset&gt;</w:t>
+      </w:r>
+      <w:r>
+        <w:t xml:space="preserve"> inside </w:t>
+      </w:r>
+      <w:r>
+        <w:rPr>
+          <w:rFonts w:ascii="Consolas" w:cs="Consolas" w:eastAsia="Consolas" w:hAnsi="Consolas"/>
+          <w:sz w:val="20"/>
+          <w:szCs w:val="20"/>
+        </w:rPr>
+        <w:t xml:space="preserve">&lt;harmony&gt;</w:t>
+      </w:r>
+      <w:r>
+        <w:t xml:space="preserve">) before the green shareable receipt.</w:t>
       </w:r>
     </w:p>
     <w:p>

</xml_diff>

<commit_message>
fix: wayne_shorter style-transfer export — single authoritative harmony pass (was 0-byte); log phrase-gate follow-up
Co-authored-by: Cursor <cursoragent@cursor.com>
</commit_message>
<xml_diff>
--- a/docs/COMPOSER_HANDBOOK.docx
+++ b/docs/COMPOSER_HANDBOOK.docx
@@ -13517,6 +13517,93 @@
       </w:r>
       <w:r>
         <w:t xml:space="preserve">.</w:t>
+      </w:r>
+    </w:p>
+    <w:p>
+      <w:pPr>
+        <w:spacing w:after="160"/>
+      </w:pPr>
+      <w:r>
+        <w:rPr>
+          <w:b/>
+          <w:bCs/>
+        </w:rPr>
+        <w:t xml:space="preserve">Wayne Shorter style-transfer reharm:</w:t>
+      </w:r>
+      <w:r>
+        <w:t xml:space="preserve"> </w:t>
+      </w:r>
+      <w:r>
+        <w:rPr>
+          <w:b/>
+          <w:bCs/>
+        </w:rPr>
+        <w:t xml:space="preserve">`wayne_shorter`</w:t>
+      </w:r>
+      <w:r>
+        <w:t xml:space="preserve"> is available as a </w:t>
+      </w:r>
+      <w:r>
+        <w:rPr>
+          <w:b/>
+          <w:bCs/>
+        </w:rPr>
+        <w:t xml:space="preserve">style-transfer / reharmonisation</w:t>
+      </w:r>
+      <w:r>
+        <w:t xml:space="preserve"> target (Arranger tab, mosaic import, or </w:t>
+      </w:r>
+      <w:r>
+        <w:rPr>
+          <w:rFonts w:ascii="Consolas" w:cs="Consolas" w:eastAsia="Consolas" w:hAnsi="Consolas"/>
+          <w:sz w:val="20"/>
+          <w:szCs w:val="20"/>
+        </w:rPr>
+        <w:t xml:space="preserve">targetComposer: 'wayne_shorter'</w:t>
+      </w:r>
+      <w:r>
+        <w:t xml:space="preserve">). Post-bop devices (</w:t>
+      </w:r>
+      <w:r>
+        <w:rPr>
+          <w:b/>
+          <w:bCs/>
+        </w:rPr>
+        <w:t xml:space="preserve">`ws:*`</w:t>
+      </w:r>
+      <w:r>
+        <w:t xml:space="preserve">, lateral modal colour, extended symbols such as </w:t>
+      </w:r>
+      <w:r>
+        <w:rPr>
+          <w:rFonts w:ascii="Consolas" w:cs="Consolas" w:eastAsia="Consolas" w:hAnsi="Consolas"/>
+          <w:sz w:val="20"/>
+          <w:szCs w:val="20"/>
+        </w:rPr>
+        <w:t xml:space="preserve">Gmaj9#11</w:t>
+      </w:r>
+      <w:r>
+        <w:t xml:space="preserve">) export as </w:t>
+      </w:r>
+      <w:r>
+        <w:rPr>
+          <w:b/>
+          <w:bCs/>
+        </w:rPr>
+        <w:t xml:space="preserve">shareable MusicXML</w:t>
+      </w:r>
+      <w:r>
+        <w:t xml:space="preserve"> — single authoritative harmony pass; no slash-vs-locked drift. On very short imported charts, </w:t>
+      </w:r>
+      <w:r>
+        <w:rPr>
+          <w:b/>
+          <w:bCs/>
+        </w:rPr>
+        <w:t xml:space="preserve">`gp.success`</w:t>
+      </w:r>
+      <w:r>
+        <w:t xml:space="preserve"> may still fail duo phrase gates while export succeeds (known follow-up).</w:t>
       </w:r>
     </w:p>
     <w:p>

</xml_diff>

<commit_message>
V83d Phase 1: export passing dims to duo + BH inner-voice off-beat stagger (melody preserved)
Co-authored-by: Cursor <cursoragent@cursor.com>
</commit_message>
<xml_diff>
--- a/docs/COMPOSER_HANDBOOK.docx
+++ b/docs/COMPOSER_HANDBOOK.docx
@@ -13331,10 +13331,145 @@
           <w:b/>
           <w:bCs/>
         </w:rPr>
+        <w:t xml:space="preserve">Duo comp rhythm (V83d Phase 1):</w:t>
+      </w:r>
+      <w:r>
+        <w:t xml:space="preserve"> On </w:t>
+      </w:r>
+      <w:r>
+        <w:rPr>
+          <w:b/>
+          <w:bCs/>
+        </w:rPr>
+        <w:t xml:space="preserve">Song Mode</w:t>
+      </w:r>
+      <w:r>
+        <w:t xml:space="preserve"> / </w:t>
+      </w:r>
+      <w:r>
+        <w:rPr>
+          <w:b/>
+          <w:bCs/>
+        </w:rPr>
+        <w:t xml:space="preserve">`guitar_bass_duo`</w:t>
+      </w:r>
+      <w:r>
+        <w:t xml:space="preserve"> preset, BH chord-melody keeps your </w:t>
+      </w:r>
+      <w:r>
+        <w:rPr>
+          <w:b/>
+          <w:bCs/>
+        </w:rPr>
+        <w:t xml:space="preserve">melody pitches and onsets</w:t>
+      </w:r>
+      <w:r>
+        <w:t xml:space="preserve"> locked on voice </w:t>
+      </w:r>
+      <w:r>
+        <w:rPr>
+          <w:b/>
+          <w:bCs/>
+        </w:rPr>
+        <w:t xml:space="preserve">1</w:t>
+      </w:r>
+      <w:r>
+        <w:t xml:space="preserve"> while </w:t>
+      </w:r>
+      <w:r>
+        <w:rPr>
+          <w:b/>
+          <w:bCs/>
+        </w:rPr>
+        <w:t xml:space="preserve">inner comp (voice 2)</w:t>
+      </w:r>
+      <w:r>
+        <w:t xml:space="preserve"> moves on </w:t>
+      </w:r>
+      <w:r>
+        <w:rPr>
+          <w:b/>
+          <w:bCs/>
+        </w:rPr>
+        <w:t xml:space="preserve">off-beats</w:t>
+      </w:r>
+      <w:r>
+        <w:t xml:space="preserve"> (typically beat </w:t>
+      </w:r>
+      <w:r>
+        <w:rPr>
+          <w:b/>
+          <w:bCs/>
+        </w:rPr>
+        <w:t xml:space="preserve">1</w:t>
+      </w:r>
+      <w:r>
+        <w:t xml:space="preserve"> after a melody on </w:t>
+      </w:r>
+      <w:r>
+        <w:rPr>
+          <w:b/>
+          <w:bCs/>
+        </w:rPr>
+        <w:t xml:space="preserve">0</w:t>
+      </w:r>
+      <w:r>
+        <w:t xml:space="preserve">, beat </w:t>
+      </w:r>
+      <w:r>
+        <w:rPr>
+          <w:b/>
+          <w:bCs/>
+        </w:rPr>
+        <w:t xml:space="preserve">3</w:t>
+      </w:r>
+      <w:r>
+        <w:t xml:space="preserve"> after melody on </w:t>
+      </w:r>
+      <w:r>
+        <w:rPr>
+          <w:b/>
+          <w:bCs/>
+        </w:rPr>
+        <w:t xml:space="preserve">2</w:t>
+      </w:r>
+      <w:r>
+        <w:t xml:space="preserve">). </w:t>
+      </w:r>
+      <w:r>
+        <w:rPr>
+          <w:b/>
+          <w:bCs/>
+        </w:rPr>
+        <w:t xml:space="preserve">Passing diminished</w:t>
+      </w:r>
+      <w:r>
+        <w:t xml:space="preserve"> motion is </w:t>
+      </w:r>
+      <w:r>
+        <w:rPr>
+          <w:b/>
+          <w:bCs/>
+        </w:rPr>
+        <w:t xml:space="preserve">audible</w:t>
+      </w:r>
+      <w:r>
+        <w:t xml:space="preserve"> in the export (not receipts-only). Open the MusicXML in Sibelius to hear/see the staggered comp under the tune.</w:t>
+      </w:r>
+    </w:p>
+    <w:p>
+      <w:pPr>
+        <w:spacing w:after="160"/>
+      </w:pPr>
+      <w:r>
+        <w:rPr>
+          <w:b/>
+          <w:bCs/>
+        </w:rPr>
         <w:t xml:space="preserve">Known limitations:</w:t>
       </w:r>
       <w:r>
-        <w:t xml:space="preserve"> Mostly diatonic stepwise melodies skew toward </w:t>
+        <w:t xml:space="preserve"> Mostly diatonic stepwise melodies still skew toward </w:t>
       </w:r>
       <w:r>
         <w:rPr>
@@ -13344,27 +13479,47 @@
         <w:t xml:space="preserve">6th</w:t>
       </w:r>
       <w:r>
-        <w:t xml:space="preserve"> voicings with fewer </w:t>
-      </w:r>
-      <w:r>
-        <w:rPr>
-          <w:b/>
-          <w:bCs/>
-        </w:rPr>
-        <w:t xml:space="preserve">dim7</w:t>
-      </w:r>
-      <w:r>
-        <w:t xml:space="preserve"> passing chords. Stronger chromatic/jazz-standard lines activate more borrowed and dim7 rungs. Planned </w:t>
-      </w:r>
-      <w:r>
-        <w:rPr>
-          <w:b/>
-          <w:bCs/>
-        </w:rPr>
-        <w:t xml:space="preserve">V81:</w:t>
-      </w:r>
-      <w:r>
-        <w:t xml:space="preserve"> explicit passing-dim insertion on weak beats for plainer melodies.</w:t>
+        <w:t xml:space="preserve"> voicings; </w:t>
+      </w:r>
+      <w:r>
+        <w:rPr>
+          <w:b/>
+          <w:bCs/>
+        </w:rPr>
+        <w:t xml:space="preserve">V81</w:t>
+      </w:r>
+      <w:r>
+        <w:t xml:space="preserve"> passing-dim insertion on weak beats is live (receipts + duo export). </w:t>
+      </w:r>
+      <w:r>
+        <w:rPr>
+          <w:b/>
+          <w:bCs/>
+        </w:rPr>
+        <w:t xml:space="preserve">Melody rhythm</w:t>
+      </w:r>
+      <w:r>
+        <w:t xml:space="preserve"> enrichment (syncopation on the tune itself) is </w:t>
+      </w:r>
+      <w:r>
+        <w:rPr>
+          <w:b/>
+          <w:bCs/>
+        </w:rPr>
+        <w:t xml:space="preserve">V83d Phase 2</w:t>
+      </w:r>
+      <w:r>
+        <w:t xml:space="preserve"> — comp-side rhythm only in Phase 1. On very short imports, </w:t>
+      </w:r>
+      <w:r>
+        <w:rPr>
+          <w:b/>
+          <w:bCs/>
+        </w:rPr>
+        <w:t xml:space="preserve">`gp.success`</w:t>
+      </w:r>
+      <w:r>
+        <w:t xml:space="preserve"> may fail phrase gates while export remains shareable (known follow-up).</w:t>
       </w:r>
     </w:p>
     <w:p>
@@ -13387,6 +13542,42 @@
           <w:bCs/>
         </w:rPr>
         <w:t xml:space="preserve">`docs/BH_QUICK_GUIDE.md`</w:t>
+      </w:r>
+    </w:p>
+    <w:p>
+      <w:pPr>
+        <w:spacing w:after="160"/>
+      </w:pPr>
+      <w:r>
+        <w:rPr>
+          <w:b/>
+          <w:bCs/>
+        </w:rPr>
+        <w:t xml:space="preserve">V83d Phase 1 validation:</w:t>
+      </w:r>
+      <w:r>
+        <w:t xml:space="preserve"> </w:t>
+      </w:r>
+      <w:r>
+        <w:rPr>
+          <w:rFonts w:ascii="Consolas" w:cs="Consolas" w:eastAsia="Consolas" w:hAnsi="Consolas"/>
+          <w:sz w:val="20"/>
+          <w:szCs w:val="20"/>
+        </w:rPr>
+        <w:t xml:space="preserve">npx tsx --tsconfig tsconfig.json engines/composer-os-v2/scripts/runV83dPhase1AutoValidation.ts</w:t>
+      </w:r>
+      <w:r>
+        <w:t xml:space="preserve"> — asserts passing dims and inner stagger in </w:t>
+      </w:r>
+      <w:r>
+        <w:rPr>
+          <w:b/>
+          <w:bCs/>
+        </w:rPr>
+        <w:t xml:space="preserve">exported</w:t>
+      </w:r>
+      <w:r>
+        <w:t xml:space="preserve"> duo XML, melody pitch/onset lock, schema validity.</w:t>
       </w:r>
     </w:p>
     <w:p>

</xml_diff>

<commit_message>
V83d Phase 2: BH melody rhythm enrichment (enrichMelodyRhythm, structural-landing-aware) + non-vacuous Phase 2 validator (offbeatRatio window 0.55-0.75 + structural-landing check)
Co-authored-by: Cursor <cursoragent@cursor.com>
</commit_message>
<xml_diff>
--- a/docs/COMPOSER_HANDBOOK.docx
+++ b/docs/COMPOSER_HANDBOOK.docx
@@ -13361,7 +13361,7 @@
           <w:b/>
           <w:bCs/>
         </w:rPr>
-        <w:t xml:space="preserve">melody pitches and onsets</w:t>
+        <w:t xml:space="preserve">melody pitches</w:t>
       </w:r>
       <w:r>
         <w:t xml:space="preserve"> locked on voice </w:t>
@@ -13466,97 +13466,40 @@
           <w:b/>
           <w:bCs/>
         </w:rPr>
-        <w:t xml:space="preserve">Known limitations:</w:t>
-      </w:r>
-      <w:r>
-        <w:t xml:space="preserve"> Mostly diatonic stepwise melodies still skew toward </w:t>
-      </w:r>
-      <w:r>
-        <w:rPr>
-          <w:b/>
-          <w:bCs/>
-        </w:rPr>
-        <w:t xml:space="preserve">6th</w:t>
-      </w:r>
-      <w:r>
-        <w:t xml:space="preserve"> voicings; </w:t>
-      </w:r>
-      <w:r>
-        <w:rPr>
-          <w:b/>
-          <w:bCs/>
-        </w:rPr>
-        <w:t xml:space="preserve">V81</w:t>
-      </w:r>
-      <w:r>
-        <w:t xml:space="preserve"> passing-dim insertion on weak beats is live (receipts + duo export). </w:t>
-      </w:r>
-      <w:r>
-        <w:rPr>
-          <w:b/>
-          <w:bCs/>
-        </w:rPr>
-        <w:t xml:space="preserve">Melody rhythm</w:t>
-      </w:r>
-      <w:r>
-        <w:t xml:space="preserve"> enrichment (syncopation on the tune itself) is </w:t>
-      </w:r>
-      <w:r>
-        <w:rPr>
-          <w:b/>
-          <w:bCs/>
-        </w:rPr>
-        <w:t xml:space="preserve">V83d Phase 2</w:t>
-      </w:r>
-      <w:r>
-        <w:t xml:space="preserve"> — comp-side rhythm only in Phase 1. On very short imports, </w:t>
-      </w:r>
-      <w:r>
-        <w:rPr>
-          <w:b/>
-          <w:bCs/>
-        </w:rPr>
-        <w:t xml:space="preserve">`gp.success`</w:t>
-      </w:r>
-      <w:r>
-        <w:t xml:space="preserve"> may fail phrase gates while export remains shareable (known follow-up).</w:t>
-      </w:r>
-    </w:p>
-    <w:p>
-      <w:pPr>
-        <w:spacing w:after="160"/>
-      </w:pPr>
-      <w:r>
-        <w:rPr>
-          <w:b/>
-          <w:bCs/>
-        </w:rPr>
-        <w:t xml:space="preserve">Quick guide:</w:t>
-      </w:r>
-      <w:r>
-        <w:t xml:space="preserve"> </w:t>
-      </w:r>
-      <w:r>
-        <w:rPr>
-          <w:b/>
-          <w:bCs/>
-        </w:rPr>
-        <w:t xml:space="preserve">`docs/BH_QUICK_GUIDE.md`</w:t>
-      </w:r>
-    </w:p>
-    <w:p>
-      <w:pPr>
-        <w:spacing w:after="160"/>
-      </w:pPr>
-      <w:r>
-        <w:rPr>
-          <w:b/>
-          <w:bCs/>
-        </w:rPr>
-        <w:t xml:space="preserve">V83d Phase 1 validation:</w:t>
-      </w:r>
-      <w:r>
-        <w:t xml:space="preserve"> </w:t>
+        <w:t xml:space="preserve">Melody rhythm enrichment (V83d Phase 2):</w:t>
+      </w:r>
+      <w:r>
+        <w:t xml:space="preserve"> On </w:t>
+      </w:r>
+      <w:r>
+        <w:rPr>
+          <w:b/>
+          <w:bCs/>
+        </w:rPr>
+        <w:t xml:space="preserve">`guitar_bass_duo`</w:t>
+      </w:r>
+      <w:r>
+        <w:t xml:space="preserve">, BH style-transfer may </w:t>
+      </w:r>
+      <w:r>
+        <w:rPr>
+          <w:b/>
+          <w:bCs/>
+        </w:rPr>
+        <w:t xml:space="preserve">reshape melody onsets only</w:t>
+      </w:r>
+      <w:r>
+        <w:t xml:space="preserve"> — </w:t>
+      </w:r>
+      <w:r>
+        <w:rPr>
+          <w:b/>
+          <w:bCs/>
+        </w:rPr>
+        <w:t xml:space="preserve">pitches stay bit-exact</w:t>
+      </w:r>
+      <w:r>
+        <w:t xml:space="preserve"> (</w:t>
       </w:r>
       <w:r>
         <w:rPr>
@@ -13564,6 +13507,250 @@
           <w:sz w:val="20"/>
           <w:szCs w:val="20"/>
         </w:rPr>
+        <w:t xml:space="preserve">preservePitchSequence</w:t>
+      </w:r>
+      <w:r>
+        <w:t xml:space="preserve">). Phrase boundaries come from rests / long IOIs in the import; </w:t>
+      </w:r>
+      <w:r>
+        <w:rPr>
+          <w:b/>
+          <w:bCs/>
+        </w:rPr>
+        <w:t xml:space="preserve">phrase-start</w:t>
+      </w:r>
+      <w:r>
+        <w:t xml:space="preserve"> and </w:t>
+      </w:r>
+      <w:r>
+        <w:rPr>
+          <w:b/>
+          <w:bCs/>
+        </w:rPr>
+        <w:t xml:space="preserve">cadence</w:t>
+      </w:r>
+      <w:r>
+        <w:t xml:space="preserve"> attacks can land on beat </w:t>
+      </w:r>
+      <w:r>
+        <w:rPr>
+          <w:b/>
+          <w:bCs/>
+        </w:rPr>
+        <w:t xml:space="preserve">1</w:t>
+      </w:r>
+      <w:r>
+        <w:t xml:space="preserve"> or </w:t>
+      </w:r>
+      <w:r>
+        <w:rPr>
+          <w:b/>
+          <w:bCs/>
+        </w:rPr>
+        <w:t xml:space="preserve">3</w:t>
+      </w:r>
+      <w:r>
+        <w:t xml:space="preserve"> as structural anchors; interior notes get Barry Harris </w:t>
+      </w:r>
+      <w:r>
+        <w:rPr>
+          <w:b/>
+          <w:bCs/>
+        </w:rPr>
+        <w:t xml:space="preserve">anticipation</w:t>
+      </w:r>
+      <w:r>
+        <w:t xml:space="preserve"> / </w:t>
+      </w:r>
+      <w:r>
+        <w:rPr>
+          <w:b/>
+          <w:bCs/>
+        </w:rPr>
+        <w:t xml:space="preserve">delayed-attack</w:t>
+      </w:r>
+      <w:r>
+        <w:t xml:space="preserve"> phrasing (syncopated but not uniformly off-grid). Profile ids: </w:t>
+      </w:r>
+      <w:r>
+        <w:rPr>
+          <w:b/>
+          <w:bCs/>
+        </w:rPr>
+        <w:t xml:space="preserve">`bebop_step`</w:t>
+      </w:r>
+      <w:r>
+        <w:t xml:space="preserve"> (default), </w:t>
+      </w:r>
+      <w:r>
+        <w:rPr>
+          <w:b/>
+          <w:bCs/>
+        </w:rPr>
+        <w:t xml:space="preserve">`enclosure_heavy`</w:t>
+      </w:r>
+      <w:r>
+        <w:t xml:space="preserve">, </w:t>
+      </w:r>
+      <w:r>
+        <w:rPr>
+          <w:b/>
+          <w:bCs/>
+        </w:rPr>
+        <w:t xml:space="preserve">`scalar_embellish`</w:t>
+      </w:r>
+      <w:r>
+        <w:t xml:space="preserve"> (</w:t>
+      </w:r>
+      <w:r>
+        <w:rPr>
+          <w:rFonts w:ascii="Consolas" w:cs="Consolas" w:eastAsia="Consolas" w:hAnsi="Consolas"/>
+          <w:sz w:val="20"/>
+          <w:szCs w:val="20"/>
+        </w:rPr>
+        <w:t xml:space="preserve">barryHarrisProfile</w:t>
+      </w:r>
+      <w:r>
+        <w:t xml:space="preserve"> on generate / Arranger). Harmony voicing lookup still uses </w:t>
+      </w:r>
+      <w:r>
+        <w:rPr>
+          <w:b/>
+          <w:bCs/>
+        </w:rPr>
+        <w:t xml:space="preserve">original</w:t>
+      </w:r>
+      <w:r>
+        <w:t xml:space="preserve"> melody onsets; export voice </w:t>
+      </w:r>
+      <w:r>
+        <w:rPr>
+          <w:b/>
+          <w:bCs/>
+        </w:rPr>
+        <w:t xml:space="preserve">1</w:t>
+      </w:r>
+      <w:r>
+        <w:t xml:space="preserve"> uses enriched onsets.</w:t>
+      </w:r>
+    </w:p>
+    <w:p>
+      <w:pPr>
+        <w:spacing w:after="160"/>
+      </w:pPr>
+      <w:r>
+        <w:rPr>
+          <w:b/>
+          <w:bCs/>
+        </w:rPr>
+        <w:t xml:space="preserve">Known limitations:</w:t>
+      </w:r>
+      <w:r>
+        <w:t xml:space="preserve"> Mostly diatonic stepwise melodies still skew toward </w:t>
+      </w:r>
+      <w:r>
+        <w:rPr>
+          <w:b/>
+          <w:bCs/>
+        </w:rPr>
+        <w:t xml:space="preserve">6th</w:t>
+      </w:r>
+      <w:r>
+        <w:t xml:space="preserve"> voicings; </w:t>
+      </w:r>
+      <w:r>
+        <w:rPr>
+          <w:b/>
+          <w:bCs/>
+        </w:rPr>
+        <w:t xml:space="preserve">V81</w:t>
+      </w:r>
+      <w:r>
+        <w:t xml:space="preserve"> passing-dim insertion on weak beats is live (receipts + duo export). </w:t>
+      </w:r>
+      <w:r>
+        <w:rPr>
+          <w:b/>
+          <w:bCs/>
+        </w:rPr>
+        <w:t xml:space="preserve">Phase 3 follow-up (parked):</w:t>
+      </w:r>
+      <w:r>
+        <w:t xml:space="preserve"> rhythmic-cell variety is still limited — recurring </w:t>
+      </w:r>
+      <w:r>
+        <w:rPr>
+          <w:b/>
+          <w:bCs/>
+        </w:rPr>
+        <w:t xml:space="preserve">0.5 / 1.25 / 2.5 / 3.75</w:t>
+      </w:r>
+      <w:r>
+        <w:t xml:space="preserve"> placements and IOI buckets at the validator floor of </w:t>
+      </w:r>
+      <w:r>
+        <w:rPr>
+          <w:b/>
+          <w:bCs/>
+        </w:rPr>
+        <w:t xml:space="preserve">3</w:t>
+      </w:r>
+      <w:r>
+        <w:t xml:space="preserve">; both Sibelius and ChatGPT re-QA flagged as future refinement, not a ship blocker. On very short imports, </w:t>
+      </w:r>
+      <w:r>
+        <w:rPr>
+          <w:b/>
+          <w:bCs/>
+        </w:rPr>
+        <w:t xml:space="preserve">`gp.success`</w:t>
+      </w:r>
+      <w:r>
+        <w:t xml:space="preserve"> may fail phrase gates while export remains shareable (known follow-up).</w:t>
+      </w:r>
+    </w:p>
+    <w:p>
+      <w:pPr>
+        <w:spacing w:after="160"/>
+      </w:pPr>
+      <w:r>
+        <w:rPr>
+          <w:b/>
+          <w:bCs/>
+        </w:rPr>
+        <w:t xml:space="preserve">Quick guide:</w:t>
+      </w:r>
+      <w:r>
+        <w:t xml:space="preserve"> </w:t>
+      </w:r>
+      <w:r>
+        <w:rPr>
+          <w:b/>
+          <w:bCs/>
+        </w:rPr>
+        <w:t xml:space="preserve">`docs/BH_QUICK_GUIDE.md`</w:t>
+      </w:r>
+    </w:p>
+    <w:p>
+      <w:pPr>
+        <w:spacing w:after="160"/>
+      </w:pPr>
+      <w:r>
+        <w:rPr>
+          <w:b/>
+          <w:bCs/>
+        </w:rPr>
+        <w:t xml:space="preserve">V83d Phase 1 validation:</w:t>
+      </w:r>
+      <w:r>
+        <w:t xml:space="preserve"> </w:t>
+      </w:r>
+      <w:r>
+        <w:rPr>
+          <w:rFonts w:ascii="Consolas" w:cs="Consolas" w:eastAsia="Consolas" w:hAnsi="Consolas"/>
+          <w:sz w:val="20"/>
+          <w:szCs w:val="20"/>
+        </w:rPr>
         <w:t xml:space="preserve">npx tsx --tsconfig tsconfig.json engines/composer-os-v2/scripts/runV83dPhase1AutoValidation.ts</w:t>
       </w:r>
       <w:r>
@@ -13577,7 +13764,125 @@
         <w:t xml:space="preserve">exported</w:t>
       </w:r>
       <w:r>
-        <w:t xml:space="preserve"> duo XML, melody pitch/onset lock, schema validity.</w:t>
+        <w:t xml:space="preserve"> duo XML, melody pitch lock, schema validity.</w:t>
+      </w:r>
+    </w:p>
+    <w:p>
+      <w:pPr>
+        <w:spacing w:after="160"/>
+      </w:pPr>
+      <w:r>
+        <w:rPr>
+          <w:b/>
+          <w:bCs/>
+        </w:rPr>
+        <w:t xml:space="preserve">V83d Phase 2 validation:</w:t>
+      </w:r>
+      <w:r>
+        <w:t xml:space="preserve"> </w:t>
+      </w:r>
+      <w:r>
+        <w:rPr>
+          <w:rFonts w:ascii="Consolas" w:cs="Consolas" w:eastAsia="Consolas" w:hAnsi="Consolas"/>
+          <w:sz w:val="20"/>
+          <w:szCs w:val="20"/>
+        </w:rPr>
+        <w:t xml:space="preserve">npx tsx --tsconfig tsconfig.json engines/composer-os-v2/scripts/runV83dPhase2AutoValidation.ts</w:t>
+      </w:r>
+      <w:r>
+        <w:t xml:space="preserve"> — jazz benchmark (</w:t>
+      </w:r>
+      <w:r>
+        <w:rPr>
+          <w:rFonts w:ascii="Consolas" w:cs="Consolas" w:eastAsia="Consolas" w:hAnsi="Consolas"/>
+          <w:sz w:val="20"/>
+          <w:szCs w:val="20"/>
+        </w:rPr>
+        <w:t xml:space="preserve">BH_Benchmark_JazzMelody.musicxml</w:t>
+      </w:r>
+      <w:r>
+        <w:t xml:space="preserve">); asserts </w:t>
+      </w:r>
+      <w:r>
+        <w:rPr>
+          <w:b/>
+          <w:bCs/>
+        </w:rPr>
+        <w:t xml:space="preserve">offbeatRatio</w:t>
+      </w:r>
+      <w:r>
+        <w:t xml:space="preserve"> in </w:t>
+      </w:r>
+      <w:r>
+        <w:rPr>
+          <w:b/>
+          <w:bCs/>
+        </w:rPr>
+        <w:t xml:space="preserve">0.55–0.75</w:t>
+      </w:r>
+      <w:r>
+        <w:t xml:space="preserve">, </w:t>
+      </w:r>
+      <w:r>
+        <w:rPr>
+          <w:b/>
+          <w:bCs/>
+        </w:rPr>
+        <w:t xml:space="preserve">≥ 1</w:t>
+      </w:r>
+      <w:r>
+        <w:t xml:space="preserve"> structural landing on beat </w:t>
+      </w:r>
+      <w:r>
+        <w:rPr>
+          <w:b/>
+          <w:bCs/>
+        </w:rPr>
+        <w:t xml:space="preserve">1</w:t>
+      </w:r>
+      <w:r>
+        <w:t xml:space="preserve">/</w:t>
+      </w:r>
+      <w:r>
+        <w:rPr>
+          <w:b/>
+          <w:bCs/>
+        </w:rPr>
+        <w:t xml:space="preserve">3</w:t>
+      </w:r>
+      <w:r>
+        <w:t xml:space="preserve">, pitch bit-exact, </w:t>
+      </w:r>
+      <w:r>
+        <w:rPr>
+          <w:b/>
+          <w:bCs/>
+        </w:rPr>
+        <w:t xml:space="preserve">≥ 3</w:t>
+      </w:r>
+      <w:r>
+        <w:t xml:space="preserve"> IOI buckets, syncopation delta band (rejects saturated all-offgrid), schema. Writes QA export to </w:t>
+      </w:r>
+      <w:r>
+        <w:rPr>
+          <w:b/>
+          <w:bCs/>
+        </w:rPr>
+        <w:t xml:space="preserve">Song Mode</w:t>
+      </w:r>
+      <w:r>
+        <w:t xml:space="preserve"> / </w:t>
+      </w:r>
+      <w:r>
+        <w:rPr>
+          <w:rFonts w:ascii="Consolas" w:cs="Consolas" w:eastAsia="Consolas" w:hAnsi="Consolas"/>
+          <w:sz w:val="20"/>
+          <w:szCs w:val="20"/>
+        </w:rPr>
+        <w:t xml:space="preserve">v83d-phase2-check.musicxml</w:t>
+      </w:r>
+      <w:r>
+        <w:t xml:space="preserve">.</w:t>
       </w:r>
     </w:p>
     <w:p>

</xml_diff>

<commit_message>
V83e+f: and-of-1 passing dim grips (profile-gated, onset 0.5) + midi-program NaN fix + Test 6/7 de-vacuumed + global inner-comp VL leap cap (10st)
Co-authored-by: Cursor <cursoragent@cursor.com>
</commit_message>
<xml_diff>
--- a/docs/COMPOSER_HANDBOOK.docx
+++ b/docs/COMPOSER_HANDBOOK.docx
@@ -13632,6 +13632,233 @@
       </w:r>
       <w:r>
         <w:t xml:space="preserve"> uses enriched onsets.</w:t>
+      </w:r>
+    </w:p>
+    <w:p>
+      <w:pPr>
+        <w:spacing w:after="160"/>
+      </w:pPr>
+      <w:r>
+        <w:rPr>
+          <w:b/>
+          <w:bCs/>
+        </w:rPr>
+        <w:t xml:space="preserve">And-of-1 passing diminished (V83e+f):</w:t>
+      </w:r>
+      <w:r>
+        <w:t xml:space="preserve"> On </w:t>
+      </w:r>
+      <w:r>
+        <w:rPr>
+          <w:b/>
+          <w:bCs/>
+        </w:rPr>
+        <w:t xml:space="preserve">`guitar_bass_duo`</w:t>
+      </w:r>
+      <w:r>
+        <w:t xml:space="preserve">, BH chord-melody can insert </w:t>
+      </w:r>
+      <w:r>
+        <w:rPr>
+          <w:b/>
+          <w:bCs/>
+        </w:rPr>
+        <w:t xml:space="preserve">profile-gated</w:t>
+      </w:r>
+      <w:r>
+        <w:t xml:space="preserve"> passing </w:t>
+      </w:r>
+      <w:r>
+        <w:rPr>
+          <w:b/>
+          <w:bCs/>
+        </w:rPr>
+        <w:t xml:space="preserve">diminished 7th</w:t>
+      </w:r>
+      <w:r>
+        <w:t xml:space="preserve"> grips on the </w:t>
+      </w:r>
+      <w:r>
+        <w:rPr>
+          <w:b/>
+          <w:bCs/>
+        </w:rPr>
+        <w:t xml:space="preserve">and of beat 1</w:t>
+      </w:r>
+      <w:r>
+        <w:t xml:space="preserve"> — engine onset </w:t>
+      </w:r>
+      <w:r>
+        <w:rPr>
+          <w:b/>
+          <w:bCs/>
+        </w:rPr>
+        <w:t xml:space="preserve">0.5</w:t>
+      </w:r>
+      <w:r>
+        <w:t xml:space="preserve">, MusicXML </w:t>
+      </w:r>
+      <w:r>
+        <w:rPr>
+          <w:b/>
+          <w:bCs/>
+        </w:rPr>
+        <w:t xml:space="preserve">240/480</w:t>
+      </w:r>
+      <w:r>
+        <w:t xml:space="preserve"> divisions (eighth note after the downbeat). Eligible when passing motion resolves into </w:t>
+      </w:r>
+      <w:r>
+        <w:rPr>
+          <w:b/>
+          <w:bCs/>
+        </w:rPr>
+        <w:t xml:space="preserve">beat 2</w:t>
+      </w:r>
+      <w:r>
+        <w:t xml:space="preserve">; typically </w:t>
+      </w:r>
+      <w:r>
+        <w:rPr>
+          <w:b/>
+          <w:bCs/>
+        </w:rPr>
+        <w:t xml:space="preserve">3–5</w:t>
+      </w:r>
+      <w:r>
+        <w:t xml:space="preserve"> bars per chart, driven by </w:t>
+      </w:r>
+      <w:r>
+        <w:rPr>
+          <w:b/>
+          <w:bCs/>
+        </w:rPr>
+        <w:t xml:space="preserve">`offbeatPassingDimBias`</w:t>
+      </w:r>
+      <w:r>
+        <w:t xml:space="preserve"> on the melody rhythm profile. Export shows real </w:t>
+      </w:r>
+      <w:r>
+        <w:rPr>
+          <w:b/>
+          <w:bCs/>
+        </w:rPr>
+        <w:t xml:space="preserve">2–4</w:t>
+      </w:r>
+      <w:r>
+        <w:t xml:space="preserve"> note dim stacks on voice </w:t>
+      </w:r>
+      <w:r>
+        <w:rPr>
+          <w:b/>
+          <w:bCs/>
+        </w:rPr>
+        <w:t xml:space="preserve">2</w:t>
+      </w:r>
+      <w:r>
+        <w:t xml:space="preserve"> (e.g. D–F–G♯ under a C6 bar), not metadata-only receipts. </w:t>
+      </w:r>
+      <w:r>
+        <w:rPr>
+          <w:b/>
+          <w:bCs/>
+        </w:rPr>
+        <w:t xml:space="preserve">Inner-comp voice-leading:</w:t>
+      </w:r>
+      <w:r>
+        <w:t xml:space="preserve"> adjacent structural inner voices are leap-capped (</w:t>
+      </w:r>
+      <w:r>
+        <w:rPr>
+          <w:b/>
+          <w:bCs/>
+        </w:rPr>
+        <w:t xml:space="preserve">10</w:t>
+      </w:r>
+      <w:r>
+        <w:t xml:space="preserve"> semitones on family-change fallback; benchmark max observed </w:t>
+      </w:r>
+      <w:r>
+        <w:rPr>
+          <w:b/>
+          <w:bCs/>
+        </w:rPr>
+        <w:t xml:space="preserve">8</w:t>
+      </w:r>
+      <w:r>
+        <w:t xml:space="preserve"> semitones). </w:t>
+      </w:r>
+      <w:r>
+        <w:rPr>
+          <w:b/>
+          <w:bCs/>
+        </w:rPr>
+        <w:t xml:space="preserve">Validation:</w:t>
+      </w:r>
+      <w:r>
+        <w:t xml:space="preserve"> </w:t>
+      </w:r>
+      <w:r>
+        <w:rPr>
+          <w:rFonts w:ascii="Consolas" w:cs="Consolas" w:eastAsia="Consolas" w:hAnsi="Consolas"/>
+          <w:sz w:val="20"/>
+          <w:szCs w:val="20"/>
+        </w:rPr>
+        <w:t xml:space="preserve">npx tsx --tsconfig tsconfig.json engines/composer-os-v2/scripts/runV81AutoValidation.ts</w:t>
+      </w:r>
+      <w:r>
+        <w:t xml:space="preserve"> — </w:t>
+      </w:r>
+      <w:r>
+        <w:rPr>
+          <w:b/>
+          <w:bCs/>
+        </w:rPr>
+        <w:t xml:space="preserve">TEST 6</w:t>
+      </w:r>
+      <w:r>
+        <w:t xml:space="preserve"> (inner-comp VL cap) + </w:t>
+      </w:r>
+      <w:r>
+        <w:rPr>
+          <w:b/>
+          <w:bCs/>
+        </w:rPr>
+        <w:t xml:space="preserve">TEST 7</w:t>
+      </w:r>
+      <w:r>
+        <w:t xml:space="preserve"> (drop-2 K upper register); full suite </w:t>
+      </w:r>
+      <w:r>
+        <w:rPr>
+          <w:b/>
+          <w:bCs/>
+        </w:rPr>
+        <w:t xml:space="preserve">8/8</w:t>
+      </w:r>
+      <w:r>
+        <w:t xml:space="preserve">. QA export: </w:t>
+      </w:r>
+      <w:r>
+        <w:rPr>
+          <w:b/>
+          <w:bCs/>
+        </w:rPr>
+        <w:t xml:space="preserve">Song Mode</w:t>
+      </w:r>
+      <w:r>
+        <w:t xml:space="preserve"> / </w:t>
+      </w:r>
+      <w:r>
+        <w:rPr>
+          <w:rFonts w:ascii="Consolas" w:cs="Consolas" w:eastAsia="Consolas" w:hAnsi="Consolas"/>
+          <w:sz w:val="20"/>
+          <w:szCs w:val="20"/>
+        </w:rPr>
+        <w:t xml:space="preserve">v83e-and-of-1-check.musicxml</w:t>
+      </w:r>
+      <w:r>
+        <w:t xml:space="preserve">.</w:t>
       </w:r>
     </w:p>
     <w:p>

</xml_diff>

<commit_message>
Cleanup day: Wayne 8-bar phrase-gate fix (gp.success=true) + Jest V83h 7->0 failures (stale expectations + lead-sheet assertion)
Co-authored-by: Cursor <cursoragent@cursor.com>
</commit_message>
<xml_diff>
--- a/docs/COMPOSER_HANDBOOK.docx
+++ b/docs/COMPOSER_HANDBOOK.docx
@@ -13923,17 +13923,7 @@
         <w:t xml:space="preserve">3</w:t>
       </w:r>
       <w:r>
-        <w:t xml:space="preserve">; both Sibelius and ChatGPT re-QA flagged as future refinement, not a ship blocker. On very short imports, </w:t>
-      </w:r>
-      <w:r>
-        <w:rPr>
-          <w:b/>
-          <w:bCs/>
-        </w:rPr>
-        <w:t xml:space="preserve">`gp.success`</w:t>
-      </w:r>
-      <w:r>
-        <w:t xml:space="preserve"> may fail phrase gates while export remains shareable (known follow-up).</w:t>
+        <w:t xml:space="preserve">; both Sibelius and ChatGPT re-QA flagged as future refinement, not a ship blocker.</w:t>
       </w:r>
     </w:p>
     <w:p>
@@ -14316,7 +14306,17 @@
         <w:t xml:space="preserve">shareable MusicXML</w:t>
       </w:r>
       <w:r>
-        <w:t xml:space="preserve"> — single authoritative harmony pass; no slash-vs-locked drift. On very short imported charts, </w:t>
+        <w:t xml:space="preserve"> — single authoritative harmony pass; no slash-vs-locked drift. </w:t>
+      </w:r>
+      <w:r>
+        <w:rPr>
+          <w:b/>
+          <w:bCs/>
+        </w:rPr>
+        <w:t xml:space="preserve">8-bar pinned-melody imports:</w:t>
+      </w:r>
+      <w:r>
+        <w:t xml:space="preserve"> </w:t>
       </w:r>
       <w:r>
         <w:rPr>
@@ -14326,7 +14326,178 @@
         <w:t xml:space="preserve">`gp.success`</w:t>
       </w:r>
       <w:r>
-        <w:t xml:space="preserve"> may still fail duo phrase gates while export succeeds (known follow-up).</w:t>
+        <w:t xml:space="preserve"> is now </w:t>
+      </w:r>
+      <w:r>
+        <w:rPr>
+          <w:b/>
+          <w:bCs/>
+        </w:rPr>
+        <w:t xml:space="preserve">true</w:t>
+      </w:r>
+      <w:r>
+        <w:t xml:space="preserve"> — duo phrase/LOCK gates relax to </w:t>
+      </w:r>
+      <w:r>
+        <w:rPr>
+          <w:b/>
+          <w:bCs/>
+        </w:rPr>
+        <w:t xml:space="preserve">warnings</w:t>
+      </w:r>
+      <w:r>
+        <w:t xml:space="preserve"> when melody is import-pinned (</w:t>
+      </w:r>
+      <w:r>
+        <w:rPr>
+          <w:rFonts w:ascii="Consolas" w:cs="Consolas" w:eastAsia="Consolas" w:hAnsi="Consolas"/>
+          <w:sz w:val="20"/>
+          <w:szCs w:val="20"/>
+        </w:rPr>
+        <w:t xml:space="preserve">isStyleTransferEightBarPinnedMelodyRelax</w:t>
+      </w:r>
+      <w:r>
+        <w:t xml:space="preserve">).</w:t>
+      </w:r>
+    </w:p>
+    <w:p>
+      <w:pPr>
+        <w:pStyle w:val="Heading2"/>
+        <w:spacing w:after="100" w:before="180"/>
+      </w:pPr>
+      <w:r>
+        <w:t xml:space="preserve">Cleanup day (2026-06-11)</w:t>
+      </w:r>
+    </w:p>
+    <w:p>
+      <w:pPr>
+        <w:spacing w:after="160"/>
+      </w:pPr>
+      <w:r>
+        <w:rPr>
+          <w:b/>
+          <w:bCs/>
+        </w:rPr>
+        <w:t xml:space="preserve">Wayne 8-bar phrase gate — fixed:</w:t>
+      </w:r>
+      <w:r>
+        <w:t xml:space="preserve"> Style-transfer with </w:t>
+      </w:r>
+      <w:r>
+        <w:rPr>
+          <w:b/>
+          <w:bCs/>
+        </w:rPr>
+        <w:t xml:space="preserve">preserve melody</w:t>
+      </w:r>
+      <w:r>
+        <w:t xml:space="preserve"> on </w:t>
+      </w:r>
+      <w:r>
+        <w:rPr>
+          <w:b/>
+          <w:bCs/>
+        </w:rPr>
+        <w:t xml:space="preserve">8-bar</w:t>
+      </w:r>
+      <w:r>
+        <w:t xml:space="preserve"> imports no longer fails </w:t>
+      </w:r>
+      <w:r>
+        <w:rPr>
+          <w:b/>
+          <w:bCs/>
+        </w:rPr>
+        <w:t xml:space="preserve">`gp.success`</w:t>
+      </w:r>
+      <w:r>
+        <w:t xml:space="preserve"> because duo phrase authority / LOCK / V3 polish gates misfire on pinned import rhythm. Gates become </w:t>
+      </w:r>
+      <w:r>
+        <w:rPr>
+          <w:b/>
+          <w:bCs/>
+        </w:rPr>
+        <w:t xml:space="preserve">non-blocking warnings</w:t>
+      </w:r>
+      <w:r>
+        <w:t xml:space="preserve">; export integrity and pipeline-truth unchanged. Wayne authoritative harmony metadata (</w:t>
+      </w:r>
+      <w:r>
+        <w:rPr>
+          <w:rFonts w:ascii="Consolas" w:cs="Consolas" w:eastAsia="Consolas" w:hAnsi="Consolas"/>
+          <w:sz w:val="20"/>
+          <w:szCs w:val="20"/>
+        </w:rPr>
+        <w:t xml:space="preserve">styleTransferWayneHarmonyAuthoritative</w:t>
+      </w:r>
+      <w:r>
+        <w:t xml:space="preserve">) propagates on golden-path merge.</w:t>
+      </w:r>
+    </w:p>
+    <w:p>
+      <w:pPr>
+        <w:spacing w:after="160"/>
+      </w:pPr>
+      <w:r>
+        <w:rPr>
+          <w:b/>
+          <w:bCs/>
+        </w:rPr>
+        <w:t xml:space="preserve">Jest V83h — 7 → 0 failures:</w:t>
+      </w:r>
+      <w:r>
+        <w:t xml:space="preserve"> Six stale </w:t>
+      </w:r>
+      <w:r>
+        <w:rPr>
+          <w:b/>
+          <w:bCs/>
+        </w:rPr>
+        <w:t xml:space="preserve">Barry Harris chord-melody</w:t>
+      </w:r>
+      <w:r>
+        <w:t xml:space="preserve"> unit expectations (ladder thresholds, dyad stack size, XML spelling, wyble note count) and one </w:t>
+      </w:r>
+      <w:r>
+        <w:rPr>
+          <w:b/>
+          <w:bCs/>
+        </w:rPr>
+        <w:t xml:space="preserve">mosaic lead-sheet</w:t>
+      </w:r>
+      <w:r>
+        <w:t xml:space="preserve"> chord-symbol assertion updated. Live gate remains </w:t>
+      </w:r>
+      <w:r>
+        <w:rPr>
+          <w:b/>
+          <w:bCs/>
+        </w:rPr>
+        <w:t xml:space="preserve">`npm run test:composer-smoke`</w:t>
+      </w:r>
+      <w:r>
+        <w:t xml:space="preserve"> (</w:t>
+      </w:r>
+      <w:r>
+        <w:rPr>
+          <w:b/>
+          <w:bCs/>
+        </w:rPr>
+        <w:t xml:space="preserve">664/664</w:t>
+      </w:r>
+      <w:r>
+        <w:t xml:space="preserve">); Jest full </w:t>
+      </w:r>
+      <w:r>
+        <w:rPr>
+          <w:b/>
+          <w:bCs/>
+        </w:rPr>
+        <w:t xml:space="preserve">662/662</w:t>
+      </w:r>
+      <w:r>
+        <w:t xml:space="preserve">.</w:t>
       </w:r>
     </w:p>
     <w:p>

</xml_diff>

<commit_message>
V85 Phase 3 (1/2): rhythmic-cell variety — bhRhythmCellLibrary (6 families, seeded, anti-repeat) + cell-library melody onsets; pitch bit-exact, Phase 2 landings preserved; runV85Phase3AutoValidation (IOI buckets 11, entropy 3.374, dominance 0.250, offbeat 0.688)
Co-authored-by: Cursor <cursoragent@cursor.com>
</commit_message>
<xml_diff>
--- a/docs/COMPOSER_HANDBOOK.docx
+++ b/docs/COMPOSER_HANDBOOK.docx
@@ -13632,6 +13632,347 @@
       </w:r>
       <w:r>
         <w:t xml:space="preserve"> uses enriched onsets.</w:t>
+      </w:r>
+    </w:p>
+    <w:p>
+      <w:pPr>
+        <w:spacing w:after="160"/>
+      </w:pPr>
+      <w:r>
+        <w:rPr>
+          <w:b/>
+          <w:bCs/>
+        </w:rPr>
+        <w:t xml:space="preserve">Rhythmic-cell variety (V85 Phase 3 Commit 1):</w:t>
+      </w:r>
+      <w:r>
+        <w:t xml:space="preserve"> Interior melody onsets now draw from </w:t>
+      </w:r>
+      <w:r>
+        <w:rPr>
+          <w:b/>
+          <w:bCs/>
+        </w:rPr>
+        <w:t xml:space="preserve">`bhRhythmCellLibrary.ts`</w:t>
+      </w:r>
+      <w:r>
+        <w:t xml:space="preserve"> — </w:t>
+      </w:r>
+      <w:r>
+        <w:rPr>
+          <w:b/>
+          <w:bCs/>
+        </w:rPr>
+        <w:t xml:space="preserve">6</w:t>
+      </w:r>
+      <w:r>
+        <w:t xml:space="preserve"> cell families (</w:t>
+      </w:r>
+      <w:r>
+        <w:rPr>
+          <w:b/>
+          <w:bCs/>
+        </w:rPr>
+        <w:t xml:space="preserve">anticipate</w:t>
+      </w:r>
+      <w:r>
+        <w:t xml:space="preserve">, </w:t>
+      </w:r>
+      <w:r>
+        <w:rPr>
+          <w:b/>
+          <w:bCs/>
+        </w:rPr>
+        <w:t xml:space="preserve">and_of_2</w:t>
+      </w:r>
+      <w:r>
+        <w:t xml:space="preserve">, </w:t>
+      </w:r>
+      <w:r>
+        <w:rPr>
+          <w:b/>
+          <w:bCs/>
+        </w:rPr>
+        <w:t xml:space="preserve">delayed</w:t>
+      </w:r>
+      <w:r>
+        <w:t xml:space="preserve">, </w:t>
+      </w:r>
+      <w:r>
+        <w:rPr>
+          <w:b/>
+          <w:bCs/>
+        </w:rPr>
+        <w:t xml:space="preserve">dotted</w:t>
+      </w:r>
+      <w:r>
+        <w:t xml:space="preserve">, </w:t>
+      </w:r>
+      <w:r>
+        <w:rPr>
+          <w:b/>
+          <w:bCs/>
+        </w:rPr>
+        <w:t xml:space="preserve">long_gap</w:t>
+      </w:r>
+      <w:r>
+        <w:t xml:space="preserve">, </w:t>
+      </w:r>
+      <w:r>
+        <w:rPr>
+          <w:b/>
+          <w:bCs/>
+        </w:rPr>
+        <w:t xml:space="preserve">triplet_pickup</w:t>
+      </w:r>
+      <w:r>
+        <w:t xml:space="preserve">), deterministic </w:t>
+      </w:r>
+      <w:r>
+        <w:rPr>
+          <w:b/>
+          <w:bCs/>
+        </w:rPr>
+        <w:t xml:space="preserve">mulberry32</w:t>
+      </w:r>
+      <w:r>
+        <w:t xml:space="preserve"> seed, phrase-position weighting, </w:t>
+      </w:r>
+      <w:r>
+        <w:rPr>
+          <w:b/>
+          <w:bCs/>
+        </w:rPr>
+        <w:t xml:space="preserve">anti-repeat</w:t>
+      </w:r>
+      <w:r>
+        <w:t xml:space="preserve"> (no same family twice in a row) + </w:t>
+      </w:r>
+      <w:r>
+        <w:rPr>
+          <w:b/>
+          <w:bCs/>
+        </w:rPr>
+        <w:t xml:space="preserve">triplet cap</w:t>
+      </w:r>
+      <w:r>
+        <w:t xml:space="preserve">. Phase 2 structural landings and </w:t>
+      </w:r>
+      <w:r>
+        <w:rPr>
+          <w:b/>
+          <w:bCs/>
+        </w:rPr>
+        <w:t xml:space="preserve">`preservePitchSequence`</w:t>
+      </w:r>
+      <w:r>
+        <w:t xml:space="preserve"> unchanged. </w:t>
+      </w:r>
+      <w:r>
+        <w:rPr>
+          <w:b/>
+          <w:bCs/>
+        </w:rPr>
+        <w:t xml:space="preserve">`runV85Phase3AutoValidation.ts`</w:t>
+      </w:r>
+      <w:r>
+        <w:t xml:space="preserve"> — Phase 2 checks preserved + IOI buckets </w:t>
+      </w:r>
+      <w:r>
+        <w:rPr>
+          <w:b/>
+          <w:bCs/>
+        </w:rPr>
+        <w:t xml:space="preserve">≥ 5</w:t>
+      </w:r>
+      <w:r>
+        <w:t xml:space="preserve">, onset dominance </w:t>
+      </w:r>
+      <w:r>
+        <w:rPr>
+          <w:b/>
+          <w:bCs/>
+        </w:rPr>
+        <w:t xml:space="preserve">≤ 0.30</w:t>
+      </w:r>
+      <w:r>
+        <w:t xml:space="preserve">, IOI entropy </w:t>
+      </w:r>
+      <w:r>
+        <w:rPr>
+          <w:b/>
+          <w:bCs/>
+        </w:rPr>
+        <w:t xml:space="preserve">≥ 2.0</w:t>
+      </w:r>
+      <w:r>
+        <w:t xml:space="preserve">, duration 3-gram diversity </w:t>
+      </w:r>
+      <w:r>
+        <w:rPr>
+          <w:b/>
+          <w:bCs/>
+        </w:rPr>
+        <w:t xml:space="preserve">≥ 6</w:t>
+      </w:r>
+      <w:r>
+        <w:t xml:space="preserve">, phrase-density arc, </w:t>
+      </w:r>
+      <w:r>
+        <w:rPr>
+          <w:b/>
+          <w:bCs/>
+        </w:rPr>
+        <w:t xml:space="preserve">≥ 3</w:t>
+      </w:r>
+      <w:r>
+        <w:t xml:space="preserve"> cell families. Calibrated on </w:t>
+      </w:r>
+      <w:r>
+        <w:rPr>
+          <w:b/>
+          <w:bCs/>
+        </w:rPr>
+        <w:t xml:space="preserve">`BH_Benchmark_JazzMelody.musicxml`</w:t>
+      </w:r>
+      <w:r>
+        <w:t xml:space="preserve"> seed </w:t>
+      </w:r>
+      <w:r>
+        <w:rPr>
+          <w:b/>
+          <w:bCs/>
+        </w:rPr>
+        <w:t xml:space="preserve">88109</w:t>
+      </w:r>
+      <w:r>
+        <w:t xml:space="preserve"> (offbeatRatio </w:t>
+      </w:r>
+      <w:r>
+        <w:rPr>
+          <w:b/>
+          <w:bCs/>
+        </w:rPr>
+        <w:t xml:space="preserve">0.688</w:t>
+      </w:r>
+      <w:r>
+        <w:t xml:space="preserve">, IOI buckets </w:t>
+      </w:r>
+      <w:r>
+        <w:rPr>
+          <w:b/>
+          <w:bCs/>
+        </w:rPr>
+        <w:t xml:space="preserve">11</w:t>
+      </w:r>
+      <w:r>
+        <w:t xml:space="preserve">, dominance </w:t>
+      </w:r>
+      <w:r>
+        <w:rPr>
+          <w:b/>
+          <w:bCs/>
+        </w:rPr>
+        <w:t xml:space="preserve">0.250</w:t>
+      </w:r>
+      <w:r>
+        <w:t xml:space="preserve">, entropy </w:t>
+      </w:r>
+      <w:r>
+        <w:rPr>
+          <w:b/>
+          <w:bCs/>
+        </w:rPr>
+        <w:t xml:space="preserve">3.374</w:t>
+      </w:r>
+      <w:r>
+        <w:t xml:space="preserve">, 3-grams </w:t>
+      </w:r>
+      <w:r>
+        <w:rPr>
+          <w:b/>
+          <w:bCs/>
+        </w:rPr>
+        <w:t xml:space="preserve">13</w:t>
+      </w:r>
+      <w:r>
+        <w:t xml:space="preserve">, density arc </w:t>
+      </w:r>
+      <w:r>
+        <w:rPr>
+          <w:b/>
+          <w:bCs/>
+        </w:rPr>
+        <w:t xml:space="preserve">true</w:t>
+      </w:r>
+      <w:r>
+        <w:t xml:space="preserve">, </w:t>
+      </w:r>
+      <w:r>
+        <w:rPr>
+          <w:b/>
+          <w:bCs/>
+        </w:rPr>
+        <w:t xml:space="preserve">5</w:t>
+      </w:r>
+      <w:r>
+        <w:t xml:space="preserve"> families). QA export: </w:t>
+      </w:r>
+      <w:r>
+        <w:rPr>
+          <w:b/>
+          <w:bCs/>
+        </w:rPr>
+        <w:t xml:space="preserve">Song Mode</w:t>
+      </w:r>
+      <w:r>
+        <w:t xml:space="preserve"> / </w:t>
+      </w:r>
+      <w:r>
+        <w:rPr>
+          <w:rFonts w:ascii="Consolas" w:cs="Consolas" w:eastAsia="Consolas" w:hAnsi="Consolas"/>
+          <w:sz w:val="20"/>
+          <w:szCs w:val="20"/>
+        </w:rPr>
+        <w:t xml:space="preserve">v85-phase3-check.musicxml</w:t>
+      </w:r>
+      <w:r>
+        <w:t xml:space="preserve">.</w:t>
+      </w:r>
+    </w:p>
+    <w:p>
+      <w:pPr>
+        <w:spacing w:after="160"/>
+      </w:pPr>
+      <w:r>
+        <w:rPr>
+          <w:b/>
+          <w:bCs/>
+        </w:rPr>
+        <w:t xml:space="preserve">Carry-forward polish (Commit 2 / future):</w:t>
+      </w:r>
+      <w:r>
+        <w:t xml:space="preserve"> </w:t>
+      </w:r>
+      <w:r>
+        <w:rPr>
+          <w:b/>
+          <w:bCs/>
+        </w:rPr>
+        <w:t xml:space="preserve">`triplet_pickup`</w:t>
+      </w:r>
+      <w:r>
+        <w:t xml:space="preserve"> did not fire on the benchmark fixture (triplet cap conservative); recurring delayed starts around beat </w:t>
+      </w:r>
+      <w:r>
+        <w:rPr>
+          <w:b/>
+          <w:bCs/>
+        </w:rPr>
+        <w:t xml:space="preserve">1.5</w:t>
+      </w:r>
+      <w:r>
+        <w:t xml:space="preserve"> — candidate anti-repeat weighting tweak.</w:t>
       </w:r>
     </w:p>
     <w:p>

</xml_diff>

<commit_message>
V86 Commit 1a: BH golden-master baseline (seed 88109) before shared-engine refactor — no behaviour change
Co-authored-by: Cursor <cursoragent@cursor.com>
</commit_message>
<xml_diff>
--- a/docs/COMPOSER_HANDBOOK.docx
+++ b/docs/COMPOSER_HANDBOOK.docx
@@ -13949,7 +13949,358 @@
           <w:b/>
           <w:bCs/>
         </w:rPr>
-        <w:t xml:space="preserve">Carry-forward polish (Commit 2 / future):</w:t>
+        <w:t xml:space="preserve">Melodic expression (V85 Phase 3 Commit 2 / 3b):</w:t>
+      </w:r>
+      <w:r>
+        <w:t xml:space="preserve"> After rhythm enrichment, </w:t>
+      </w:r>
+      <w:r>
+        <w:rPr>
+          <w:b/>
+          <w:bCs/>
+        </w:rPr>
+        <w:t xml:space="preserve">`enrichMelodyExpression.ts`</w:t>
+      </w:r>
+      <w:r>
+        <w:t xml:space="preserve"> adds </w:t>
+      </w:r>
+      <w:r>
+        <w:rPr>
+          <w:b/>
+          <w:bCs/>
+        </w:rPr>
+        <w:t xml:space="preserve">articulation</w:t>
+      </w:r>
+      <w:r>
+        <w:t xml:space="preserve"> (accent on phrase peaks, tenuto on structural landings, staccato on short pickups), a per-phrase </w:t>
+      </w:r>
+      <w:r>
+        <w:rPr>
+          <w:b/>
+          <w:bCs/>
+        </w:rPr>
+        <w:t xml:space="preserve">velocity arc</w:t>
+      </w:r>
+      <w:r>
+        <w:t xml:space="preserve"> (</w:t>
+      </w:r>
+      <w:r>
+        <w:rPr>
+          <w:b/>
+          <w:bCs/>
+        </w:rPr>
+        <w:t xml:space="preserve">76–99</w:t>
+      </w:r>
+      <w:r>
+        <w:t xml:space="preserve">), and </w:t>
+      </w:r>
+      <w:r>
+        <w:rPr>
+          <w:b/>
+          <w:bCs/>
+        </w:rPr>
+        <w:t xml:space="preserve">`durationAccent`</w:t>
+      </w:r>
+      <w:r>
+        <w:t xml:space="preserve"> stress on downbeat structural attacks at export — </w:t>
+      </w:r>
+      <w:r>
+        <w:rPr>
+          <w:b/>
+          <w:bCs/>
+        </w:rPr>
+        <w:t xml:space="preserve">onsets/IOIs unchanged</w:t>
+      </w:r>
+      <w:r>
+        <w:t xml:space="preserve"> (byte-identical timing grid vs Commit 1; Phase 3b hard-fail if drift). Wired in </w:t>
+      </w:r>
+      <w:r>
+        <w:rPr>
+          <w:b/>
+          <w:bCs/>
+        </w:rPr>
+        <w:t xml:space="preserve">`runGoldenPath.ts`</w:t>
+      </w:r>
+      <w:r>
+        <w:t xml:space="preserve"> after </w:t>
+      </w:r>
+      <w:r>
+        <w:rPr>
+          <w:b/>
+          <w:bCs/>
+        </w:rPr>
+        <w:t xml:space="preserve">`enrichMelodyRhythm`</w:t>
+      </w:r>
+      <w:r>
+        <w:t xml:space="preserve">; </w:t>
+      </w:r>
+      <w:r>
+        <w:rPr>
+          <w:b/>
+          <w:bCs/>
+        </w:rPr>
+        <w:t xml:space="preserve">`runV85Phase3AutoValidation.ts`</w:t>
+      </w:r>
+      <w:r>
+        <w:t xml:space="preserve"> Phase 3b checks articulation coverage, velocity spread, and timing lock. QA export: </w:t>
+      </w:r>
+      <w:r>
+        <w:rPr>
+          <w:b/>
+          <w:bCs/>
+        </w:rPr>
+        <w:t xml:space="preserve">Song Mode</w:t>
+      </w:r>
+      <w:r>
+        <w:t xml:space="preserve"> / </w:t>
+      </w:r>
+      <w:r>
+        <w:rPr>
+          <w:rFonts w:ascii="Consolas" w:cs="Consolas" w:eastAsia="Consolas" w:hAnsi="Consolas"/>
+          <w:sz w:val="20"/>
+          <w:szCs w:val="20"/>
+        </w:rPr>
+        <w:t xml:space="preserve">v85-phase3b-check.musicxml</w:t>
+      </w:r>
+      <w:r>
+        <w:t xml:space="preserve">.</w:t>
+      </w:r>
+    </w:p>
+    <w:p>
+      <w:pPr>
+        <w:spacing w:after="160"/>
+      </w:pPr>
+      <w:r>
+        <w:rPr>
+          <w:b/>
+          <w:bCs/>
+        </w:rPr>
+        <w:t xml:space="preserve">V86 golden-master parity (Commit 1a):</w:t>
+      </w:r>
+      <w:r>
+        <w:t xml:space="preserve"> Before the shared-engine refactor, BH behaviour at seed </w:t>
+      </w:r>
+      <w:r>
+        <w:rPr>
+          <w:b/>
+          <w:bCs/>
+        </w:rPr>
+        <w:t xml:space="preserve">88109</w:t>
+      </w:r>
+      <w:r>
+        <w:t xml:space="preserve"> on </w:t>
+      </w:r>
+      <w:r>
+        <w:rPr>
+          <w:b/>
+          <w:bCs/>
+        </w:rPr>
+        <w:t xml:space="preserve">`BH_Benchmark_JazzMelody.musicxml`</w:t>
+      </w:r>
+      <w:r>
+        <w:t xml:space="preserve"> is frozen in </w:t>
+      </w:r>
+      <w:r>
+        <w:rPr>
+          <w:b/>
+          <w:bCs/>
+        </w:rPr>
+        <w:t xml:space="preserve">`engines/composer-os-v2/tests/golden/bh-benchmark-seed88109.golden.json`</w:t>
+      </w:r>
+      <w:r>
+        <w:t xml:space="preserve"> (voice-1 melody events: onset, duration, pitch, articulation, velocity, accent) and </w:t>
+      </w:r>
+      <w:r>
+        <w:rPr>
+          <w:b/>
+          <w:bCs/>
+        </w:rPr>
+        <w:t xml:space="preserve">`bh-benchmark-seed88109.golden.musicxml`</w:t>
+      </w:r>
+      <w:r>
+        <w:t xml:space="preserve"> (full export). </w:t>
+      </w:r>
+      <w:r>
+        <w:rPr>
+          <w:b/>
+          <w:bCs/>
+        </w:rPr>
+        <w:t xml:space="preserve">`bhGoldenMaster.test.ts`</w:t>
+      </w:r>
+      <w:r>
+        <w:t xml:space="preserve"> regenerates the golden path and asserts </w:t>
+      </w:r>
+      <w:r>
+        <w:rPr>
+          <w:b/>
+          <w:bCs/>
+        </w:rPr>
+        <w:t xml:space="preserve">byte-for-byte</w:t>
+      </w:r>
+      <w:r>
+        <w:t xml:space="preserve"> equality; event-by-event diff on JSON failure. This snapshot is the </w:t>
+      </w:r>
+      <w:r>
+        <w:rPr>
+          <w:b/>
+          <w:bCs/>
+        </w:rPr>
+        <w:t xml:space="preserve">equivalence oracle</w:t>
+      </w:r>
+      <w:r>
+        <w:t xml:space="preserve"> for the refactor — </w:t>
+      </w:r>
+      <w:r>
+        <w:rPr>
+          <w:b/>
+          <w:bCs/>
+        </w:rPr>
+        <w:t xml:space="preserve">`runV81AutoValidation.ts`</w:t>
+      </w:r>
+      <w:r>
+        <w:t xml:space="preserve">, </w:t>
+      </w:r>
+      <w:r>
+        <w:rPr>
+          <w:b/>
+          <w:bCs/>
+        </w:rPr>
+        <w:t xml:space="preserve">`runV85Phase3AutoValidation.ts`</w:t>
+      </w:r>
+      <w:r>
+        <w:t xml:space="preserve">, and eval scripts are </w:t>
+      </w:r>
+      <w:r>
+        <w:rPr>
+          <w:b/>
+          <w:bCs/>
+        </w:rPr>
+        <w:t xml:space="preserve">secondary confidence checks</w:t>
+      </w:r>
+      <w:r>
+        <w:t xml:space="preserve">, not proof of identity. </w:t>
+      </w:r>
+      <w:r>
+        <w:rPr>
+          <w:b/>
+          <w:bCs/>
+        </w:rPr>
+        <w:t xml:space="preserve">FROZEN:</w:t>
+      </w:r>
+      <w:r>
+        <w:t xml:space="preserve"> regenerate fixtures only in a commit whose stated purpose is changing BH output.</w:t>
+      </w:r>
+    </w:p>
+    <w:p>
+      <w:pPr>
+        <w:spacing w:after="160"/>
+      </w:pPr>
+      <w:r>
+        <w:rPr>
+          <w:b/>
+          <w:bCs/>
+        </w:rPr>
+        <w:t xml:space="preserve">And-of-1 passing diminished (V83e+f):</w:t>
+      </w:r>
+      <w:r>
+        <w:t xml:space="preserve"> On </w:t>
+      </w:r>
+      <w:r>
+        <w:rPr>
+          <w:b/>
+          <w:bCs/>
+        </w:rPr>
+        <w:t xml:space="preserve">`guitar_bass_duo`</w:t>
+      </w:r>
+      <w:r>
+        <w:t xml:space="preserve">, BH chord-melody can insert </w:t>
+      </w:r>
+      <w:r>
+        <w:rPr>
+          <w:b/>
+          <w:bCs/>
+        </w:rPr>
+        <w:t xml:space="preserve">profile-gated</w:t>
+      </w:r>
+      <w:r>
+        <w:t xml:space="preserve"> passing </w:t>
+      </w:r>
+      <w:r>
+        <w:rPr>
+          <w:b/>
+          <w:bCs/>
+        </w:rPr>
+        <w:t xml:space="preserve">diminished 7th</w:t>
+      </w:r>
+      <w:r>
+        <w:t xml:space="preserve"> grips on the </w:t>
+      </w:r>
+      <w:r>
+        <w:rPr>
+          <w:b/>
+          <w:bCs/>
+        </w:rPr>
+        <w:t xml:space="preserve">and of beat 1</w:t>
+      </w:r>
+      <w:r>
+        <w:t xml:space="preserve"> — engine onset </w:t>
+      </w:r>
+      <w:r>
+        <w:rPr>
+          <w:b/>
+          <w:bCs/>
+        </w:rPr>
+        <w:t xml:space="preserve">0.5</w:t>
+      </w:r>
+      <w:r>
+        <w:t xml:space="preserve">, MusicXML </w:t>
+      </w:r>
+      <w:r>
+        <w:rPr>
+          <w:b/>
+          <w:bCs/>
+        </w:rPr>
+        <w:t xml:space="preserve">240/480</w:t>
+      </w:r>
+      <w:r>
+        <w:t xml:space="preserve"> divisions (eighth note after the downbeat). Eligible when passing motion resolves into </w:t>
+      </w:r>
+      <w:r>
+        <w:rPr>
+          <w:b/>
+          <w:bCs/>
+        </w:rPr>
+        <w:t xml:space="preserve">beat 2</w:t>
+      </w:r>
+      <w:r>
+        <w:t xml:space="preserve">; typically </w:t>
+      </w:r>
+      <w:r>
+        <w:rPr>
+          <w:b/>
+          <w:bCs/>
+        </w:rPr>
+        <w:t xml:space="preserve">3–5</w:t>
+      </w:r>
+      <w:r>
+        <w:t xml:space="preserve"> bars per chart, driven by </w:t>
+      </w:r>
+      <w:r>
+        <w:rPr>
+          <w:b/>
+          <w:bCs/>
+        </w:rPr>
+        <w:t xml:space="preserve">`offbeatPassingDimBias`</w:t>
+      </w:r>
+      <w:r>
+        <w:t xml:space="preserve"> on the melody rhythm profile (</w:t>
+      </w:r>
+      <w:r>
+        <w:rPr>
+          <w:b/>
+          <w:bCs/>
+        </w:rPr>
+        <w:t xml:space="preserve">bebop_step</w:t>
       </w:r>
       <w:r>
         <w:t xml:space="preserve"> </w:t>
@@ -13959,125 +14310,60 @@
           <w:b/>
           <w:bCs/>
         </w:rPr>
-        <w:t xml:space="preserve">`triplet_pickup`</w:t>
-      </w:r>
-      <w:r>
-        <w:t xml:space="preserve"> did not fire on the benchmark fixture (triplet cap conservative); recurring delayed starts around beat </w:t>
-      </w:r>
-      <w:r>
-        <w:rPr>
-          <w:b/>
-          <w:bCs/>
-        </w:rPr>
-        <w:t xml:space="preserve">1.5</w:t>
-      </w:r>
-      <w:r>
-        <w:t xml:space="preserve"> — candidate anti-repeat weighting tweak.</w:t>
-      </w:r>
-    </w:p>
-    <w:p>
-      <w:pPr>
-        <w:spacing w:after="160"/>
-      </w:pPr>
-      <w:r>
-        <w:rPr>
-          <w:b/>
-          <w:bCs/>
-        </w:rPr>
-        <w:t xml:space="preserve">And-of-1 passing diminished (V83e+f):</w:t>
-      </w:r>
-      <w:r>
-        <w:t xml:space="preserve"> On </w:t>
-      </w:r>
-      <w:r>
-        <w:rPr>
-          <w:b/>
-          <w:bCs/>
-        </w:rPr>
-        <w:t xml:space="preserve">`guitar_bass_duo`</w:t>
-      </w:r>
-      <w:r>
-        <w:t xml:space="preserve">, BH chord-melody can insert </w:t>
-      </w:r>
-      <w:r>
-        <w:rPr>
-          <w:b/>
-          <w:bCs/>
-        </w:rPr>
-        <w:t xml:space="preserve">profile-gated</w:t>
-      </w:r>
-      <w:r>
-        <w:t xml:space="preserve"> passing </w:t>
-      </w:r>
-      <w:r>
-        <w:rPr>
-          <w:b/>
-          <w:bCs/>
-        </w:rPr>
-        <w:t xml:space="preserve">diminished 7th</w:t>
-      </w:r>
-      <w:r>
-        <w:t xml:space="preserve"> grips on the </w:t>
-      </w:r>
-      <w:r>
-        <w:rPr>
-          <w:b/>
-          <w:bCs/>
-        </w:rPr>
-        <w:t xml:space="preserve">and of beat 1</w:t>
-      </w:r>
-      <w:r>
-        <w:t xml:space="preserve"> — engine onset </w:t>
-      </w:r>
-      <w:r>
-        <w:rPr>
-          <w:b/>
-          <w:bCs/>
-        </w:rPr>
-        <w:t xml:space="preserve">0.5</w:t>
-      </w:r>
-      <w:r>
-        <w:t xml:space="preserve">, MusicXML </w:t>
-      </w:r>
-      <w:r>
-        <w:rPr>
-          <w:b/>
-          <w:bCs/>
-        </w:rPr>
-        <w:t xml:space="preserve">240/480</w:t>
-      </w:r>
-      <w:r>
-        <w:t xml:space="preserve"> divisions (eighth note after the downbeat). Eligible when passing motion resolves into </w:t>
-      </w:r>
-      <w:r>
-        <w:rPr>
-          <w:b/>
-          <w:bCs/>
-        </w:rPr>
-        <w:t xml:space="preserve">beat 2</w:t>
-      </w:r>
-      <w:r>
-        <w:t xml:space="preserve">; typically </w:t>
-      </w:r>
-      <w:r>
-        <w:rPr>
-          <w:b/>
-          <w:bCs/>
-        </w:rPr>
-        <w:t xml:space="preserve">3–5</w:t>
-      </w:r>
-      <w:r>
-        <w:t xml:space="preserve"> bars per chart, driven by </w:t>
-      </w:r>
-      <w:r>
-        <w:rPr>
-          <w:b/>
-          <w:bCs/>
-        </w:rPr>
-        <w:t xml:space="preserve">`offbeatPassingDimBias`</w:t>
-      </w:r>
-      <w:r>
-        <w:t xml:space="preserve"> on the melody rhythm profile. Export shows real </w:t>
+        <w:t xml:space="preserve">0.75</w:t>
+      </w:r>
+      <w:r>
+        <w:t xml:space="preserve">, </w:t>
+      </w:r>
+      <w:r>
+        <w:rPr>
+          <w:b/>
+          <w:bCs/>
+        </w:rPr>
+        <w:t xml:space="preserve">enclosure_heavy</w:t>
+      </w:r>
+      <w:r>
+        <w:t xml:space="preserve"> </w:t>
+      </w:r>
+      <w:r>
+        <w:rPr>
+          <w:b/>
+          <w:bCs/>
+        </w:rPr>
+        <w:t xml:space="preserve">0.85</w:t>
+      </w:r>
+      <w:r>
+        <w:t xml:space="preserve">, </w:t>
+      </w:r>
+      <w:r>
+        <w:rPr>
+          <w:b/>
+          <w:bCs/>
+        </w:rPr>
+        <w:t xml:space="preserve">scalar_embellish</w:t>
+      </w:r>
+      <w:r>
+        <w:t xml:space="preserve"> </w:t>
+      </w:r>
+      <w:r>
+        <w:rPr>
+          <w:b/>
+          <w:bCs/>
+        </w:rPr>
+        <w:t xml:space="preserve">0.35</w:t>
+      </w:r>
+      <w:r>
+        <w:t xml:space="preserve">; inactive below </w:t>
+      </w:r>
+      <w:r>
+        <w:rPr>
+          <w:b/>
+          <w:bCs/>
+        </w:rPr>
+        <w:t xml:space="preserve">0.35</w:t>
+      </w:r>
+      <w:r>
+        <w:t xml:space="preserve">). Export shows real </w:t>
       </w:r>
       <w:r>
         <w:rPr>

</xml_diff>

<commit_message>
V86 Commit 1b: extract BH rhythm/expression into shared core/premium-melody/ engine — byte-identical to 1a golden master, no behaviour change
Co-authored-by: Cursor <cursoragent@cursor.com>
</commit_message>
<xml_diff>
--- a/docs/COMPOSER_HANDBOOK.docx
+++ b/docs/COMPOSER_HANDBOOK.docx
@@ -14064,6 +14064,171 @@
       </w:r>
       <w:r>
         <w:t xml:space="preserve">.</w:t>
+      </w:r>
+    </w:p>
+    <w:p>
+      <w:pPr>
+        <w:spacing w:after="160"/>
+      </w:pPr>
+      <w:r>
+        <w:rPr>
+          <w:b/>
+          <w:bCs/>
+        </w:rPr>
+        <w:t xml:space="preserve">Shared premium-melody engine (V86 Commit 1b):</w:t>
+      </w:r>
+      <w:r>
+        <w:t xml:space="preserve"> BH melody rhythm + expression now run through </w:t>
+      </w:r>
+      <w:r>
+        <w:rPr>
+          <w:b/>
+          <w:bCs/>
+        </w:rPr>
+        <w:t xml:space="preserve">`engines/composer-os-v2/core/premium-melody/`</w:t>
+      </w:r>
+      <w:r>
+        <w:t xml:space="preserve"> — a profile-driven shared engine (</w:t>
+      </w:r>
+      <w:r>
+        <w:rPr>
+          <w:b/>
+          <w:bCs/>
+        </w:rPr>
+        <w:t xml:space="preserve">`enrichMelodyRhythm`</w:t>
+      </w:r>
+      <w:r>
+        <w:t xml:space="preserve">, </w:t>
+      </w:r>
+      <w:r>
+        <w:rPr>
+          <w:b/>
+          <w:bCs/>
+        </w:rPr>
+        <w:t xml:space="preserve">`enrichMelodyExpression`</w:t>
+      </w:r>
+      <w:r>
+        <w:t xml:space="preserve">, cell library, phrase detection, collision resolution, metrics). </w:t>
+      </w:r>
+      <w:r>
+        <w:rPr>
+          <w:b/>
+          <w:bCs/>
+        </w:rPr>
+        <w:t xml:space="preserve">Barry Harris</w:t>
+      </w:r>
+      <w:r>
+        <w:t xml:space="preserve"> is the first profile: </w:t>
+      </w:r>
+      <w:r>
+        <w:rPr>
+          <w:b/>
+          <w:bCs/>
+        </w:rPr>
+        <w:t xml:space="preserve">`buildBarryHarrisPremiumMelodyProfile`</w:t>
+      </w:r>
+      <w:r>
+        <w:t xml:space="preserve"> maps </w:t>
+      </w:r>
+      <w:r>
+        <w:rPr>
+          <w:b/>
+          <w:bCs/>
+        </w:rPr>
+        <w:t xml:space="preserve">`BhMelodyRhythmProfile`</w:t>
+      </w:r>
+      <w:r>
+        <w:t xml:space="preserve"> (syncopation / anticipation; </w:t>
+      </w:r>
+      <w:r>
+        <w:rPr>
+          <w:b/>
+          <w:bCs/>
+        </w:rPr>
+        <w:t xml:space="preserve">`offbeatPassingDimBias`</w:t>
+      </w:r>
+      <w:r>
+        <w:t xml:space="preserve"> stays BH-only for passing-dim) into the shared </w:t>
+      </w:r>
+      <w:r>
+        <w:rPr>
+          <w:b/>
+          <w:bCs/>
+        </w:rPr>
+        <w:t xml:space="preserve">`PremiumMelodyProfile`</w:t>
+      </w:r>
+      <w:r>
+        <w:t xml:space="preserve">. </w:t>
+      </w:r>
+      <w:r>
+        <w:rPr>
+          <w:b/>
+          <w:bCs/>
+        </w:rPr>
+        <w:t xml:space="preserve">`barry-harris/`</w:t>
+      </w:r>
+      <w:r>
+        <w:t xml:space="preserve"> re-exports the legacy surface (</w:t>
+      </w:r>
+      <w:r>
+        <w:rPr>
+          <w:b/>
+          <w:bCs/>
+        </w:rPr>
+        <w:t xml:space="preserve">`deriveBhMelodyRhythmSeed`</w:t>
+      </w:r>
+      <w:r>
+        <w:t xml:space="preserve">, </w:t>
+      </w:r>
+      <w:r>
+        <w:rPr>
+          <w:b/>
+          <w:bCs/>
+        </w:rPr>
+        <w:t xml:space="preserve">`BhCellFamily`</w:t>
+      </w:r>
+      <w:r>
+        <w:t xml:space="preserve">, validators unchanged). </w:t>
+      </w:r>
+      <w:r>
+        <w:rPr>
+          <w:b/>
+          <w:bCs/>
+        </w:rPr>
+        <w:t xml:space="preserve">Wayne Shorter</w:t>
+      </w:r>
+      <w:r>
+        <w:t xml:space="preserve"> is the planned first new plug-in (</w:t>
+      </w:r>
+      <w:r>
+        <w:rPr>
+          <w:b/>
+          <w:bCs/>
+        </w:rPr>
+        <w:t xml:space="preserve">V86 Commit 2</w:t>
+      </w:r>
+      <w:r>
+        <w:t xml:space="preserve">). Commit </w:t>
+      </w:r>
+      <w:r>
+        <w:rPr>
+          <w:b/>
+          <w:bCs/>
+        </w:rPr>
+        <w:t xml:space="preserve">1b</w:t>
+      </w:r>
+      <w:r>
+        <w:t xml:space="preserve"> is behaviour-preserving — output must stay byte-identical to the </w:t>
+      </w:r>
+      <w:r>
+        <w:rPr>
+          <w:b/>
+          <w:bCs/>
+        </w:rPr>
+        <w:t xml:space="preserve">1a</w:t>
+      </w:r>
+      <w:r>
+        <w:t xml:space="preserve"> golden master.</w:t>
       </w:r>
     </w:p>
     <w:p>

</xml_diff>

<commit_message>
V86 Commit 2-pre: widen premium-melody engine with BH-preserving hooks for Wayne — BH byte-identical, no behaviour change
Co-authored-by: Cursor <cursoragent@cursor.com>
</commit_message>
<xml_diff>
--- a/docs/COMPOSER_HANDBOOK.docx
+++ b/docs/COMPOSER_HANDBOOK.docx
@@ -14354,6 +14354,252 @@
       </w:r>
       <w:r>
         <w:t xml:space="preserve"> regenerate fixtures only in a commit whose stated purpose is changing BH output.</w:t>
+      </w:r>
+    </w:p>
+    <w:p>
+      <w:pPr>
+        <w:spacing w:after="160"/>
+      </w:pPr>
+      <w:r>
+        <w:rPr>
+          <w:b/>
+          <w:bCs/>
+        </w:rPr>
+        <w:t xml:space="preserve">Premium-melody engine hooks (V86 Commit 2-pre):</w:t>
+      </w:r>
+      <w:r>
+        <w:t xml:space="preserve"> </w:t>
+      </w:r>
+      <w:r>
+        <w:rPr>
+          <w:b/>
+          <w:bCs/>
+        </w:rPr>
+        <w:t xml:space="preserve">`PremiumMelodyProfile`</w:t>
+      </w:r>
+      <w:r>
+        <w:t xml:space="preserve"> exposes eight </w:t>
+      </w:r>
+      <w:r>
+        <w:rPr>
+          <w:b/>
+          <w:bCs/>
+        </w:rPr>
+        <w:t xml:space="preserve">optional</w:t>
+      </w:r>
+      <w:r>
+        <w:t xml:space="preserve"> hooks the shared engine reads via </w:t>
+      </w:r>
+      <w:r>
+        <w:rPr>
+          <w:rFonts w:ascii="Consolas" w:cs="Consolas" w:eastAsia="Consolas" w:hAnsi="Consolas"/>
+          <w:sz w:val="20"/>
+          <w:szCs w:val="20"/>
+        </w:rPr>
+        <w:t xml:space="preserve">profile.&lt;hook&gt; ?? &lt;BH default&gt;</w:t>
+      </w:r>
+      <w:r>
+        <w:t xml:space="preserve">. When a hook is absent, behaviour matches today's Barry Harris path exactly — </w:t>
+      </w:r>
+      <w:r>
+        <w:rPr>
+          <w:b/>
+          <w:bCs/>
+        </w:rPr>
+        <w:t xml:space="preserve">`buildBarryHarrisPremiumMelodyProfile`</w:t>
+      </w:r>
+      <w:r>
+        <w:t xml:space="preserve"> intentionally sets </w:t>
+      </w:r>
+      <w:r>
+        <w:rPr>
+          <w:b/>
+          <w:bCs/>
+        </w:rPr>
+        <w:t xml:space="preserve">none</w:t>
+      </w:r>
+      <w:r>
+        <w:t xml:space="preserve"> of them so BH proves the defaults. Hook roster: </w:t>
+      </w:r>
+      <w:r>
+        <w:rPr>
+          <w:b/>
+          <w:bCs/>
+        </w:rPr>
+        <w:t xml:space="preserve">`offbeatTrimCeiling`</w:t>
+      </w:r>
+      <w:r>
+        <w:t xml:space="preserve"> (default </w:t>
+      </w:r>
+      <w:r>
+        <w:rPr>
+          <w:b/>
+          <w:bCs/>
+        </w:rPr>
+        <w:t xml:space="preserve">0.74</w:t>
+      </w:r>
+      <w:r>
+        <w:t xml:space="preserve"> trim ceiling) · </w:t>
+      </w:r>
+      <w:r>
+        <w:rPr>
+          <w:b/>
+          <w:bCs/>
+        </w:rPr>
+        <w:t xml:space="preserve">`barSlotNudgesEnabled`</w:t>
+      </w:r>
+      <w:r>
+        <w:t xml:space="preserve"> (default </w:t>
+      </w:r>
+      <w:r>
+        <w:rPr>
+          <w:b/>
+          <w:bCs/>
+        </w:rPr>
+        <w:t xml:space="preserve">true</w:t>
+      </w:r>
+      <w:r>
+        <w:t xml:space="preserve">) · </w:t>
+      </w:r>
+      <w:r>
+        <w:rPr>
+          <w:b/>
+          <w:bCs/>
+        </w:rPr>
+        <w:t xml:space="preserve">`structuralLandingMode`</w:t>
+      </w:r>
+      <w:r>
+        <w:t xml:space="preserve"> (default </w:t>
+      </w:r>
+      <w:r>
+        <w:rPr>
+          <w:b/>
+          <w:bCs/>
+        </w:rPr>
+        <w:t xml:space="preserve">`bh_grounded`</w:t>
+      </w:r>
+      <w:r>
+        <w:t xml:space="preserve"> beat-1/3 landing) · </w:t>
+      </w:r>
+      <w:r>
+        <w:rPr>
+          <w:b/>
+          <w:bCs/>
+        </w:rPr>
+        <w:t xml:space="preserve">`projectedOffbeatBlockThreshold`</w:t>
+      </w:r>
+      <w:r>
+        <w:t xml:space="preserve"> (default </w:t>
+      </w:r>
+      <w:r>
+        <w:rPr>
+          <w:b/>
+          <w:bCs/>
+        </w:rPr>
+        <w:t xml:space="preserve">0.72</w:t>
+      </w:r>
+      <w:r>
+        <w:t xml:space="preserve"> triplet cap) · </w:t>
+      </w:r>
+      <w:r>
+        <w:rPr>
+          <w:b/>
+          <w:bCs/>
+        </w:rPr>
+        <w:t xml:space="preserve">`restPhraseBreakBeats`</w:t>
+      </w:r>
+      <w:r>
+        <w:t xml:space="preserve"> (default </w:t>
+      </w:r>
+      <w:r>
+        <w:rPr>
+          <w:b/>
+          <w:bCs/>
+        </w:rPr>
+        <w:t xml:space="preserve">1.75</w:t>
+      </w:r>
+      <w:r>
+        <w:t xml:space="preserve">) · </w:t>
+      </w:r>
+      <w:r>
+        <w:rPr>
+          <w:b/>
+          <w:bCs/>
+        </w:rPr>
+        <w:t xml:space="preserve">`longNotePhraseBreakBeats`</w:t>
+      </w:r>
+      <w:r>
+        <w:t xml:space="preserve"> (default </w:t>
+      </w:r>
+      <w:r>
+        <w:rPr>
+          <w:b/>
+          <w:bCs/>
+        </w:rPr>
+        <w:t xml:space="preserve">1.25</w:t>
+      </w:r>
+      <w:r>
+        <w:t xml:space="preserve">) · </w:t>
+      </w:r>
+      <w:r>
+        <w:rPr>
+          <w:b/>
+          <w:bCs/>
+        </w:rPr>
+        <w:t xml:space="preserve">`expressionCharacter`</w:t>
+      </w:r>
+      <w:r>
+        <w:t xml:space="preserve"> (default </w:t>
+      </w:r>
+      <w:r>
+        <w:rPr>
+          <w:b/>
+          <w:bCs/>
+        </w:rPr>
+        <w:t xml:space="preserve">`bh_bebop`</w:t>
+      </w:r>
+      <w:r>
+        <w:t xml:space="preserve"> articulation/velocity arc) · </w:t>
+      </w:r>
+      <w:r>
+        <w:rPr>
+          <w:b/>
+          <w:bCs/>
+        </w:rPr>
+        <w:t xml:space="preserve">`rhythmSeedSalt`</w:t>
+      </w:r>
+      <w:r>
+        <w:t xml:space="preserve"> (default </w:t>
+      </w:r>
+      <w:r>
+        <w:rPr>
+          <w:b/>
+          <w:bCs/>
+        </w:rPr>
+        <w:t xml:space="preserve">0</w:t>
+      </w:r>
+      <w:r>
+        <w:t xml:space="preserve">). </w:t>
+      </w:r>
+      <w:r>
+        <w:rPr>
+          <w:b/>
+          <w:bCs/>
+        </w:rPr>
+        <w:t xml:space="preserve">Wayne Shorter</w:t>
+      </w:r>
+      <w:r>
+        <w:t xml:space="preserve"> (V86 Commit </w:t>
+      </w:r>
+      <w:r>
+        <w:rPr>
+          <w:b/>
+          <w:bCs/>
+        </w:rPr>
+        <w:t xml:space="preserve">2a–2c</w:t>
+      </w:r>
+      <w:r>
+        <w:t xml:space="preserve">) will be the first composer profile to override selected hooks; no Wayne wiring in 2-pre.</w:t>
       </w:r>
     </w:p>
     <w:p>

</xml_diff>

<commit_message>
V86 Commit 2-pre-2: add float_preserve + modal_lyric engine branches + pinPremiumMelodyExport — BH byte-identical, no behaviour change
Co-authored-by: Cursor <cursoragent@cursor.com>
</commit_message>
<xml_diff>
--- a/docs/COMPOSER_HANDBOOK.docx
+++ b/docs/COMPOSER_HANDBOOK.docx
@@ -14600,6 +14600,244 @@
       </w:r>
       <w:r>
         <w:t xml:space="preserve">) will be the first composer profile to override selected hooks; no Wayne wiring in 2-pre.</w:t>
+      </w:r>
+    </w:p>
+    <w:p>
+      <w:pPr>
+        <w:spacing w:after="160"/>
+      </w:pPr>
+      <w:r>
+        <w:rPr>
+          <w:b/>
+          <w:bCs/>
+        </w:rPr>
+        <w:t xml:space="preserve">Premium-melody engine enum branches (V86 Commit 2-pre-2):</w:t>
+      </w:r>
+      <w:r>
+        <w:t xml:space="preserve"> Two new </w:t>
+      </w:r>
+      <w:r>
+        <w:rPr>
+          <w:b/>
+          <w:bCs/>
+        </w:rPr>
+        <w:t xml:space="preserve">engine-only</w:t>
+      </w:r>
+      <w:r>
+        <w:t xml:space="preserve"> enum values on the shared surface — not set by BH today. </w:t>
+      </w:r>
+      <w:r>
+        <w:rPr>
+          <w:b/>
+          <w:bCs/>
+        </w:rPr>
+        <w:t xml:space="preserve">`structuralLandingMode`</w:t>
+      </w:r>
+      <w:r>
+        <w:t xml:space="preserve">: </w:t>
+      </w:r>
+      <w:r>
+        <w:rPr>
+          <w:b/>
+          <w:bCs/>
+        </w:rPr>
+        <w:t xml:space="preserve">`float_preserve`</w:t>
+      </w:r>
+      <w:r>
+        <w:t xml:space="preserve"> keeps imported onsets on phrase starts/ends instead of snapping to beat </w:t>
+      </w:r>
+      <w:r>
+        <w:rPr>
+          <w:b/>
+          <w:bCs/>
+        </w:rPr>
+        <w:t xml:space="preserve">1</w:t>
+      </w:r>
+      <w:r>
+        <w:t xml:space="preserve">/</w:t>
+      </w:r>
+      <w:r>
+        <w:rPr>
+          <w:b/>
+          <w:bCs/>
+        </w:rPr>
+        <w:t xml:space="preserve">3</w:t>
+      </w:r>
+      <w:r>
+        <w:t xml:space="preserve"> (</w:t>
+      </w:r>
+      <w:r>
+        <w:rPr>
+          <w:rFonts w:ascii="Consolas" w:cs="Consolas" w:eastAsia="Consolas" w:hAnsi="Consolas"/>
+          <w:sz w:val="20"/>
+          <w:szCs w:val="20"/>
+        </w:rPr>
+        <w:t xml:space="preserve">structuralLandingOnset</w:t>
+      </w:r>
+      <w:r>
+        <w:t xml:space="preserve"> in </w:t>
+      </w:r>
+      <w:r>
+        <w:rPr>
+          <w:b/>
+          <w:bCs/>
+        </w:rPr>
+        <w:t xml:space="preserve">`premiumMelodyPhrase.ts`</w:t>
+      </w:r>
+      <w:r>
+        <w:t xml:space="preserve">); default </w:t>
+      </w:r>
+      <w:r>
+        <w:rPr>
+          <w:b/>
+          <w:bCs/>
+        </w:rPr>
+        <w:t xml:space="preserve">`bh_grounded`</w:t>
+      </w:r>
+      <w:r>
+        <w:t xml:space="preserve"> unchanged. </w:t>
+      </w:r>
+      <w:r>
+        <w:rPr>
+          <w:b/>
+          <w:bCs/>
+        </w:rPr>
+        <w:t xml:space="preserve">`expressionCharacter`</w:t>
+      </w:r>
+      <w:r>
+        <w:t xml:space="preserve">: </w:t>
+      </w:r>
+      <w:r>
+        <w:rPr>
+          <w:b/>
+          <w:bCs/>
+        </w:rPr>
+        <w:t xml:space="preserve">`modal_lyric`</w:t>
+      </w:r>
+      <w:r>
+        <w:t xml:space="preserve"> applies a softer provisional velocity arc and lighter articulation weighting (</w:t>
+      </w:r>
+      <w:r>
+        <w:rPr>
+          <w:rFonts w:ascii="Consolas" w:cs="Consolas" w:eastAsia="Consolas" w:hAnsi="Consolas"/>
+          <w:sz w:val="20"/>
+          <w:szCs w:val="20"/>
+        </w:rPr>
+        <w:t xml:space="preserve">enrichMelodyExpression.ts</w:t>
+      </w:r>
+      <w:r>
+        <w:t xml:space="preserve"> — values marked </w:t>
+      </w:r>
+      <w:r>
+        <w:rPr>
+          <w:b/>
+          <w:bCs/>
+        </w:rPr>
+        <w:t xml:space="preserve">PROVISIONAL</w:t>
+      </w:r>
+      <w:r>
+        <w:t xml:space="preserve"> for Wayne </w:t>
+      </w:r>
+      <w:r>
+        <w:rPr>
+          <w:b/>
+          <w:bCs/>
+        </w:rPr>
+        <w:t xml:space="preserve">2b</w:t>
+      </w:r>
+      <w:r>
+        <w:t xml:space="preserve"> tuning); default </w:t>
+      </w:r>
+      <w:r>
+        <w:rPr>
+          <w:b/>
+          <w:bCs/>
+        </w:rPr>
+        <w:t xml:space="preserve">`bh_bebop`</w:t>
+      </w:r>
+      <w:r>
+        <w:t xml:space="preserve"> unchanged. </w:t>
+      </w:r>
+      <w:r>
+        <w:rPr>
+          <w:b/>
+          <w:bCs/>
+        </w:rPr>
+        <w:t xml:space="preserve">`pinPremiumMelodyExport`</w:t>
+      </w:r>
+      <w:r>
+        <w:t xml:space="preserve"> (</w:t>
+      </w:r>
+      <w:r>
+        <w:rPr>
+          <w:rFonts w:ascii="Consolas" w:cs="Consolas" w:eastAsia="Consolas" w:hAnsi="Consolas"/>
+          <w:sz w:val="20"/>
+          <w:szCs w:val="20"/>
+        </w:rPr>
+        <w:t xml:space="preserve">premiumMelodyPin.ts</w:t>
+      </w:r>
+      <w:r>
+        <w:t xml:space="preserve">, exported from </w:t>
+      </w:r>
+      <w:r>
+        <w:rPr>
+          <w:b/>
+          <w:bCs/>
+        </w:rPr>
+        <w:t xml:space="preserve">`core/premium-melody/index.ts`</w:t>
+      </w:r>
+      <w:r>
+        <w:t xml:space="preserve">) pins rhythm + expression-enriched melody (pitch, onset, duration, articulation, velocity, </w:t>
+      </w:r>
+      <w:r>
+        <w:rPr>
+          <w:b/>
+          <w:bCs/>
+        </w:rPr>
+        <w:t xml:space="preserve">`durationAccent`</w:t>
+      </w:r>
+      <w:r>
+        <w:t xml:space="preserve">) onto a score part — for </w:t>
+      </w:r>
+      <w:r>
+        <w:rPr>
+          <w:b/>
+          <w:bCs/>
+        </w:rPr>
+        <w:t xml:space="preserve">non-chord-melody</w:t>
+      </w:r>
+      <w:r>
+        <w:t xml:space="preserve"> style-transfer composers; BH chord-melody continues to use </w:t>
+      </w:r>
+      <w:r>
+        <w:rPr>
+          <w:b/>
+          <w:bCs/>
+        </w:rPr>
+        <w:t xml:space="preserve">`applyChordMelodyToScore`</w:t>
+      </w:r>
+      <w:r>
+        <w:t xml:space="preserve">. </w:t>
+      </w:r>
+      <w:r>
+        <w:rPr>
+          <w:b/>
+          <w:bCs/>
+        </w:rPr>
+        <w:t xml:space="preserve">Wayne Shorter</w:t>
+      </w:r>
+      <w:r>
+        <w:t xml:space="preserve"> is first consumer (</w:t>
+      </w:r>
+      <w:r>
+        <w:rPr>
+          <w:b/>
+          <w:bCs/>
+        </w:rPr>
+        <w:t xml:space="preserve">V86 Commit 2a</w:t>
+      </w:r>
+      <w:r>
+        <w:t xml:space="preserve">).</w:t>
       </w:r>
     </w:p>
     <w:p>

</xml_diff>

<commit_message>
V86 Commit 2a: Wayne Shorter golden-master baseline (isolation, provisional profile) — BH byte-identical
Co-authored-by: Cursor <cursoragent@cursor.com>
</commit_message>
<xml_diff>
--- a/docs/COMPOSER_HANDBOOK.docx
+++ b/docs/COMPOSER_HANDBOOK.docx
@@ -14817,7 +14817,223 @@
         <w:t xml:space="preserve">`applyChordMelodyToScore`</w:t>
       </w:r>
       <w:r>
-        <w:t xml:space="preserve">. </w:t>
+        <w:t xml:space="preserve">.</w:t>
+      </w:r>
+    </w:p>
+    <w:p>
+      <w:pPr>
+        <w:spacing w:after="160"/>
+      </w:pPr>
+      <w:r>
+        <w:rPr>
+          <w:b/>
+          <w:bCs/>
+        </w:rPr>
+        <w:t xml:space="preserve">Wayne Shorter golden-master baseline (V86 Commit 2a — PROVISIONAL):</w:t>
+      </w:r>
+      <w:r>
+        <w:t xml:space="preserve"> Wayne's first premium-melody snapshot is </w:t>
+      </w:r>
+      <w:r>
+        <w:rPr>
+          <w:b/>
+          <w:bCs/>
+        </w:rPr>
+        <w:t xml:space="preserve">isolation/determinism only</w:t>
+      </w:r>
+      <w:r>
+        <w:t xml:space="preserve"> — seed </w:t>
+      </w:r>
+      <w:r>
+        <w:rPr>
+          <w:b/>
+          <w:bCs/>
+        </w:rPr>
+        <w:t xml:space="preserve">90217</w:t>
+      </w:r>
+      <w:r>
+        <w:t xml:space="preserve">, profile </w:t>
+      </w:r>
+      <w:r>
+        <w:rPr>
+          <w:b/>
+          <w:bCs/>
+        </w:rPr>
+        <w:t xml:space="preserve">`ws_isolation_provisional`</w:t>
+      </w:r>
+      <w:r>
+        <w:t xml:space="preserve">, fixtures </w:t>
+      </w:r>
+      <w:r>
+        <w:rPr>
+          <w:b/>
+          <w:bCs/>
+        </w:rPr>
+        <w:t xml:space="preserve">`ws-isolation-seed90217.golden.json`</w:t>
+      </w:r>
+      <w:r>
+        <w:t xml:space="preserve"> + </w:t>
+      </w:r>
+      <w:r>
+        <w:rPr>
+          <w:b/>
+          <w:bCs/>
+        </w:rPr>
+        <w:t xml:space="preserve">`.golden.musicxml`</w:t>
+      </w:r>
+      <w:r>
+        <w:t xml:space="preserve">, test </w:t>
+      </w:r>
+      <w:r>
+        <w:rPr>
+          <w:b/>
+          <w:bCs/>
+        </w:rPr>
+        <w:t xml:space="preserve">`wayneGoldenMaster.test.ts`</w:t>
+      </w:r>
+      <w:r>
+        <w:t xml:space="preserve">. Input </w:t>
+      </w:r>
+      <w:r>
+        <w:rPr>
+          <w:b/>
+          <w:bCs/>
+        </w:rPr>
+        <w:t xml:space="preserve">reuses BH benchmark pitches</w:t>
+      </w:r>
+      <w:r>
+        <w:t xml:space="preserve"> (</w:t>
+      </w:r>
+      <w:r>
+        <w:rPr>
+          <w:rFonts w:ascii="Consolas" w:cs="Consolas" w:eastAsia="Consolas" w:hAnsi="Consolas"/>
+          <w:sz w:val="20"/>
+          <w:szCs w:val="20"/>
+        </w:rPr>
+        <w:t xml:space="preserve">BH_Benchmark_JazzMelody.musicxml</w:t>
+      </w:r>
+      <w:r>
+        <w:t xml:space="preserve">); this is </w:t>
+      </w:r>
+      <w:r>
+        <w:rPr>
+          <w:b/>
+          <w:bCs/>
+        </w:rPr>
+        <w:t xml:space="preserve">not</w:t>
+      </w:r>
+      <w:r>
+        <w:t xml:space="preserve"> Wayne-authentic modal material (native modal benchmark lands in </w:t>
+      </w:r>
+      <w:r>
+        <w:rPr>
+          <w:b/>
+          <w:bCs/>
+        </w:rPr>
+        <w:t xml:space="preserve">2c</w:t>
+      </w:r>
+      <w:r>
+        <w:t xml:space="preserve">). Feel/thresholds (</w:t>
+      </w:r>
+      <w:r>
+        <w:rPr>
+          <w:b/>
+          <w:bCs/>
+        </w:rPr>
+        <w:t xml:space="preserve">`syncopationShiftRate`</w:t>
+      </w:r>
+      <w:r>
+        <w:t xml:space="preserve">, </w:t>
+      </w:r>
+      <w:r>
+        <w:rPr>
+          <w:b/>
+          <w:bCs/>
+        </w:rPr>
+        <w:t xml:space="preserve">`offbeatTrimCeiling`</w:t>
+      </w:r>
+      <w:r>
+        <w:t xml:space="preserve">, </w:t>
+      </w:r>
+      <w:r>
+        <w:rPr>
+          <w:b/>
+          <w:bCs/>
+        </w:rPr>
+        <w:t xml:space="preserve">`modal_lyric`</w:t>
+      </w:r>
+      <w:r>
+        <w:t xml:space="preserve"> expression) are </w:t>
+      </w:r>
+      <w:r>
+        <w:rPr>
+          <w:b/>
+          <w:bCs/>
+        </w:rPr>
+        <w:t xml:space="preserve">PROVISIONAL</w:t>
+      </w:r>
+      <w:r>
+        <w:t xml:space="preserve"> — tuned in </w:t>
+      </w:r>
+      <w:r>
+        <w:rPr>
+          <w:b/>
+          <w:bCs/>
+        </w:rPr>
+        <w:t xml:space="preserve">2b</w:t>
+      </w:r>
+      <w:r>
+        <w:t xml:space="preserve">; fixture re-approved in </w:t>
+      </w:r>
+      <w:r>
+        <w:rPr>
+          <w:b/>
+          <w:bCs/>
+        </w:rPr>
+        <w:t xml:space="preserve">2b</w:t>
+      </w:r>
+      <w:r>
+        <w:t xml:space="preserve"> and </w:t>
+      </w:r>
+      <w:r>
+        <w:rPr>
+          <w:b/>
+          <w:bCs/>
+        </w:rPr>
+        <w:t xml:space="preserve">2c</w:t>
+      </w:r>
+      <w:r>
+        <w:t xml:space="preserve">; </w:t>
+      </w:r>
+      <w:r>
+        <w:rPr>
+          <w:b/>
+          <w:bCs/>
+        </w:rPr>
+        <w:t xml:space="preserve">freezes for real only after 2c</w:t>
+      </w:r>
+      <w:r>
+        <w:t xml:space="preserve">. BH </w:t>
+      </w:r>
+      <w:r>
+        <w:rPr>
+          <w:b/>
+          <w:bCs/>
+        </w:rPr>
+        <w:t xml:space="preserve">1a</w:t>
+      </w:r>
+      <w:r>
+        <w:t xml:space="preserve"> golden master remains </w:t>
+      </w:r>
+      <w:r>
+        <w:rPr>
+          <w:b/>
+          <w:bCs/>
+        </w:rPr>
+        <w:t xml:space="preserve">FROZEN</w:t>
+      </w:r>
+      <w:r>
+        <w:t xml:space="preserve"> and byte-identical. </w:t>
       </w:r>
       <w:r>
         <w:rPr>

</xml_diff>

<commit_message>
V86 Commit 2b: Wayne modal-float profile + routing + validation — re-approve Wayne golden master.
Tune ws_isolation_provisional for modal float, wire shared premium-melody routing, add Wayne-specific validation thresholds. Wayne fixtures regenerated; BH 1a golden master byte-identical.

Co-authored-by: Cursor <cursoragent@cursor.com>
</commit_message>
<xml_diff>
--- a/docs/COMPOSER_HANDBOOK.docx
+++ b/docs/COMPOSER_HANDBOOK.docx
@@ -14365,7 +14365,7 @@
           <w:b/>
           <w:bCs/>
         </w:rPr>
-        <w:t xml:space="preserve">Premium-melody engine hooks (V86 Commit 2-pre):</w:t>
+        <w:t xml:space="preserve">Premium-melody engine hooks (V86 Commit 2-pre / 2b):</w:t>
       </w:r>
       <w:r>
         <w:t xml:space="preserve"> </w:t>
@@ -14378,7 +14378,7 @@
         <w:t xml:space="preserve">`PremiumMelodyProfile`</w:t>
       </w:r>
       <w:r>
-        <w:t xml:space="preserve"> exposes eight </w:t>
+        <w:t xml:space="preserve"> exposes </w:t>
       </w:r>
       <w:r>
         <w:rPr>
@@ -14579,6 +14579,36 @@
         <w:t xml:space="preserve">0</w:t>
       </w:r>
       <w:r>
+        <w:t xml:space="preserve">) · </w:t>
+      </w:r>
+      <w:r>
+        <w:rPr>
+          <w:b/>
+          <w:bCs/>
+        </w:rPr>
+        <w:t xml:space="preserve">`cellFamilyWeightScale`</w:t>
+      </w:r>
+      <w:r>
+        <w:t xml:space="preserve"> (default </w:t>
+      </w:r>
+      <w:r>
+        <w:rPr>
+          <w:b/>
+          <w:bCs/>
+        </w:rPr>
+        <w:t xml:space="preserve">undefined</w:t>
+      </w:r>
+      <w:r>
+        <w:t xml:space="preserve"> — per-family weight multiplier in cell selection; </w:t>
+      </w:r>
+      <w:r>
+        <w:rPr>
+          <w:b/>
+          <w:bCs/>
+        </w:rPr>
+        <w:t xml:space="preserve">2b</w:t>
+      </w:r>
+      <w:r>
         <w:t xml:space="preserve">). </w:t>
       </w:r>
       <w:r>
@@ -14599,7 +14629,7 @@
         <w:t xml:space="preserve">2a–2c</w:t>
       </w:r>
       <w:r>
-        <w:t xml:space="preserve">) will be the first composer profile to override selected hooks; no Wayne wiring in 2-pre.</w:t>
+        <w:t xml:space="preserve">) is the first composer profile to override selected hooks.</w:t>
       </w:r>
     </w:p>
     <w:p>
@@ -14829,20 +14859,10 @@
           <w:b/>
           <w:bCs/>
         </w:rPr>
-        <w:t xml:space="preserve">Wayne Shorter golden-master baseline (V86 Commit 2a — PROVISIONAL):</w:t>
-      </w:r>
-      <w:r>
-        <w:t xml:space="preserve"> Wayne's first premium-melody snapshot is </w:t>
-      </w:r>
-      <w:r>
-        <w:rPr>
-          <w:b/>
-          <w:bCs/>
-        </w:rPr>
-        <w:t xml:space="preserve">isolation/determinism only</w:t>
-      </w:r>
-      <w:r>
-        <w:t xml:space="preserve"> — seed </w:t>
+        <w:t xml:space="preserve">Wayne Shorter golden-master baseline (V86 Commit 2a/2b — PROVISIONAL):</w:t>
+      </w:r>
+      <w:r>
+        <w:t xml:space="preserve"> Wayne premium-melody snapshot — seed </w:t>
       </w:r>
       <w:r>
         <w:rPr>
@@ -14913,7 +14933,7 @@
         <w:t xml:space="preserve">BH_Benchmark_JazzMelody.musicxml</w:t>
       </w:r>
       <w:r>
-        <w:t xml:space="preserve">); this is </w:t>
+        <w:t xml:space="preserve">); </w:t>
       </w:r>
       <w:r>
         <w:rPr>
@@ -14933,14 +14953,24 @@
         <w:t xml:space="preserve">2c</w:t>
       </w:r>
       <w:r>
-        <w:t xml:space="preserve">). Feel/thresholds (</w:t>
-      </w:r>
-      <w:r>
-        <w:rPr>
-          <w:b/>
-          <w:bCs/>
-        </w:rPr>
-        <w:t xml:space="preserve">`syncopationShiftRate`</w:t>
+        <w:t xml:space="preserve">). </w:t>
+      </w:r>
+      <w:r>
+        <w:rPr>
+          <w:b/>
+          <w:bCs/>
+        </w:rPr>
+        <w:t xml:space="preserve">Commit 2b</w:t>
+      </w:r>
+      <w:r>
+        <w:t xml:space="preserve"> tuned modal float: </w:t>
+      </w:r>
+      <w:r>
+        <w:rPr>
+          <w:b/>
+          <w:bCs/>
+        </w:rPr>
+        <w:t xml:space="preserve">`syncopationShiftRate` 0.40</w:t>
       </w:r>
       <w:r>
         <w:t xml:space="preserve">, </w:t>
@@ -14950,7 +14980,7 @@
           <w:b/>
           <w:bCs/>
         </w:rPr>
-        <w:t xml:space="preserve">`offbeatTrimCeiling`</w:t>
+        <w:t xml:space="preserve">`anticipationBias` 0.30</w:t>
       </w:r>
       <w:r>
         <w:t xml:space="preserve">, </w:t>
@@ -14960,50 +14990,201 @@
           <w:b/>
           <w:bCs/>
         </w:rPr>
+        <w:t xml:space="preserve">`float_preserve`</w:t>
+      </w:r>
+      <w:r>
+        <w:t xml:space="preserve"> landing, </w:t>
+      </w:r>
+      <w:r>
+        <w:rPr>
+          <w:b/>
+          <w:bCs/>
+        </w:rPr>
         <w:t xml:space="preserve">`modal_lyric`</w:t>
       </w:r>
       <w:r>
-        <w:t xml:space="preserve"> expression) are </w:t>
-      </w:r>
-      <w:r>
-        <w:rPr>
-          <w:b/>
-          <w:bCs/>
-        </w:rPr>
-        <w:t xml:space="preserve">PROVISIONAL</w:t>
-      </w:r>
-      <w:r>
-        <w:t xml:space="preserve"> — tuned in </w:t>
-      </w:r>
-      <w:r>
-        <w:rPr>
-          <w:b/>
-          <w:bCs/>
-        </w:rPr>
-        <w:t xml:space="preserve">2b</w:t>
-      </w:r>
-      <w:r>
-        <w:t xml:space="preserve">; fixture re-approved in </w:t>
-      </w:r>
-      <w:r>
-        <w:rPr>
-          <w:b/>
-          <w:bCs/>
-        </w:rPr>
-        <w:t xml:space="preserve">2b</w:t>
-      </w:r>
-      <w:r>
-        <w:t xml:space="preserve"> and </w:t>
-      </w:r>
-      <w:r>
-        <w:rPr>
-          <w:b/>
-          <w:bCs/>
-        </w:rPr>
-        <w:t xml:space="preserve">2c</w:t>
-      </w:r>
-      <w:r>
-        <w:t xml:space="preserve">; </w:t>
+        <w:t xml:space="preserve"> expression, </w:t>
+      </w:r>
+      <w:r>
+        <w:rPr>
+          <w:b/>
+          <w:bCs/>
+        </w:rPr>
+        <w:t xml:space="preserve">`cellFamilyWeightScale`</w:t>
+      </w:r>
+      <w:r>
+        <w:t xml:space="preserve"> for </w:t>
+      </w:r>
+      <w:r>
+        <w:rPr>
+          <w:b/>
+          <w:bCs/>
+        </w:rPr>
+        <w:t xml:space="preserve">`long_gap`</w:t>
+      </w:r>
+      <w:r>
+        <w:t xml:space="preserve"> + </w:t>
+      </w:r>
+      <w:r>
+        <w:rPr>
+          <w:b/>
+          <w:bCs/>
+        </w:rPr>
+        <w:t xml:space="preserve">`delayed`</w:t>
+      </w:r>
+      <w:r>
+        <w:t xml:space="preserve"> dominance (</w:t>
+      </w:r>
+      <w:r>
+        <w:rPr>
+          <w:b/>
+          <w:bCs/>
+        </w:rPr>
+        <w:t xml:space="preserve">≥35%</w:t>
+      </w:r>
+      <w:r>
+        <w:t xml:space="preserve"> combined). Routing via </w:t>
+      </w:r>
+      <w:r>
+        <w:rPr>
+          <w:b/>
+          <w:bCs/>
+        </w:rPr>
+        <w:t xml:space="preserve">`premiumMelodyRouting.ts`</w:t>
+      </w:r>
+      <w:r>
+        <w:t xml:space="preserve"> (</w:t>
+      </w:r>
+      <w:r>
+        <w:rPr>
+          <w:rFonts w:ascii="Consolas" w:cs="Consolas" w:eastAsia="Consolas" w:hAnsi="Consolas"/>
+          <w:sz w:val="20"/>
+          <w:szCs w:val="20"/>
+        </w:rPr>
+        <w:t xml:space="preserve">runPremiumMelodyHarmonyRhythmExpressionPipeline</w:t>
+      </w:r>
+      <w:r>
+        <w:t xml:space="preserve"> + </w:t>
+      </w:r>
+      <w:r>
+        <w:rPr>
+          <w:b/>
+          <w:bCs/>
+        </w:rPr>
+        <w:t xml:space="preserve">`applyPremiumMelodyPinExport`</w:t>
+      </w:r>
+      <w:r>
+        <w:t xml:space="preserve"> in </w:t>
+      </w:r>
+      <w:r>
+        <w:rPr>
+          <w:b/>
+          <w:bCs/>
+        </w:rPr>
+        <w:t xml:space="preserve">`runGoldenPath.ts`</w:t>
+      </w:r>
+      <w:r>
+        <w:t xml:space="preserve">). Wayne validation (</w:t>
+      </w:r>
+      <w:r>
+        <w:rPr>
+          <w:b/>
+          <w:bCs/>
+        </w:rPr>
+        <w:t xml:space="preserve">`wsPremiumMelodyValidation.ts`</w:t>
+      </w:r>
+      <w:r>
+        <w:t xml:space="preserve">, </w:t>
+      </w:r>
+      <w:r>
+        <w:rPr>
+          <w:b/>
+          <w:bCs/>
+        </w:rPr>
+        <w:t xml:space="preserve">`runWsPremiumMelodyAutoValidation.ts`</w:t>
+      </w:r>
+      <w:r>
+        <w:t xml:space="preserve">): offbeat ratio </w:t>
+      </w:r>
+      <w:r>
+        <w:rPr>
+          <w:b/>
+          <w:bCs/>
+        </w:rPr>
+        <w:t xml:space="preserve">0.28–0.52</w:t>
+      </w:r>
+      <w:r>
+        <w:t xml:space="preserve">, IOI entropy </w:t>
+      </w:r>
+      <w:r>
+        <w:rPr>
+          <w:b/>
+          <w:bCs/>
+        </w:rPr>
+        <w:t xml:space="preserve">≥1.4</w:t>
+      </w:r>
+      <w:r>
+        <w:t xml:space="preserve">, velocity spread </w:t>
+      </w:r>
+      <w:r>
+        <w:rPr>
+          <w:b/>
+          <w:bCs/>
+        </w:rPr>
+        <w:t xml:space="preserve">4–12</w:t>
+      </w:r>
+      <w:r>
+        <w:t xml:space="preserve"> — </w:t>
+      </w:r>
+      <w:r>
+        <w:rPr>
+          <w:b/>
+          <w:bCs/>
+        </w:rPr>
+        <w:t xml:space="preserve">no</w:t>
+      </w:r>
+      <w:r>
+        <w:t xml:space="preserve"> BH phrase-density arc. Thresholds </w:t>
+      </w:r>
+      <w:r>
+        <w:rPr>
+          <w:b/>
+          <w:bCs/>
+        </w:rPr>
+        <w:t xml:space="preserve">provisional until 2c</w:t>
+      </w:r>
+      <w:r>
+        <w:t xml:space="preserve">. Fixture </w:t>
+      </w:r>
+      <w:r>
+        <w:rPr>
+          <w:b/>
+          <w:bCs/>
+        </w:rPr>
+        <w:t xml:space="preserve">re-approved in 2b</w:t>
+      </w:r>
+      <w:r>
+        <w:t xml:space="preserve"> (sha256 </w:t>
+      </w:r>
+      <w:r>
+        <w:rPr>
+          <w:b/>
+          <w:bCs/>
+        </w:rPr>
+        <w:t xml:space="preserve">ea18328efa6e</w:t>
+      </w:r>
+      <w:r>
+        <w:t xml:space="preserve"> / </w:t>
+      </w:r>
+      <w:r>
+        <w:rPr>
+          <w:b/>
+          <w:bCs/>
+        </w:rPr>
+        <w:t xml:space="preserve">d30df1a6f950</w:t>
+      </w:r>
+      <w:r>
+        <w:t xml:space="preserve">); </w:t>
       </w:r>
       <w:r>
         <w:rPr>
@@ -15023,7 +15204,7 @@
         <w:t xml:space="preserve">1a</w:t>
       </w:r>
       <w:r>
-        <w:t xml:space="preserve"> golden master remains </w:t>
+        <w:t xml:space="preserve"> golden master </w:t>
       </w:r>
       <w:r>
         <w:rPr>
@@ -15033,27 +15214,28 @@
         <w:t xml:space="preserve">FROZEN</w:t>
       </w:r>
       <w:r>
-        <w:t xml:space="preserve"> and byte-identical. </w:t>
-      </w:r>
-      <w:r>
-        <w:rPr>
-          <w:b/>
-          <w:bCs/>
-        </w:rPr>
-        <w:t xml:space="preserve">Wayne Shorter</w:t>
-      </w:r>
-      <w:r>
-        <w:t xml:space="preserve"> is first consumer (</w:t>
-      </w:r>
-      <w:r>
-        <w:rPr>
-          <w:b/>
-          <w:bCs/>
-        </w:rPr>
-        <w:t xml:space="preserve">V86 Commit 2a</w:t>
-      </w:r>
-      <w:r>
-        <w:t xml:space="preserve">).</w:t>
+        <w:t xml:space="preserve"> and byte-identical. QA export: </w:t>
+      </w:r>
+      <w:r>
+        <w:rPr>
+          <w:b/>
+          <w:bCs/>
+        </w:rPr>
+        <w:t xml:space="preserve">Song Mode</w:t>
+      </w:r>
+      <w:r>
+        <w:t xml:space="preserve"> / </w:t>
+      </w:r>
+      <w:r>
+        <w:rPr>
+          <w:rFonts w:ascii="Consolas" w:cs="Consolas" w:eastAsia="Consolas" w:hAnsi="Consolas"/>
+          <w:sz w:val="20"/>
+          <w:szCs w:val="20"/>
+        </w:rPr>
+        <w:t xml:space="preserve">ws-v86-2b-check.musicxml</w:t>
+      </w:r>
+      <w:r>
+        <w:t xml:space="preserve">.</w:t>
       </w:r>
     </w:p>
     <w:p>

</xml_diff>

<commit_message>
V86 Commit 2c: Wayne native modal benchmark + golden-master freeze.
Native WS_Benchmark_ModalMelody drives Wayne thresholds and frozen ws-modal-seed90217 oracle; BH golden master byte-identical.

Co-authored-by: Cursor <cursoragent@cursor.com>
</commit_message>
<xml_diff>
--- a/docs/COMPOSER_HANDBOOK.docx
+++ b/docs/COMPOSER_HANDBOOK.docx
@@ -14859,10 +14859,30 @@
           <w:b/>
           <w:bCs/>
         </w:rPr>
-        <w:t xml:space="preserve">Wayne Shorter golden-master baseline (V86 Commit 2a/2b — PROVISIONAL):</w:t>
-      </w:r>
-      <w:r>
-        <w:t xml:space="preserve"> Wayne premium-melody snapshot — seed </w:t>
+        <w:t xml:space="preserve">Wayne Shorter golden-master (V86 Commit 2c — FROZEN):</w:t>
+      </w:r>
+      <w:r>
+        <w:t xml:space="preserve"> Native modal benchmark </w:t>
+      </w:r>
+      <w:r>
+        <w:rPr>
+          <w:b/>
+          <w:bCs/>
+        </w:rPr>
+        <w:t xml:space="preserve">`WS_Benchmark_ModalMelody.musicxml`</w:t>
+      </w:r>
+      <w:r>
+        <w:t xml:space="preserve"> — original </w:t>
+      </w:r>
+      <w:r>
+        <w:rPr>
+          <w:b/>
+          <w:bCs/>
+        </w:rPr>
+        <w:t xml:space="preserve">8</w:t>
+      </w:r>
+      <w:r>
+        <w:t xml:space="preserve">-bar modal melody (floating sustains, compact bursts, space, intervallic pivots, long-range phrase arc). Wayne premium-melody snapshot — seed </w:t>
       </w:r>
       <w:r>
         <w:rPr>
@@ -14889,7 +14909,7 @@
           <w:b/>
           <w:bCs/>
         </w:rPr>
-        <w:t xml:space="preserve">`ws-isolation-seed90217.golden.json`</w:t>
+        <w:t xml:space="preserve">`ws-modal-seed90217.golden.json`</w:t>
       </w:r>
       <w:r>
         <w:t xml:space="preserve"> + </w:t>
@@ -14912,14 +14932,94 @@
         <w:t xml:space="preserve">`wayneGoldenMaster.test.ts`</w:t>
       </w:r>
       <w:r>
-        <w:t xml:space="preserve">. Input </w:t>
-      </w:r>
-      <w:r>
-        <w:rPr>
-          <w:b/>
-          <w:bCs/>
-        </w:rPr>
-        <w:t xml:space="preserve">reuses BH benchmark pitches</w:t>
+        <w:t xml:space="preserve">. </w:t>
+      </w:r>
+      <w:r>
+        <w:rPr>
+          <w:b/>
+          <w:bCs/>
+        </w:rPr>
+        <w:t xml:space="preserve">Commit 2b</w:t>
+      </w:r>
+      <w:r>
+        <w:t xml:space="preserve"> tuned modal float: </w:t>
+      </w:r>
+      <w:r>
+        <w:rPr>
+          <w:b/>
+          <w:bCs/>
+        </w:rPr>
+        <w:t xml:space="preserve">`syncopationShiftRate` 0.40</w:t>
+      </w:r>
+      <w:r>
+        <w:t xml:space="preserve">, </w:t>
+      </w:r>
+      <w:r>
+        <w:rPr>
+          <w:b/>
+          <w:bCs/>
+        </w:rPr>
+        <w:t xml:space="preserve">`anticipationBias` 0.30</w:t>
+      </w:r>
+      <w:r>
+        <w:t xml:space="preserve">, </w:t>
+      </w:r>
+      <w:r>
+        <w:rPr>
+          <w:b/>
+          <w:bCs/>
+        </w:rPr>
+        <w:t xml:space="preserve">`float_preserve`</w:t>
+      </w:r>
+      <w:r>
+        <w:t xml:space="preserve"> landing, </w:t>
+      </w:r>
+      <w:r>
+        <w:rPr>
+          <w:b/>
+          <w:bCs/>
+        </w:rPr>
+        <w:t xml:space="preserve">`modal_lyric`</w:t>
+      </w:r>
+      <w:r>
+        <w:t xml:space="preserve"> expression, </w:t>
+      </w:r>
+      <w:r>
+        <w:rPr>
+          <w:b/>
+          <w:bCs/>
+        </w:rPr>
+        <w:t xml:space="preserve">`cellFamilyWeightScale`</w:t>
+      </w:r>
+      <w:r>
+        <w:t xml:space="preserve"> for </w:t>
+      </w:r>
+      <w:r>
+        <w:rPr>
+          <w:b/>
+          <w:bCs/>
+        </w:rPr>
+        <w:t xml:space="preserve">`long_gap`</w:t>
+      </w:r>
+      <w:r>
+        <w:t xml:space="preserve"> + </w:t>
+      </w:r>
+      <w:r>
+        <w:rPr>
+          <w:b/>
+          <w:bCs/>
+        </w:rPr>
+        <w:t xml:space="preserve">`delayed`</w:t>
+      </w:r>
+      <w:r>
+        <w:t xml:space="preserve">. Routing via </w:t>
+      </w:r>
+      <w:r>
+        <w:rPr>
+          <w:b/>
+          <w:bCs/>
+        </w:rPr>
+        <w:t xml:space="preserve">`premiumMelodyRouting.ts`</w:t>
       </w:r>
       <w:r>
         <w:t xml:space="preserve"> (</w:t>
@@ -14930,47 +15030,37 @@
           <w:sz w:val="20"/>
           <w:szCs w:val="20"/>
         </w:rPr>
-        <w:t xml:space="preserve">BH_Benchmark_JazzMelody.musicxml</w:t>
-      </w:r>
-      <w:r>
-        <w:t xml:space="preserve">); </w:t>
-      </w:r>
-      <w:r>
-        <w:rPr>
-          <w:b/>
-          <w:bCs/>
-        </w:rPr>
-        <w:t xml:space="preserve">not</w:t>
-      </w:r>
-      <w:r>
-        <w:t xml:space="preserve"> Wayne-authentic modal material (native modal benchmark lands in </w:t>
-      </w:r>
-      <w:r>
-        <w:rPr>
-          <w:b/>
-          <w:bCs/>
-        </w:rPr>
-        <w:t xml:space="preserve">2c</w:t>
-      </w:r>
-      <w:r>
-        <w:t xml:space="preserve">). </w:t>
-      </w:r>
-      <w:r>
-        <w:rPr>
-          <w:b/>
-          <w:bCs/>
-        </w:rPr>
-        <w:t xml:space="preserve">Commit 2b</w:t>
-      </w:r>
-      <w:r>
-        <w:t xml:space="preserve"> tuned modal float: </w:t>
-      </w:r>
-      <w:r>
-        <w:rPr>
-          <w:b/>
-          <w:bCs/>
-        </w:rPr>
-        <w:t xml:space="preserve">`syncopationShiftRate` 0.40</w:t>
+        <w:t xml:space="preserve">runPremiumMelodyHarmonyRhythmExpressionPipeline</w:t>
+      </w:r>
+      <w:r>
+        <w:t xml:space="preserve"> + </w:t>
+      </w:r>
+      <w:r>
+        <w:rPr>
+          <w:b/>
+          <w:bCs/>
+        </w:rPr>
+        <w:t xml:space="preserve">`applyPremiumMelodyPinExport`</w:t>
+      </w:r>
+      <w:r>
+        <w:t xml:space="preserve"> in </w:t>
+      </w:r>
+      <w:r>
+        <w:rPr>
+          <w:b/>
+          <w:bCs/>
+        </w:rPr>
+        <w:t xml:space="preserve">`runGoldenPath.ts`</w:t>
+      </w:r>
+      <w:r>
+        <w:t xml:space="preserve">). Wayne validation (</w:t>
+      </w:r>
+      <w:r>
+        <w:rPr>
+          <w:b/>
+          <w:bCs/>
+        </w:rPr>
+        <w:t xml:space="preserve">`wsPremiumMelodyValidation.ts`</w:t>
       </w:r>
       <w:r>
         <w:t xml:space="preserve">, </w:t>
@@ -14980,80 +15070,90 @@
           <w:b/>
           <w:bCs/>
         </w:rPr>
-        <w:t xml:space="preserve">`anticipationBias` 0.30</w:t>
-      </w:r>
-      <w:r>
-        <w:t xml:space="preserve">, </w:t>
-      </w:r>
-      <w:r>
-        <w:rPr>
-          <w:b/>
-          <w:bCs/>
-        </w:rPr>
-        <w:t xml:space="preserve">`float_preserve`</w:t>
-      </w:r>
-      <w:r>
-        <w:t xml:space="preserve"> landing, </w:t>
-      </w:r>
-      <w:r>
-        <w:rPr>
-          <w:b/>
-          <w:bCs/>
-        </w:rPr>
-        <w:t xml:space="preserve">`modal_lyric`</w:t>
-      </w:r>
-      <w:r>
-        <w:t xml:space="preserve"> expression, </w:t>
-      </w:r>
-      <w:r>
-        <w:rPr>
-          <w:b/>
-          <w:bCs/>
-        </w:rPr>
-        <w:t xml:space="preserve">`cellFamilyWeightScale`</w:t>
-      </w:r>
-      <w:r>
-        <w:t xml:space="preserve"> for </w:t>
-      </w:r>
-      <w:r>
-        <w:rPr>
-          <w:b/>
-          <w:bCs/>
-        </w:rPr>
-        <w:t xml:space="preserve">`long_gap`</w:t>
-      </w:r>
-      <w:r>
-        <w:t xml:space="preserve"> + </w:t>
-      </w:r>
-      <w:r>
-        <w:rPr>
-          <w:b/>
-          <w:bCs/>
-        </w:rPr>
-        <w:t xml:space="preserve">`delayed`</w:t>
-      </w:r>
-      <w:r>
-        <w:t xml:space="preserve"> dominance (</w:t>
-      </w:r>
-      <w:r>
-        <w:rPr>
-          <w:b/>
-          <w:bCs/>
-        </w:rPr>
-        <w:t xml:space="preserve">≥35%</w:t>
-      </w:r>
-      <w:r>
-        <w:t xml:space="preserve"> combined). Routing via </w:t>
-      </w:r>
-      <w:r>
-        <w:rPr>
-          <w:b/>
-          <w:bCs/>
-        </w:rPr>
-        <w:t xml:space="preserve">`premiumMelodyRouting.ts`</w:t>
-      </w:r>
-      <w:r>
-        <w:t xml:space="preserve"> (</w:t>
+        <w:t xml:space="preserve">`runWsPremiumMelodyAutoValidation.ts`</w:t>
+      </w:r>
+      <w:r>
+        <w:t xml:space="preserve">): offbeat ratio </w:t>
+      </w:r>
+      <w:r>
+        <w:rPr>
+          <w:b/>
+          <w:bCs/>
+        </w:rPr>
+        <w:t xml:space="preserve">0.28–0.58</w:t>
+      </w:r>
+      <w:r>
+        <w:t xml:space="preserve">, IOI entropy </w:t>
+      </w:r>
+      <w:r>
+        <w:rPr>
+          <w:b/>
+          <w:bCs/>
+        </w:rPr>
+        <w:t xml:space="preserve">≥1.83</w:t>
+      </w:r>
+      <w:r>
+        <w:t xml:space="preserve">, velocity spread </w:t>
+      </w:r>
+      <w:r>
+        <w:rPr>
+          <w:b/>
+          <w:bCs/>
+        </w:rPr>
+        <w:t xml:space="preserve">4–12</w:t>
+      </w:r>
+      <w:r>
+        <w:t xml:space="preserve"> — </w:t>
+      </w:r>
+      <w:r>
+        <w:rPr>
+          <w:b/>
+          <w:bCs/>
+        </w:rPr>
+        <w:t xml:space="preserve">no</w:t>
+      </w:r>
+      <w:r>
+        <w:t xml:space="preserve"> BH phrase-density arc. BH isolation uniform-float sits at IOI-entropy floor edge. </w:t>
+      </w:r>
+      <w:r>
+        <w:rPr>
+          <w:b/>
+          <w:bCs/>
+        </w:rPr>
+        <w:t xml:space="preserve">FROZEN:</w:t>
+      </w:r>
+      <w:r>
+        <w:t xml:space="preserve"> regenerate fixtures only in a commit whose stated purpose is changing Wayne output. BH </w:t>
+      </w:r>
+      <w:r>
+        <w:rPr>
+          <w:b/>
+          <w:bCs/>
+        </w:rPr>
+        <w:t xml:space="preserve">1a</w:t>
+      </w:r>
+      <w:r>
+        <w:t xml:space="preserve"> golden master </w:t>
+      </w:r>
+      <w:r>
+        <w:rPr>
+          <w:b/>
+          <w:bCs/>
+        </w:rPr>
+        <w:t xml:space="preserve">FROZEN</w:t>
+      </w:r>
+      <w:r>
+        <w:t xml:space="preserve"> and byte-identical. QA export: </w:t>
+      </w:r>
+      <w:r>
+        <w:rPr>
+          <w:b/>
+          <w:bCs/>
+        </w:rPr>
+        <w:t xml:space="preserve">Song Mode</w:t>
+      </w:r>
+      <w:r>
+        <w:t xml:space="preserve"> / </w:t>
       </w:r>
       <w:r>
         <w:rPr>
@@ -15061,178 +15161,7 @@
           <w:sz w:val="20"/>
           <w:szCs w:val="20"/>
         </w:rPr>
-        <w:t xml:space="preserve">runPremiumMelodyHarmonyRhythmExpressionPipeline</w:t>
-      </w:r>
-      <w:r>
-        <w:t xml:space="preserve"> + </w:t>
-      </w:r>
-      <w:r>
-        <w:rPr>
-          <w:b/>
-          <w:bCs/>
-        </w:rPr>
-        <w:t xml:space="preserve">`applyPremiumMelodyPinExport`</w:t>
-      </w:r>
-      <w:r>
-        <w:t xml:space="preserve"> in </w:t>
-      </w:r>
-      <w:r>
-        <w:rPr>
-          <w:b/>
-          <w:bCs/>
-        </w:rPr>
-        <w:t xml:space="preserve">`runGoldenPath.ts`</w:t>
-      </w:r>
-      <w:r>
-        <w:t xml:space="preserve">). Wayne validation (</w:t>
-      </w:r>
-      <w:r>
-        <w:rPr>
-          <w:b/>
-          <w:bCs/>
-        </w:rPr>
-        <w:t xml:space="preserve">`wsPremiumMelodyValidation.ts`</w:t>
-      </w:r>
-      <w:r>
-        <w:t xml:space="preserve">, </w:t>
-      </w:r>
-      <w:r>
-        <w:rPr>
-          <w:b/>
-          <w:bCs/>
-        </w:rPr>
-        <w:t xml:space="preserve">`runWsPremiumMelodyAutoValidation.ts`</w:t>
-      </w:r>
-      <w:r>
-        <w:t xml:space="preserve">): offbeat ratio </w:t>
-      </w:r>
-      <w:r>
-        <w:rPr>
-          <w:b/>
-          <w:bCs/>
-        </w:rPr>
-        <w:t xml:space="preserve">0.28–0.52</w:t>
-      </w:r>
-      <w:r>
-        <w:t xml:space="preserve">, IOI entropy </w:t>
-      </w:r>
-      <w:r>
-        <w:rPr>
-          <w:b/>
-          <w:bCs/>
-        </w:rPr>
-        <w:t xml:space="preserve">≥1.4</w:t>
-      </w:r>
-      <w:r>
-        <w:t xml:space="preserve">, velocity spread </w:t>
-      </w:r>
-      <w:r>
-        <w:rPr>
-          <w:b/>
-          <w:bCs/>
-        </w:rPr>
-        <w:t xml:space="preserve">4–12</w:t>
-      </w:r>
-      <w:r>
-        <w:t xml:space="preserve"> — </w:t>
-      </w:r>
-      <w:r>
-        <w:rPr>
-          <w:b/>
-          <w:bCs/>
-        </w:rPr>
-        <w:t xml:space="preserve">no</w:t>
-      </w:r>
-      <w:r>
-        <w:t xml:space="preserve"> BH phrase-density arc. Thresholds </w:t>
-      </w:r>
-      <w:r>
-        <w:rPr>
-          <w:b/>
-          <w:bCs/>
-        </w:rPr>
-        <w:t xml:space="preserve">provisional until 2c</w:t>
-      </w:r>
-      <w:r>
-        <w:t xml:space="preserve">. Fixture </w:t>
-      </w:r>
-      <w:r>
-        <w:rPr>
-          <w:b/>
-          <w:bCs/>
-        </w:rPr>
-        <w:t xml:space="preserve">re-approved in 2b</w:t>
-      </w:r>
-      <w:r>
-        <w:t xml:space="preserve"> (sha256 </w:t>
-      </w:r>
-      <w:r>
-        <w:rPr>
-          <w:b/>
-          <w:bCs/>
-        </w:rPr>
-        <w:t xml:space="preserve">ea18328efa6e</w:t>
-      </w:r>
-      <w:r>
-        <w:t xml:space="preserve"> / </w:t>
-      </w:r>
-      <w:r>
-        <w:rPr>
-          <w:b/>
-          <w:bCs/>
-        </w:rPr>
-        <w:t xml:space="preserve">d30df1a6f950</w:t>
-      </w:r>
-      <w:r>
-        <w:t xml:space="preserve">); </w:t>
-      </w:r>
-      <w:r>
-        <w:rPr>
-          <w:b/>
-          <w:bCs/>
-        </w:rPr>
-        <w:t xml:space="preserve">freezes for real only after 2c</w:t>
-      </w:r>
-      <w:r>
-        <w:t xml:space="preserve">. BH </w:t>
-      </w:r>
-      <w:r>
-        <w:rPr>
-          <w:b/>
-          <w:bCs/>
-        </w:rPr>
-        <w:t xml:space="preserve">1a</w:t>
-      </w:r>
-      <w:r>
-        <w:t xml:space="preserve"> golden master </w:t>
-      </w:r>
-      <w:r>
-        <w:rPr>
-          <w:b/>
-          <w:bCs/>
-        </w:rPr>
-        <w:t xml:space="preserve">FROZEN</w:t>
-      </w:r>
-      <w:r>
-        <w:t xml:space="preserve"> and byte-identical. QA export: </w:t>
-      </w:r>
-      <w:r>
-        <w:rPr>
-          <w:b/>
-          <w:bCs/>
-        </w:rPr>
-        <w:t xml:space="preserve">Song Mode</w:t>
-      </w:r>
-      <w:r>
-        <w:t xml:space="preserve"> / </w:t>
-      </w:r>
-      <w:r>
-        <w:rPr>
-          <w:rFonts w:ascii="Consolas" w:cs="Consolas" w:eastAsia="Consolas" w:hAnsi="Consolas"/>
-          <w:sz w:val="20"/>
-          <w:szCs w:val="20"/>
-        </w:rPr>
-        <w:t xml:space="preserve">ws-v86-2b-check.musicxml</w:t>
+        <w:t xml:space="preserve">ws-v86-2c-check.musicxml</w:t>
       </w:r>
       <w:r>
         <w:t xml:space="preserve">.</w:t>

</xml_diff>

<commit_message>
Add premium-melody composer scaffolding script.
CLI scaffoldPremiumMelodyComposer.ts generates V86 2a-start kit per style-transfer composer (registry, prompt template, BH-safe post-flight rollback). CHANGELOG + COMPOSER_HANDBOOK updated. Gates: smoke 664/664, bhGoldenMaster byte-identical PASS.

Co-authored-by: Cursor <cursoragent@cursor.com>
</commit_message>
<xml_diff>
--- a/docs/COMPOSER_HANDBOOK.docx
+++ b/docs/COMPOSER_HANDBOOK.docx
@@ -15162,6 +15162,181 @@
           <w:szCs w:val="20"/>
         </w:rPr>
         <w:t xml:space="preserve">ws-v86-2c-check.musicxml</w:t>
+      </w:r>
+      <w:r>
+        <w:t xml:space="preserve">.</w:t>
+      </w:r>
+    </w:p>
+    <w:p>
+      <w:pPr>
+        <w:spacing w:after="160"/>
+      </w:pPr>
+      <w:r>
+        <w:rPr>
+          <w:b/>
+          <w:bCs/>
+        </w:rPr>
+        <w:t xml:space="preserve">Premium-melody composer scaffolding (V86):</w:t>
+      </w:r>
+      <w:r>
+        <w:t xml:space="preserve"> </w:t>
+      </w:r>
+      <w:r>
+        <w:rPr>
+          <w:b/>
+          <w:bCs/>
+        </w:rPr>
+        <w:t xml:space="preserve">`engines/composer-os-v2/scripts/scaffoldPremiumMelodyComposer.ts`</w:t>
+      </w:r>
+      <w:r>
+        <w:t xml:space="preserve"> generates the Wayne-proven </w:t>
+      </w:r>
+      <w:r>
+        <w:rPr>
+          <w:b/>
+          <w:bCs/>
+        </w:rPr>
+        <w:t xml:space="preserve">2a→2b→2c</w:t>
+      </w:r>
+      <w:r>
+        <w:t xml:space="preserve"> starter kit for each new style-transfer composer. Registry: </w:t>
+      </w:r>
+      <w:r>
+        <w:rPr>
+          <w:b/>
+          <w:bCs/>
+        </w:rPr>
+        <w:t xml:space="preserve">`scaffold/premium-melody-composer/registry.json`</w:t>
+      </w:r>
+      <w:r>
+        <w:t xml:space="preserve"> (Bill Evans </w:t>
+      </w:r>
+      <w:r>
+        <w:rPr>
+          <w:b/>
+          <w:bCs/>
+        </w:rPr>
+        <w:t xml:space="preserve">`bill_evans`</w:t>
+      </w:r>
+      <w:r>
+        <w:t xml:space="preserve"> / seed </w:t>
+      </w:r>
+      <w:r>
+        <w:rPr>
+          <w:b/>
+          <w:bCs/>
+        </w:rPr>
+        <w:t xml:space="preserve">90301</w:t>
+      </w:r>
+      <w:r>
+        <w:t xml:space="preserve"> through Frank Zappa </w:t>
+      </w:r>
+      <w:r>
+        <w:rPr>
+          <w:b/>
+          <w:bCs/>
+        </w:rPr>
+        <w:t xml:space="preserve">`frank_zappa`</w:t>
+      </w:r>
+      <w:r>
+        <w:t xml:space="preserve"> / </w:t>
+      </w:r>
+      <w:r>
+        <w:rPr>
+          <w:b/>
+          <w:bCs/>
+        </w:rPr>
+        <w:t xml:space="preserve">90308</w:t>
+      </w:r>
+      <w:r>
+        <w:t xml:space="preserve">; BH + Wayne marked </w:t>
+      </w:r>
+      <w:r>
+        <w:rPr>
+          <w:b/>
+          <w:bCs/>
+        </w:rPr>
+        <w:t xml:space="preserve">frozen</w:t>
+      </w:r>
+      <w:r>
+        <w:t xml:space="preserve"> for seed collision + write denylist). Output: profile + validation skeletons, </w:t>
+      </w:r>
+      <w:r>
+        <w:rPr>
+          <w:b/>
+          <w:bCs/>
+        </w:rPr>
+        <w:t xml:space="preserve">`{prefix}GoldenMaster.test.ts`</w:t>
+      </w:r>
+      <w:r>
+        <w:t xml:space="preserve">, </w:t>
+      </w:r>
+      <w:r>
+        <w:rPr>
+          <w:b/>
+          <w:bCs/>
+        </w:rPr>
+        <w:t xml:space="preserve">`run{Prefix}PremiumMelodyAutoValidation.ts`</w:t>
+      </w:r>
+      <w:r>
+        <w:t xml:space="preserve">, routing snippet (manual paste into </w:t>
+      </w:r>
+      <w:r>
+        <w:rPr>
+          <w:b/>
+          <w:bCs/>
+        </w:rPr>
+        <w:t xml:space="preserve">`runGoldenPath.ts`</w:t>
+      </w:r>
+      <w:r>
+        <w:t xml:space="preserve">), doc stubs, filled </w:t>
+      </w:r>
+      <w:r>
+        <w:rPr>
+          <w:b/>
+          <w:bCs/>
+        </w:rPr>
+        <w:t xml:space="preserve">2a</w:t>
+      </w:r>
+      <w:r>
+        <w:t xml:space="preserve"> Cursor prompt. </w:t>
+      </w:r>
+      <w:r>
+        <w:rPr>
+          <w:b/>
+          <w:bCs/>
+        </w:rPr>
+        <w:t xml:space="preserve">`--dry-run`</w:t>
+      </w:r>
+      <w:r>
+        <w:t xml:space="preserve"> prints manifest without writes. Post-flight </w:t>
+      </w:r>
+      <w:r>
+        <w:rPr>
+          <w:b/>
+          <w:bCs/>
+        </w:rPr>
+        <w:t xml:space="preserve">`bhGoldenMaster`</w:t>
+      </w:r>
+      <w:r>
+        <w:t xml:space="preserve"> — rollback all files on FAIL. Does not touch </w:t>
+      </w:r>
+      <w:r>
+        <w:rPr>
+          <w:b/>
+          <w:bCs/>
+        </w:rPr>
+        <w:t xml:space="preserve">`runGoldenPath.ts`</w:t>
+      </w:r>
+      <w:r>
+        <w:t xml:space="preserve">, golden fixtures, or BH behaviour. See </w:t>
+      </w:r>
+      <w:r>
+        <w:rPr>
+          <w:b/>
+          <w:bCs/>
+        </w:rPr>
+        <w:t xml:space="preserve">`scaffold/README.md`</w:t>
       </w:r>
       <w:r>
         <w:t xml:space="preserve">.</w:t>

</xml_diff>

<commit_message>
feat(desktop): Composer OS Electron Musician UI v1
Plain HTML musician shell as default desktop window: composer dropdown, seed/randomise/generate, Song Mode MusicXML output, two IPC channels only. React UI behind COMPOSER_OS_FULL_UI=1. bhGoldenMaster PASS byte-identical (JSON + MusicXML seed 88109) verified before commit.

Co-authored-by: Cursor <cursoragent@cursor.com>
</commit_message>
<xml_diff>
--- a/docs/COMPOSER_HANDBOOK.docx
+++ b/docs/COMPOSER_HANDBOOK.docx
@@ -122,6 +122,368 @@
     <w:p>
       <w:r>
         <w:br w:type="page"/>
+      </w:r>
+    </w:p>
+    <w:p>
+      <w:pPr>
+        <w:pStyle w:val="Heading2"/>
+        <w:spacing w:after="100" w:before="180"/>
+      </w:pPr>
+      <w:r>
+        <w:t xml:space="preserve">Musician shell (Electron desktop v1)</w:t>
+      </w:r>
+    </w:p>
+    <w:p>
+      <w:pPr>
+        <w:spacing w:after="160"/>
+      </w:pPr>
+      <w:r>
+        <w:rPr>
+          <w:b/>
+          <w:bCs/>
+        </w:rPr>
+        <w:t xml:space="preserve">Default desktop window</w:t>
+      </w:r>
+      <w:r>
+        <w:t xml:space="preserve"> for musicians — not the full React Generate UI.</w:t>
+      </w:r>
+    </w:p>
+    <w:p>
+      <w:pPr>
+        <w:spacing w:after="160"/>
+      </w:pPr>
+      <w:r>
+        <w:rPr>
+          <w:b/>
+          <w:bCs/>
+        </w:rPr>
+        <w:t xml:space="preserve">Launch:</w:t>
+      </w:r>
+      <w:r>
+        <w:t xml:space="preserve"> double-click </w:t>
+      </w:r>
+      <w:r>
+        <w:rPr>
+          <w:b/>
+          <w:bCs/>
+        </w:rPr>
+        <w:t xml:space="preserve">`Composer-OS.exe`</w:t>
+      </w:r>
+      <w:r>
+        <w:t xml:space="preserve"> (or </w:t>
+      </w:r>
+      <w:r>
+        <w:rPr>
+          <w:b/>
+          <w:bCs/>
+        </w:rPr>
+        <w:t xml:space="preserve">`npm start`</w:t>
+      </w:r>
+      <w:r>
+        <w:t xml:space="preserve"> from </w:t>
+      </w:r>
+      <w:r>
+        <w:rPr>
+          <w:b/>
+          <w:bCs/>
+        </w:rPr>
+        <w:t xml:space="preserve">`apps/composer-os-desktop`</w:t>
+      </w:r>
+      <w:r>
+        <w:t xml:space="preserve"> after build). No terminal required.</w:t>
+      </w:r>
+    </w:p>
+    <w:p>
+      <w:pPr>
+        <w:spacing w:after="160"/>
+      </w:pPr>
+      <w:r>
+        <w:rPr>
+          <w:b/>
+          <w:bCs/>
+        </w:rPr>
+        <w:t xml:space="preserve">Controls:</w:t>
+      </w:r>
+    </w:p>
+    <w:p>
+      <w:pPr>
+        <w:spacing w:after="80"/>
+        <w:ind w:left="360" w:hanging="260"/>
+      </w:pPr>
+      <w:r>
+        <w:t xml:space="preserve">• </w:t>
+      </w:r>
+      <w:r>
+        <w:rPr>
+          <w:b/>
+          <w:bCs/>
+        </w:rPr>
+        <w:t xml:space="preserve">Composer</w:t>
+      </w:r>
+      <w:r>
+        <w:t xml:space="preserve"> — dropdown from premium-melody </w:t>
+      </w:r>
+      <w:r>
+        <w:rPr>
+          <w:b/>
+          <w:bCs/>
+        </w:rPr>
+        <w:t xml:space="preserve">`registry.json`</w:t>
+      </w:r>
+      <w:r>
+        <w:t xml:space="preserve"> (sorted by name). Active writers in </w:t>
+      </w:r>
+      <w:r>
+        <w:rPr>
+          <w:b/>
+          <w:bCs/>
+        </w:rPr>
+        <w:t xml:space="preserve">Composers</w:t>
+      </w:r>
+      <w:r>
+        <w:t xml:space="preserve">; frozen Barry Harris / Wayne Shorter benchmarks in </w:t>
+      </w:r>
+      <w:r>
+        <w:rPr>
+          <w:b/>
+          <w:bCs/>
+        </w:rPr>
+        <w:t xml:space="preserve">Reference</w:t>
+      </w:r>
+      <w:r>
+        <w:t xml:space="preserve">.</w:t>
+      </w:r>
+    </w:p>
+    <w:p>
+      <w:pPr>
+        <w:spacing w:after="80"/>
+        <w:ind w:left="360" w:hanging="260"/>
+      </w:pPr>
+      <w:r>
+        <w:t xml:space="preserve">• </w:t>
+      </w:r>
+      <w:r>
+        <w:rPr>
+          <w:b/>
+          <w:bCs/>
+        </w:rPr>
+        <w:t xml:space="preserve">Seed</w:t>
+      </w:r>
+      <w:r>
+        <w:t xml:space="preserve"> — integer </w:t>
+      </w:r>
+      <w:r>
+        <w:rPr>
+          <w:b/>
+          <w:bCs/>
+        </w:rPr>
+        <w:t xml:space="preserve">1–999999999</w:t>
+      </w:r>
+      <w:r>
+        <w:t xml:space="preserve">; updates when composer changes.</w:t>
+      </w:r>
+    </w:p>
+    <w:p>
+      <w:pPr>
+        <w:spacing w:after="80"/>
+        <w:ind w:left="360" w:hanging="260"/>
+      </w:pPr>
+      <w:r>
+        <w:t xml:space="preserve">• </w:t>
+      </w:r>
+      <w:r>
+        <w:rPr>
+          <w:b/>
+          <w:bCs/>
+        </w:rPr>
+        <w:t xml:space="preserve">Randomise</w:t>
+      </w:r>
+      <w:r>
+        <w:t xml:space="preserve"> — sets a 6-digit seed (</w:t>
+      </w:r>
+      <w:r>
+        <w:rPr>
+          <w:b/>
+          <w:bCs/>
+        </w:rPr>
+        <w:t xml:space="preserve">100000–999999</w:t>
+      </w:r>
+      <w:r>
+        <w:t xml:space="preserve">); does not generate.</w:t>
+      </w:r>
+    </w:p>
+    <w:p>
+      <w:pPr>
+        <w:spacing w:after="80"/>
+        <w:ind w:left="360" w:hanging="260"/>
+      </w:pPr>
+      <w:r>
+        <w:t xml:space="preserve">• </w:t>
+      </w:r>
+      <w:r>
+        <w:rPr>
+          <w:b/>
+          <w:bCs/>
+        </w:rPr>
+        <w:t xml:space="preserve">Generate</w:t>
+      </w:r>
+      <w:r>
+        <w:t xml:space="preserve"> — runs Song Mode (</w:t>
+      </w:r>
+      <w:r>
+        <w:rPr>
+          <w:b/>
+          <w:bCs/>
+        </w:rPr>
+        <w:t xml:space="preserve">32 bars</w:t>
+      </w:r>
+      <w:r>
+        <w:t xml:space="preserve">, balanced creative control) for the selected composer; disables controls while running.</w:t>
+      </w:r>
+    </w:p>
+    <w:p>
+      <w:pPr>
+        <w:spacing w:after="160"/>
+      </w:pPr>
+      <w:r>
+        <w:rPr>
+          <w:b/>
+          <w:bCs/>
+        </w:rPr>
+        <w:t xml:space="preserve">Output:</w:t>
+      </w:r>
+      <w:r>
+        <w:t xml:space="preserve"> MusicXML written to </w:t>
+      </w:r>
+      <w:r>
+        <w:rPr>
+          <w:b/>
+          <w:bCs/>
+        </w:rPr>
+        <w:t xml:space="preserve">`&lt;Documents&gt;/Mike Composer Files/Song Mode/`</w:t>
+      </w:r>
+      <w:r>
+        <w:t xml:space="preserve"> as </w:t>
+      </w:r>
+      <w:r>
+        <w:rPr>
+          <w:b/>
+          <w:bCs/>
+        </w:rPr>
+        <w:t xml:space="preserve">`{composerSlug}_{seed}.musicxml`</w:t>
+      </w:r>
+      <w:r>
+        <w:t xml:space="preserve">. The app tries to open the file in your OS default app; if that fails, Explorer highlights the file.</w:t>
+      </w:r>
+    </w:p>
+    <w:p>
+      <w:pPr>
+        <w:spacing w:after="160"/>
+      </w:pPr>
+      <w:r>
+        <w:rPr>
+          <w:b/>
+          <w:bCs/>
+        </w:rPr>
+        <w:t xml:space="preserve">Developer full UI:</w:t>
+      </w:r>
+      <w:r>
+        <w:t xml:space="preserve"> set environment variable </w:t>
+      </w:r>
+      <w:r>
+        <w:rPr>
+          <w:b/>
+          <w:bCs/>
+        </w:rPr>
+        <w:t xml:space="preserve">`COMPOSER_OS_FULL_UI=1`</w:t>
+      </w:r>
+      <w:r>
+        <w:t xml:space="preserve"> before launch to load the React </w:t>
+      </w:r>
+      <w:r>
+        <w:rPr>
+          <w:b/>
+          <w:bCs/>
+        </w:rPr>
+        <w:t xml:space="preserve">`composer-os-app`</w:t>
+      </w:r>
+      <w:r>
+        <w:t xml:space="preserve"> shell instead.</w:t>
+      </w:r>
+    </w:p>
+    <w:p>
+      <w:pPr>
+        <w:spacing w:after="160"/>
+      </w:pPr>
+      <w:r>
+        <w:rPr>
+          <w:b/>
+          <w:bCs/>
+        </w:rPr>
+        <w:t xml:space="preserve">Security:</w:t>
+      </w:r>
+      <w:r>
+        <w:t xml:space="preserve"> musician window uses </w:t>
+      </w:r>
+      <w:r>
+        <w:rPr>
+          <w:b/>
+          <w:bCs/>
+        </w:rPr>
+        <w:t xml:space="preserve">`contextIsolation`</w:t>
+      </w:r>
+      <w:r>
+        <w:t xml:space="preserve">, </w:t>
+      </w:r>
+      <w:r>
+        <w:rPr>
+          <w:b/>
+          <w:bCs/>
+        </w:rPr>
+        <w:t xml:space="preserve">`nodeIntegration: false`</w:t>
+      </w:r>
+      <w:r>
+        <w:t xml:space="preserve">, </w:t>
+      </w:r>
+      <w:r>
+        <w:rPr>
+          <w:b/>
+          <w:bCs/>
+        </w:rPr>
+        <w:t xml:space="preserve">`sandbox: true`</w:t>
+      </w:r>
+      <w:r>
+        <w:t xml:space="preserve">, and </w:t>
+      </w:r>
+      <w:r>
+        <w:rPr>
+          <w:b/>
+          <w:bCs/>
+        </w:rPr>
+        <w:t xml:space="preserve">`preload-musician.js`</w:t>
+      </w:r>
+      <w:r>
+        <w:t xml:space="preserve"> exposing only </w:t>
+      </w:r>
+      <w:r>
+        <w:rPr>
+          <w:b/>
+          <w:bCs/>
+        </w:rPr>
+        <w:t xml:space="preserve">`window.composerOsMusician.generate`</w:t>
+      </w:r>
+      <w:r>
+        <w:t xml:space="preserve"> and </w:t>
+      </w:r>
+      <w:r>
+        <w:rPr>
+          <w:b/>
+          <w:bCs/>
+        </w:rPr>
+        <w:t xml:space="preserve">`onStatus`</w:t>
+      </w:r>
+      <w:r>
+        <w:t xml:space="preserve">.</w:t>
       </w:r>
     </w:p>
     <w:p>

</xml_diff>

<commit_message>
V87 Commit 2a: Bill Evans isolation baseline wiring.
Provisional be_isolation_provisional profile + runGoldenPath bill_evans routing on BH benchmark seed 90301; BH golden master byte-identical.

Co-authored-by: Cursor <cursoragent@cursor.com>
</commit_message>
<xml_diff>
--- a/docs/COMPOSER_HANDBOOK.docx
+++ b/docs/COMPOSER_HANDBOOK.docx
@@ -15221,37 +15221,17 @@
           <w:b/>
           <w:bCs/>
         </w:rPr>
-        <w:t xml:space="preserve">Wayne Shorter golden-master (V86 Commit 2c — FROZEN):</w:t>
-      </w:r>
-      <w:r>
-        <w:t xml:space="preserve"> Native modal benchmark </w:t>
-      </w:r>
-      <w:r>
-        <w:rPr>
-          <w:b/>
-          <w:bCs/>
-        </w:rPr>
-        <w:t xml:space="preserve">`WS_Benchmark_ModalMelody.musicxml`</w:t>
-      </w:r>
-      <w:r>
-        <w:t xml:space="preserve"> — original </w:t>
-      </w:r>
-      <w:r>
-        <w:rPr>
-          <w:b/>
-          <w:bCs/>
-        </w:rPr>
-        <w:t xml:space="preserve">8</w:t>
-      </w:r>
-      <w:r>
-        <w:t xml:space="preserve">-bar modal melody (floating sustains, compact bursts, space, intervallic pivots, long-range phrase arc). Wayne premium-melody snapshot — seed </w:t>
-      </w:r>
-      <w:r>
-        <w:rPr>
-          <w:b/>
-          <w:bCs/>
-        </w:rPr>
-        <w:t xml:space="preserve">90217</w:t>
+        <w:t xml:space="preserve">Bill Evans golden-master baseline (V87 Commit 2a — PROVISIONAL):</w:t>
+      </w:r>
+      <w:r>
+        <w:t xml:space="preserve"> Seed </w:t>
+      </w:r>
+      <w:r>
+        <w:rPr>
+          <w:b/>
+          <w:bCs/>
+        </w:rPr>
+        <w:t xml:space="preserve">90301</w:t>
       </w:r>
       <w:r>
         <w:t xml:space="preserve">, profile </w:t>
@@ -15261,7 +15241,7 @@
           <w:b/>
           <w:bCs/>
         </w:rPr>
-        <w:t xml:space="preserve">`ws_isolation_provisional`</w:t>
+        <w:t xml:space="preserve">`be_isolation_provisional`</w:t>
       </w:r>
       <w:r>
         <w:t xml:space="preserve">, fixtures </w:t>
@@ -15271,17 +15251,7 @@
           <w:b/>
           <w:bCs/>
         </w:rPr>
-        <w:t xml:space="preserve">`ws-modal-seed90217.golden.json`</w:t>
-      </w:r>
-      <w:r>
-        <w:t xml:space="preserve"> + </w:t>
-      </w:r>
-      <w:r>
-        <w:rPr>
-          <w:b/>
-          <w:bCs/>
-        </w:rPr>
-        <w:t xml:space="preserve">`.golden.musicxml`</w:t>
+        <w:t xml:space="preserve">`be-isolation-seed90301.golden.*`</w:t>
       </w:r>
       <w:r>
         <w:t xml:space="preserve">, test </w:t>
@@ -15291,27 +15261,37 @@
           <w:b/>
           <w:bCs/>
         </w:rPr>
-        <w:t xml:space="preserve">`wayneGoldenMaster.test.ts`</w:t>
-      </w:r>
-      <w:r>
-        <w:t xml:space="preserve">. </w:t>
-      </w:r>
-      <w:r>
-        <w:rPr>
-          <w:b/>
-          <w:bCs/>
-        </w:rPr>
-        <w:t xml:space="preserve">Commit 2b</w:t>
-      </w:r>
-      <w:r>
-        <w:t xml:space="preserve"> tuned modal float: </w:t>
-      </w:r>
-      <w:r>
-        <w:rPr>
-          <w:b/>
-          <w:bCs/>
-        </w:rPr>
-        <w:t xml:space="preserve">`syncopationShiftRate` 0.40</w:t>
+        <w:t xml:space="preserve">`beGoldenMaster.test.ts`</w:t>
+      </w:r>
+      <w:r>
+        <w:t xml:space="preserve">. Input reuses </w:t>
+      </w:r>
+      <w:r>
+        <w:rPr>
+          <w:b/>
+          <w:bCs/>
+        </w:rPr>
+        <w:t xml:space="preserve">`BH_Benchmark_JazzMelody.musicxml`</w:t>
+      </w:r>
+      <w:r>
+        <w:t xml:space="preserve"> (isolation only; native benchmark in </w:t>
+      </w:r>
+      <w:r>
+        <w:rPr>
+          <w:b/>
+          <w:bCs/>
+        </w:rPr>
+        <w:t xml:space="preserve">2c</w:t>
+      </w:r>
+      <w:r>
+        <w:t xml:space="preserve">). Validation: </w:t>
+      </w:r>
+      <w:r>
+        <w:rPr>
+          <w:b/>
+          <w:bCs/>
+        </w:rPr>
+        <w:t xml:space="preserve">`bePremiumMelodyValidation.ts`</w:t>
       </w:r>
       <w:r>
         <w:t xml:space="preserve">, </w:t>
@@ -15321,70 +15301,30 @@
           <w:b/>
           <w:bCs/>
         </w:rPr>
-        <w:t xml:space="preserve">`anticipationBias` 0.30</w:t>
-      </w:r>
-      <w:r>
-        <w:t xml:space="preserve">, </w:t>
-      </w:r>
-      <w:r>
-        <w:rPr>
-          <w:b/>
-          <w:bCs/>
-        </w:rPr>
-        <w:t xml:space="preserve">`float_preserve`</w:t>
-      </w:r>
-      <w:r>
-        <w:t xml:space="preserve"> landing, </w:t>
-      </w:r>
-      <w:r>
-        <w:rPr>
-          <w:b/>
-          <w:bCs/>
-        </w:rPr>
-        <w:t xml:space="preserve">`modal_lyric`</w:t>
-      </w:r>
-      <w:r>
-        <w:t xml:space="preserve"> expression, </w:t>
-      </w:r>
-      <w:r>
-        <w:rPr>
-          <w:b/>
-          <w:bCs/>
-        </w:rPr>
-        <w:t xml:space="preserve">`cellFamilyWeightScale`</w:t>
-      </w:r>
-      <w:r>
-        <w:t xml:space="preserve"> for </w:t>
-      </w:r>
-      <w:r>
-        <w:rPr>
-          <w:b/>
-          <w:bCs/>
-        </w:rPr>
-        <w:t xml:space="preserve">`long_gap`</w:t>
-      </w:r>
-      <w:r>
-        <w:t xml:space="preserve"> + </w:t>
-      </w:r>
-      <w:r>
-        <w:rPr>
-          <w:b/>
-          <w:bCs/>
-        </w:rPr>
-        <w:t xml:space="preserve">`delayed`</w:t>
-      </w:r>
-      <w:r>
-        <w:t xml:space="preserve">. Routing via </w:t>
-      </w:r>
-      <w:r>
-        <w:rPr>
-          <w:b/>
-          <w:bCs/>
-        </w:rPr>
-        <w:t xml:space="preserve">`premiumMelodyRouting.ts`</w:t>
-      </w:r>
-      <w:r>
-        <w:t xml:space="preserve"> (</w:t>
+        <w:t xml:space="preserve">`runBePremiumMelodyAutoValidation.ts`</w:t>
+      </w:r>
+      <w:r>
+        <w:t xml:space="preserve"> — PLACEHOLDER thresholds until </w:t>
+      </w:r>
+      <w:r>
+        <w:rPr>
+          <w:b/>
+          <w:bCs/>
+        </w:rPr>
+        <w:t xml:space="preserve">2c</w:t>
+      </w:r>
+      <w:r>
+        <w:t xml:space="preserve"> freeze. QA export: </w:t>
+      </w:r>
+      <w:r>
+        <w:rPr>
+          <w:b/>
+          <w:bCs/>
+        </w:rPr>
+        <w:t xml:space="preserve">Song Mode</w:t>
+      </w:r>
+      <w:r>
+        <w:t xml:space="preserve"> / </w:t>
       </w:r>
       <w:r>
         <w:rPr>
@@ -15392,7 +15332,72 @@
           <w:sz w:val="20"/>
           <w:szCs w:val="20"/>
         </w:rPr>
-        <w:t xml:space="preserve">runPremiumMelodyHarmonyRhythmExpressionPipeline</w:t>
+        <w:t xml:space="preserve">be-v86-2a-check.musicxml</w:t>
+      </w:r>
+      <w:r>
+        <w:t xml:space="preserve">.</w:t>
+      </w:r>
+    </w:p>
+    <w:p>
+      <w:pPr>
+        <w:spacing w:after="160"/>
+      </w:pPr>
+      <w:r>
+        <w:rPr>
+          <w:b/>
+          <w:bCs/>
+        </w:rPr>
+        <w:t xml:space="preserve">Wayne Shorter golden-master (V86 Commit 2c — FROZEN):</w:t>
+      </w:r>
+      <w:r>
+        <w:t xml:space="preserve"> Native modal benchmark </w:t>
+      </w:r>
+      <w:r>
+        <w:rPr>
+          <w:b/>
+          <w:bCs/>
+        </w:rPr>
+        <w:t xml:space="preserve">`WS_Benchmark_ModalMelody.musicxml`</w:t>
+      </w:r>
+      <w:r>
+        <w:t xml:space="preserve"> — original </w:t>
+      </w:r>
+      <w:r>
+        <w:rPr>
+          <w:b/>
+          <w:bCs/>
+        </w:rPr>
+        <w:t xml:space="preserve">8</w:t>
+      </w:r>
+      <w:r>
+        <w:t xml:space="preserve">-bar modal melody (floating sustains, compact bursts, space, intervallic pivots, long-range phrase arc). Wayne premium-melody snapshot — seed </w:t>
+      </w:r>
+      <w:r>
+        <w:rPr>
+          <w:b/>
+          <w:bCs/>
+        </w:rPr>
+        <w:t xml:space="preserve">90217</w:t>
+      </w:r>
+      <w:r>
+        <w:t xml:space="preserve">, profile </w:t>
+      </w:r>
+      <w:r>
+        <w:rPr>
+          <w:b/>
+          <w:bCs/>
+        </w:rPr>
+        <w:t xml:space="preserve">`ws_isolation_provisional`</w:t>
+      </w:r>
+      <w:r>
+        <w:t xml:space="preserve">, fixtures </w:t>
+      </w:r>
+      <w:r>
+        <w:rPr>
+          <w:b/>
+          <w:bCs/>
+        </w:rPr>
+        <w:t xml:space="preserve">`ws-modal-seed90217.golden.json`</w:t>
       </w:r>
       <w:r>
         <w:t xml:space="preserve"> + </w:t>
@@ -15402,27 +15407,37 @@
           <w:b/>
           <w:bCs/>
         </w:rPr>
-        <w:t xml:space="preserve">`applyPremiumMelodyPinExport`</w:t>
-      </w:r>
-      <w:r>
-        <w:t xml:space="preserve"> in </w:t>
-      </w:r>
-      <w:r>
-        <w:rPr>
-          <w:b/>
-          <w:bCs/>
-        </w:rPr>
-        <w:t xml:space="preserve">`runGoldenPath.ts`</w:t>
-      </w:r>
-      <w:r>
-        <w:t xml:space="preserve">). Wayne validation (</w:t>
-      </w:r>
-      <w:r>
-        <w:rPr>
-          <w:b/>
-          <w:bCs/>
-        </w:rPr>
-        <w:t xml:space="preserve">`wsPremiumMelodyValidation.ts`</w:t>
+        <w:t xml:space="preserve">`.golden.musicxml`</w:t>
+      </w:r>
+      <w:r>
+        <w:t xml:space="preserve">, test </w:t>
+      </w:r>
+      <w:r>
+        <w:rPr>
+          <w:b/>
+          <w:bCs/>
+        </w:rPr>
+        <w:t xml:space="preserve">`wayneGoldenMaster.test.ts`</w:t>
+      </w:r>
+      <w:r>
+        <w:t xml:space="preserve">. </w:t>
+      </w:r>
+      <w:r>
+        <w:rPr>
+          <w:b/>
+          <w:bCs/>
+        </w:rPr>
+        <w:t xml:space="preserve">Commit 2b</w:t>
+      </w:r>
+      <w:r>
+        <w:t xml:space="preserve"> tuned modal float: </w:t>
+      </w:r>
+      <w:r>
+        <w:rPr>
+          <w:b/>
+          <w:bCs/>
+        </w:rPr>
+        <w:t xml:space="preserve">`syncopationShiftRate` 0.40</w:t>
       </w:r>
       <w:r>
         <w:t xml:space="preserve">, </w:t>
@@ -15432,90 +15447,70 @@
           <w:b/>
           <w:bCs/>
         </w:rPr>
-        <w:t xml:space="preserve">`runWsPremiumMelodyAutoValidation.ts`</w:t>
-      </w:r>
-      <w:r>
-        <w:t xml:space="preserve">): offbeat ratio </w:t>
-      </w:r>
-      <w:r>
-        <w:rPr>
-          <w:b/>
-          <w:bCs/>
-        </w:rPr>
-        <w:t xml:space="preserve">0.28–0.58</w:t>
-      </w:r>
-      <w:r>
-        <w:t xml:space="preserve">, IOI entropy </w:t>
-      </w:r>
-      <w:r>
-        <w:rPr>
-          <w:b/>
-          <w:bCs/>
-        </w:rPr>
-        <w:t xml:space="preserve">≥1.83</w:t>
-      </w:r>
-      <w:r>
-        <w:t xml:space="preserve">, velocity spread </w:t>
-      </w:r>
-      <w:r>
-        <w:rPr>
-          <w:b/>
-          <w:bCs/>
-        </w:rPr>
-        <w:t xml:space="preserve">4–12</w:t>
-      </w:r>
-      <w:r>
-        <w:t xml:space="preserve"> — </w:t>
-      </w:r>
-      <w:r>
-        <w:rPr>
-          <w:b/>
-          <w:bCs/>
-        </w:rPr>
-        <w:t xml:space="preserve">no</w:t>
-      </w:r>
-      <w:r>
-        <w:t xml:space="preserve"> BH phrase-density arc. BH isolation uniform-float sits at IOI-entropy floor edge. </w:t>
-      </w:r>
-      <w:r>
-        <w:rPr>
-          <w:b/>
-          <w:bCs/>
-        </w:rPr>
-        <w:t xml:space="preserve">FROZEN:</w:t>
-      </w:r>
-      <w:r>
-        <w:t xml:space="preserve"> regenerate fixtures only in a commit whose stated purpose is changing Wayne output. BH </w:t>
-      </w:r>
-      <w:r>
-        <w:rPr>
-          <w:b/>
-          <w:bCs/>
-        </w:rPr>
-        <w:t xml:space="preserve">1a</w:t>
-      </w:r>
-      <w:r>
-        <w:t xml:space="preserve"> golden master </w:t>
-      </w:r>
-      <w:r>
-        <w:rPr>
-          <w:b/>
-          <w:bCs/>
-        </w:rPr>
-        <w:t xml:space="preserve">FROZEN</w:t>
-      </w:r>
-      <w:r>
-        <w:t xml:space="preserve"> and byte-identical. QA export: </w:t>
-      </w:r>
-      <w:r>
-        <w:rPr>
-          <w:b/>
-          <w:bCs/>
-        </w:rPr>
-        <w:t xml:space="preserve">Song Mode</w:t>
-      </w:r>
-      <w:r>
-        <w:t xml:space="preserve"> / </w:t>
+        <w:t xml:space="preserve">`anticipationBias` 0.30</w:t>
+      </w:r>
+      <w:r>
+        <w:t xml:space="preserve">, </w:t>
+      </w:r>
+      <w:r>
+        <w:rPr>
+          <w:b/>
+          <w:bCs/>
+        </w:rPr>
+        <w:t xml:space="preserve">`float_preserve`</w:t>
+      </w:r>
+      <w:r>
+        <w:t xml:space="preserve"> landing, </w:t>
+      </w:r>
+      <w:r>
+        <w:rPr>
+          <w:b/>
+          <w:bCs/>
+        </w:rPr>
+        <w:t xml:space="preserve">`modal_lyric`</w:t>
+      </w:r>
+      <w:r>
+        <w:t xml:space="preserve"> expression, </w:t>
+      </w:r>
+      <w:r>
+        <w:rPr>
+          <w:b/>
+          <w:bCs/>
+        </w:rPr>
+        <w:t xml:space="preserve">`cellFamilyWeightScale`</w:t>
+      </w:r>
+      <w:r>
+        <w:t xml:space="preserve"> for </w:t>
+      </w:r>
+      <w:r>
+        <w:rPr>
+          <w:b/>
+          <w:bCs/>
+        </w:rPr>
+        <w:t xml:space="preserve">`long_gap`</w:t>
+      </w:r>
+      <w:r>
+        <w:t xml:space="preserve"> + </w:t>
+      </w:r>
+      <w:r>
+        <w:rPr>
+          <w:b/>
+          <w:bCs/>
+        </w:rPr>
+        <w:t xml:space="preserve">`delayed`</w:t>
+      </w:r>
+      <w:r>
+        <w:t xml:space="preserve">. Routing via </w:t>
+      </w:r>
+      <w:r>
+        <w:rPr>
+          <w:b/>
+          <w:bCs/>
+        </w:rPr>
+        <w:t xml:space="preserve">`premiumMelodyRouting.ts`</w:t>
+      </w:r>
+      <w:r>
+        <w:t xml:space="preserve"> (</w:t>
       </w:r>
       <w:r>
         <w:rPr>
@@ -15523,10 +15518,397 @@
           <w:sz w:val="20"/>
           <w:szCs w:val="20"/>
         </w:rPr>
+        <w:t xml:space="preserve">runPremiumMelodyHarmonyRhythmExpressionPipeline</w:t>
+      </w:r>
+      <w:r>
+        <w:t xml:space="preserve"> + </w:t>
+      </w:r>
+      <w:r>
+        <w:rPr>
+          <w:b/>
+          <w:bCs/>
+        </w:rPr>
+        <w:t xml:space="preserve">`applyPremiumMelodyPinExport`</w:t>
+      </w:r>
+      <w:r>
+        <w:t xml:space="preserve"> in </w:t>
+      </w:r>
+      <w:r>
+        <w:rPr>
+          <w:b/>
+          <w:bCs/>
+        </w:rPr>
+        <w:t xml:space="preserve">`runGoldenPath.ts`</w:t>
+      </w:r>
+      <w:r>
+        <w:t xml:space="preserve">). Wayne validation (</w:t>
+      </w:r>
+      <w:r>
+        <w:rPr>
+          <w:b/>
+          <w:bCs/>
+        </w:rPr>
+        <w:t xml:space="preserve">`wsPremiumMelodyValidation.ts`</w:t>
+      </w:r>
+      <w:r>
+        <w:t xml:space="preserve">, </w:t>
+      </w:r>
+      <w:r>
+        <w:rPr>
+          <w:b/>
+          <w:bCs/>
+        </w:rPr>
+        <w:t xml:space="preserve">`runWsPremiumMelodyAutoValidation.ts`</w:t>
+      </w:r>
+      <w:r>
+        <w:t xml:space="preserve">): offbeat ratio </w:t>
+      </w:r>
+      <w:r>
+        <w:rPr>
+          <w:b/>
+          <w:bCs/>
+        </w:rPr>
+        <w:t xml:space="preserve">0.28–0.58</w:t>
+      </w:r>
+      <w:r>
+        <w:t xml:space="preserve">, IOI entropy </w:t>
+      </w:r>
+      <w:r>
+        <w:rPr>
+          <w:b/>
+          <w:bCs/>
+        </w:rPr>
+        <w:t xml:space="preserve">≥1.83</w:t>
+      </w:r>
+      <w:r>
+        <w:t xml:space="preserve">, velocity spread </w:t>
+      </w:r>
+      <w:r>
+        <w:rPr>
+          <w:b/>
+          <w:bCs/>
+        </w:rPr>
+        <w:t xml:space="preserve">4–12</w:t>
+      </w:r>
+      <w:r>
+        <w:t xml:space="preserve"> — </w:t>
+      </w:r>
+      <w:r>
+        <w:rPr>
+          <w:b/>
+          <w:bCs/>
+        </w:rPr>
+        <w:t xml:space="preserve">no</w:t>
+      </w:r>
+      <w:r>
+        <w:t xml:space="preserve"> BH phrase-density arc. BH isolation uniform-float sits at IOI-entropy floor edge. </w:t>
+      </w:r>
+      <w:r>
+        <w:rPr>
+          <w:b/>
+          <w:bCs/>
+        </w:rPr>
+        <w:t xml:space="preserve">FROZEN:</w:t>
+      </w:r>
+      <w:r>
+        <w:t xml:space="preserve"> regenerate fixtures only in a commit whose stated purpose is changing Wayne output. BH </w:t>
+      </w:r>
+      <w:r>
+        <w:rPr>
+          <w:b/>
+          <w:bCs/>
+        </w:rPr>
+        <w:t xml:space="preserve">1a</w:t>
+      </w:r>
+      <w:r>
+        <w:t xml:space="preserve"> golden master </w:t>
+      </w:r>
+      <w:r>
+        <w:rPr>
+          <w:b/>
+          <w:bCs/>
+        </w:rPr>
+        <w:t xml:space="preserve">FROZEN</w:t>
+      </w:r>
+      <w:r>
+        <w:t xml:space="preserve"> and byte-identical. QA export: </w:t>
+      </w:r>
+      <w:r>
+        <w:rPr>
+          <w:b/>
+          <w:bCs/>
+        </w:rPr>
+        <w:t xml:space="preserve">Song Mode</w:t>
+      </w:r>
+      <w:r>
+        <w:t xml:space="preserve"> / </w:t>
+      </w:r>
+      <w:r>
+        <w:rPr>
+          <w:rFonts w:ascii="Consolas" w:cs="Consolas" w:eastAsia="Consolas" w:hAnsi="Consolas"/>
+          <w:sz w:val="20"/>
+          <w:szCs w:val="20"/>
+        </w:rPr>
         <w:t xml:space="preserve">ws-v86-2c-check.musicxml</w:t>
       </w:r>
       <w:r>
         <w:t xml:space="preserve">.</w:t>
+      </w:r>
+    </w:p>
+    <w:p>
+      <w:pPr>
+        <w:spacing w:after="160"/>
+      </w:pPr>
+      <w:r>
+        <w:rPr>
+          <w:b/>
+          <w:bCs/>
+        </w:rPr>
+        <w:t xml:space="preserve">Pitch layer engine hook (V87):</w:t>
+      </w:r>
+      <w:r>
+        <w:t xml:space="preserve"> Optional </w:t>
+      </w:r>
+      <w:r>
+        <w:rPr>
+          <w:rFonts w:ascii="Consolas" w:cs="Consolas" w:eastAsia="Consolas" w:hAnsi="Consolas"/>
+          <w:sz w:val="20"/>
+          <w:szCs w:val="20"/>
+        </w:rPr>
+        <w:t xml:space="preserve">pitchProfile</w:t>
+      </w:r>
+      <w:r>
+        <w:t xml:space="preserve"> on </w:t>
+      </w:r>
+      <w:r>
+        <w:rPr>
+          <w:rFonts w:ascii="Consolas" w:cs="Consolas" w:eastAsia="Consolas" w:hAnsi="Consolas"/>
+          <w:sz w:val="20"/>
+          <w:szCs w:val="20"/>
+        </w:rPr>
+        <w:t xml:space="preserve">PremiumMelodyProfile</w:t>
+      </w:r>
+      <w:r>
+        <w:t xml:space="preserve"> drives deterministic pitch generation after rhythm enrichment and before expression. </w:t>
+      </w:r>
+      <w:r>
+        <w:rPr>
+          <w:b/>
+          <w:bCs/>
+        </w:rPr>
+        <w:t xml:space="preserve">Absent = BH default</w:t>
+      </w:r>
+      <w:r>
+        <w:t xml:space="preserve"> — import </w:t>
+      </w:r>
+      <w:r>
+        <w:rPr>
+          <w:rFonts w:ascii="Consolas" w:cs="Consolas" w:eastAsia="Consolas" w:hAnsi="Consolas"/>
+          <w:sz w:val="20"/>
+          <w:szCs w:val="20"/>
+        </w:rPr>
+        <w:t xml:space="preserve">midiPitch</w:t>
+      </w:r>
+      <w:r>
+        <w:t xml:space="preserve"> values pass through unchanged; </w:t>
+      </w:r>
+      <w:r>
+        <w:rPr>
+          <w:rFonts w:ascii="Consolas" w:cs="Consolas" w:eastAsia="Consolas" w:hAnsi="Consolas"/>
+          <w:sz w:val="20"/>
+          <w:szCs w:val="20"/>
+        </w:rPr>
+        <w:t xml:space="preserve">buildBarryHarrisPremiumMelodyProfile</w:t>
+      </w:r>
+      <w:r>
+        <w:t xml:space="preserve"> sets no </w:t>
+      </w:r>
+      <w:r>
+        <w:rPr>
+          <w:rFonts w:ascii="Consolas" w:cs="Consolas" w:eastAsia="Consolas" w:hAnsi="Consolas"/>
+          <w:sz w:val="20"/>
+          <w:szCs w:val="20"/>
+        </w:rPr>
+        <w:t xml:space="preserve">pitchProfile</w:t>
+      </w:r>
+      <w:r>
+        <w:t xml:space="preserve">. Pipeline order: </w:t>
+      </w:r>
+      <w:r>
+        <w:rPr>
+          <w:rFonts w:ascii="Consolas" w:cs="Consolas" w:eastAsia="Consolas" w:hAnsi="Consolas"/>
+          <w:sz w:val="20"/>
+          <w:szCs w:val="20"/>
+        </w:rPr>
+        <w:t xml:space="preserve">enrichMelodyRhythm</w:t>
+      </w:r>
+      <w:r>
+        <w:t xml:space="preserve"> → </w:t>
+      </w:r>
+      <w:r>
+        <w:rPr>
+          <w:rFonts w:ascii="Consolas" w:cs="Consolas" w:eastAsia="Consolas" w:hAnsi="Consolas"/>
+          <w:sz w:val="20"/>
+          <w:szCs w:val="20"/>
+        </w:rPr>
+        <w:t xml:space="preserve">runPremiumMelodyPitchPipeline</w:t>
+      </w:r>
+      <w:r>
+        <w:t xml:space="preserve"> (phrase planner + slot scorer) when </w:t>
+      </w:r>
+      <w:r>
+        <w:rPr>
+          <w:rFonts w:ascii="Consolas" w:cs="Consolas" w:eastAsia="Consolas" w:hAnsi="Consolas"/>
+          <w:sz w:val="20"/>
+          <w:szCs w:val="20"/>
+        </w:rPr>
+        <w:t xml:space="preserve">pitchProfile</w:t>
+      </w:r>
+      <w:r>
+        <w:t xml:space="preserve"> present → </w:t>
+      </w:r>
+      <w:r>
+        <w:rPr>
+          <w:rFonts w:ascii="Consolas" w:cs="Consolas" w:eastAsia="Consolas" w:hAnsi="Consolas"/>
+          <w:sz w:val="20"/>
+          <w:szCs w:val="20"/>
+        </w:rPr>
+        <w:t xml:space="preserve">enrichMelodyExpression</w:t>
+      </w:r>
+      <w:r>
+        <w:t xml:space="preserve"> on final pitches → </w:t>
+      </w:r>
+      <w:r>
+        <w:rPr>
+          <w:rFonts w:ascii="Consolas" w:cs="Consolas" w:eastAsia="Consolas" w:hAnsi="Consolas"/>
+          <w:sz w:val="20"/>
+          <w:szCs w:val="20"/>
+        </w:rPr>
+        <w:t xml:space="preserve">applyPremiumMelodySurfaceOrnaments</w:t>
+      </w:r>
+      <w:r>
+        <w:t xml:space="preserve"> (annotation tags only, after expression) when </w:t>
+      </w:r>
+      <w:r>
+        <w:rPr>
+          <w:rFonts w:ascii="Consolas" w:cs="Consolas" w:eastAsia="Consolas" w:hAnsi="Consolas"/>
+          <w:sz w:val="20"/>
+          <w:szCs w:val="20"/>
+        </w:rPr>
+        <w:t xml:space="preserve">surfaceRules != null</w:t>
+      </w:r>
+      <w:r>
+        <w:t xml:space="preserve">. Seed normalised </w:t>
+      </w:r>
+      <w:r>
+        <w:rPr>
+          <w:rFonts w:ascii="Consolas" w:cs="Consolas" w:eastAsia="Consolas" w:hAnsi="Consolas"/>
+          <w:sz w:val="20"/>
+          <w:szCs w:val="20"/>
+        </w:rPr>
+        <w:t xml:space="preserve">&gt;&gt;&gt; 0</w:t>
+      </w:r>
+      <w:r>
+        <w:t xml:space="preserve"> at pipeline entry. Per-slot RNG: </w:t>
+      </w:r>
+      <w:r>
+        <w:rPr>
+          <w:rFonts w:ascii="Consolas" w:cs="Consolas" w:eastAsia="Consolas" w:hAnsi="Consolas"/>
+          <w:sz w:val="20"/>
+          <w:szCs w:val="20"/>
+        </w:rPr>
+        <w:t xml:space="preserve">derivePremiumMelodyPitchSlotSeed</w:t>
+      </w:r>
+      <w:r>
+        <w:t xml:space="preserve"> (FNV-1a + XOR); candidates enumerated </w:t>
+      </w:r>
+      <w:r>
+        <w:rPr>
+          <w:rFonts w:ascii="Consolas" w:cs="Consolas" w:eastAsia="Consolas" w:hAnsi="Consolas"/>
+          <w:sz w:val="20"/>
+          <w:szCs w:val="20"/>
+        </w:rPr>
+        <w:t xml:space="preserve">for (midi = min; midi &lt;= max; midi++)</w:t>
+      </w:r>
+      <w:r>
+        <w:t xml:space="preserve">, sorted </w:t>
+      </w:r>
+      <w:r>
+        <w:rPr>
+          <w:rFonts w:ascii="Consolas" w:cs="Consolas" w:eastAsia="Consolas" w:hAnsi="Consolas"/>
+          <w:sz w:val="20"/>
+          <w:szCs w:val="20"/>
+        </w:rPr>
+        <w:t xml:space="preserve">chordToneRank asc, midiPitch asc</w:t>
+      </w:r>
+      <w:r>
+        <w:t xml:space="preserve">; one </w:t>
+      </w:r>
+      <w:r>
+        <w:rPr>
+          <w:rFonts w:ascii="Consolas" w:cs="Consolas" w:eastAsia="Consolas" w:hAnsi="Consolas"/>
+          <w:sz w:val="20"/>
+          <w:szCs w:val="20"/>
+        </w:rPr>
+        <w:t xml:space="preserve">mulberry32</w:t>
+      </w:r>
+      <w:r>
+        <w:t xml:space="preserve"> draw per slot. Surface ornament draw order: approach → enclosure → blues → grace → bend (skip = zero draws). Types: </w:t>
+      </w:r>
+      <w:r>
+        <w:rPr>
+          <w:rFonts w:ascii="Consolas" w:cs="Consolas" w:eastAsia="Consolas" w:hAnsi="Consolas"/>
+          <w:sz w:val="20"/>
+          <w:szCs w:val="20"/>
+        </w:rPr>
+        <w:t xml:space="preserve">premiumMelodyPitchProfile.ts</w:t>
+      </w:r>
+      <w:r>
+        <w:t xml:space="preserve">, implementation: </w:t>
+      </w:r>
+      <w:r>
+        <w:rPr>
+          <w:rFonts w:ascii="Consolas" w:cs="Consolas" w:eastAsia="Consolas" w:hAnsi="Consolas"/>
+          <w:sz w:val="20"/>
+          <w:szCs w:val="20"/>
+        </w:rPr>
+        <w:t xml:space="preserve">premiumMelodyPitchPipeline.ts</w:t>
+      </w:r>
+      <w:r>
+        <w:t xml:space="preserve">. Composer golden JSON may include </w:t>
+      </w:r>
+      <w:r>
+        <w:rPr>
+          <w:rFonts w:ascii="Consolas" w:cs="Consolas" w:eastAsia="Consolas" w:hAnsi="Consolas"/>
+          <w:sz w:val="20"/>
+          <w:szCs w:val="20"/>
+        </w:rPr>
+        <w:t xml:space="preserve">pitchTrace</w:t>
+      </w:r>
+      <w:r>
+        <w:t xml:space="preserve"> block (</w:t>
+      </w:r>
+      <w:r>
+        <w:rPr>
+          <w:rFonts w:ascii="Consolas" w:cs="Consolas" w:eastAsia="Consolas" w:hAnsi="Consolas"/>
+          <w:sz w:val="20"/>
+          <w:szCs w:val="20"/>
+        </w:rPr>
+        <w:t xml:space="preserve">PremiumMelodyPitchTraceEvent</w:t>
+      </w:r>
+      <w:r>
+        <w:t xml:space="preserve">) when pitch enabled. BH golden master stays byte-identical; </w:t>
+      </w:r>
+      <w:r>
+        <w:rPr>
+          <w:rFonts w:ascii="Consolas" w:cs="Consolas" w:eastAsia="Consolas" w:hAnsi="Consolas"/>
+          <w:sz w:val="20"/>
+          <w:szCs w:val="20"/>
+        </w:rPr>
+        <w:t xml:space="preserve">premiumMelodyPitchPipeline.test.ts</w:t>
+      </w:r>
+      <w:r>
+        <w:t xml:space="preserve"> BH proxy test is the no-drift oracle.</w:t>
       </w:r>
     </w:p>
     <w:p>

</xml_diff>

<commit_message>
feat(bill-evans): V87 2c native lyrical benchmark + golden-master freeze.
Recalibrate guide-tone weights (2.1 proximity, sigma 1.5), frozen bar-level guide track on BE_Benchmark_LyricalBallad, FROZEN validation thresholds and be-lyrical-seed90301 oracle. BH/Wayne fixtures byte-identical.

Co-authored-by: Cursor <cursoragent@cursor.com>
</commit_message>
<xml_diff>
--- a/docs/COMPOSER_HANDBOOK.docx
+++ b/docs/COMPOSER_HANDBOOK.docx
@@ -15221,110 +15221,20 @@
           <w:b/>
           <w:bCs/>
         </w:rPr>
-        <w:t xml:space="preserve">Bill Evans golden-master baseline (V87 Commit 2a — PROVISIONAL):</w:t>
-      </w:r>
-      <w:r>
-        <w:t xml:space="preserve"> Seed </w:t>
-      </w:r>
-      <w:r>
-        <w:rPr>
-          <w:b/>
-          <w:bCs/>
-        </w:rPr>
-        <w:t xml:space="preserve">90301</w:t>
-      </w:r>
-      <w:r>
-        <w:t xml:space="preserve">, profile </w:t>
-      </w:r>
-      <w:r>
-        <w:rPr>
-          <w:b/>
-          <w:bCs/>
-        </w:rPr>
-        <w:t xml:space="preserve">`be_isolation_provisional`</w:t>
-      </w:r>
-      <w:r>
-        <w:t xml:space="preserve">, fixtures </w:t>
-      </w:r>
-      <w:r>
-        <w:rPr>
-          <w:b/>
-          <w:bCs/>
-        </w:rPr>
-        <w:t xml:space="preserve">`be-isolation-seed90301.golden.*`</w:t>
-      </w:r>
-      <w:r>
-        <w:t xml:space="preserve">, test </w:t>
-      </w:r>
-      <w:r>
-        <w:rPr>
-          <w:b/>
-          <w:bCs/>
-        </w:rPr>
-        <w:t xml:space="preserve">`beGoldenMaster.test.ts`</w:t>
-      </w:r>
-      <w:r>
-        <w:t xml:space="preserve">. Input reuses </w:t>
-      </w:r>
-      <w:r>
-        <w:rPr>
-          <w:b/>
-          <w:bCs/>
-        </w:rPr>
-        <w:t xml:space="preserve">`BH_Benchmark_JazzMelody.musicxml`</w:t>
-      </w:r>
-      <w:r>
-        <w:t xml:space="preserve"> (isolation only; native benchmark in </w:t>
-      </w:r>
-      <w:r>
-        <w:rPr>
-          <w:b/>
-          <w:bCs/>
-        </w:rPr>
-        <w:t xml:space="preserve">2c</w:t>
-      </w:r>
-      <w:r>
-        <w:t xml:space="preserve">). Validation: </w:t>
-      </w:r>
-      <w:r>
-        <w:rPr>
-          <w:b/>
-          <w:bCs/>
-        </w:rPr>
-        <w:t xml:space="preserve">`bePremiumMelodyValidation.ts`</w:t>
-      </w:r>
-      <w:r>
-        <w:t xml:space="preserve">, </w:t>
-      </w:r>
-      <w:r>
-        <w:rPr>
-          <w:b/>
-          <w:bCs/>
-        </w:rPr>
-        <w:t xml:space="preserve">`runBePremiumMelodyAutoValidation.ts`</w:t>
-      </w:r>
-      <w:r>
-        <w:t xml:space="preserve"> — PLACEHOLDER thresholds until </w:t>
-      </w:r>
-      <w:r>
-        <w:rPr>
-          <w:b/>
-          <w:bCs/>
-        </w:rPr>
-        <w:t xml:space="preserve">2c</w:t>
-      </w:r>
-      <w:r>
-        <w:t xml:space="preserve"> freeze. QA export: </w:t>
-      </w:r>
-      <w:r>
-        <w:rPr>
-          <w:b/>
-          <w:bCs/>
-        </w:rPr>
-        <w:t xml:space="preserve">Song Mode</w:t>
-      </w:r>
-      <w:r>
-        <w:t xml:space="preserve"> / </w:t>
+        <w:t xml:space="preserve">Bill Evans premium-melody (V87 Commit 2c — FROZEN):</w:t>
+      </w:r>
+      <w:r>
+        <w:t xml:space="preserve"> Profile </w:t>
+      </w:r>
+      <w:r>
+        <w:rPr>
+          <w:b/>
+          <w:bCs/>
+        </w:rPr>
+        <w:t xml:space="preserve">`be_jazz_ballad_v1 (FROZEN 2c)`</w:t>
+      </w:r>
+      <w:r>
+        <w:t xml:space="preserve"> (</w:t>
       </w:r>
       <w:r>
         <w:rPr>
@@ -15332,10 +15242,457 @@
           <w:sz w:val="20"/>
           <w:szCs w:val="20"/>
         </w:rPr>
-        <w:t xml:space="preserve">be-v86-2a-check.musicxml</w:t>
-      </w:r>
-      <w:r>
-        <w:t xml:space="preserve">.</w:t>
+        <w:t xml:space="preserve">bePremiumMelodyProfile.ts</w:t>
+      </w:r>
+      <w:r>
+        <w:t xml:space="preserve">) — lyrical ballad float on native benchmark </w:t>
+      </w:r>
+      <w:r>
+        <w:rPr>
+          <w:b/>
+          <w:bCs/>
+        </w:rPr>
+        <w:t xml:space="preserve">`BE_Benchmark_LyricalBallad.musicxml`</w:t>
+      </w:r>
+      <w:r>
+        <w:t xml:space="preserve">. </w:t>
+      </w:r>
+      <w:r>
+        <w:rPr>
+          <w:b/>
+          <w:bCs/>
+        </w:rPr>
+        <w:t xml:space="preserve">2c weight recalibration</w:t>
+      </w:r>
+      <w:r>
+        <w:t xml:space="preserve"> (7.4/10 “guide-tone too weak” feedback): </w:t>
+      </w:r>
+      <w:r>
+        <w:rPr>
+          <w:b/>
+          <w:bCs/>
+        </w:rPr>
+        <w:t xml:space="preserve">`weightGuideToneProximity` 2.1</w:t>
+      </w:r>
+      <w:r>
+        <w:t xml:space="preserve"> (was 1.4), </w:t>
+      </w:r>
+      <w:r>
+        <w:rPr>
+          <w:b/>
+          <w:bCs/>
+        </w:rPr>
+        <w:t xml:space="preserve">`weightChordFit` 1.7</w:t>
+      </w:r>
+      <w:r>
+        <w:t xml:space="preserve">, </w:t>
+      </w:r>
+      <w:r>
+        <w:rPr>
+          <w:b/>
+          <w:bCs/>
+        </w:rPr>
+        <w:t xml:space="preserve">`localContourWeight` 0.95</w:t>
+      </w:r>
+      <w:r>
+        <w:t xml:space="preserve">, </w:t>
+      </w:r>
+      <w:r>
+        <w:rPr>
+          <w:b/>
+          <w:bCs/>
+        </w:rPr>
+        <w:t xml:space="preserve">`weightPhraseArc` 1.35</w:t>
+      </w:r>
+      <w:r>
+        <w:t xml:space="preserve">, guide-tone </w:t>
+      </w:r>
+      <w:r>
+        <w:rPr>
+          <w:b/>
+          <w:bCs/>
+        </w:rPr>
+        <w:t xml:space="preserve">`proximitySigma` 1.5</w:t>
+      </w:r>
+      <w:r>
+        <w:t xml:space="preserve">, hit bonuses </w:t>
+      </w:r>
+      <w:r>
+        <w:rPr>
+          <w:b/>
+          <w:bCs/>
+        </w:rPr>
+        <w:t xml:space="preserve">+0.7 / +0.4</w:t>
+      </w:r>
+      <w:r>
+        <w:t xml:space="preserve"> (primary / secondary), </w:t>
+      </w:r>
+      <w:r>
+        <w:rPr>
+          <w:b/>
+          <w:bCs/>
+        </w:rPr>
+        <w:t xml:space="preserve">`maxExactHitRatePerBar` 0.7</w:t>
+      </w:r>
+      <w:r>
+        <w:t xml:space="preserve"> cap + phrase-level </w:t>
+      </w:r>
+      <w:r>
+        <w:rPr>
+          <w:b/>
+          <w:bCs/>
+        </w:rPr>
+        <w:t xml:space="preserve">60–70%</w:t>
+      </w:r>
+      <w:r>
+        <w:t xml:space="preserve"> exact primary guide-tone band via </w:t>
+      </w:r>
+      <w:r>
+        <w:rPr>
+          <w:b/>
+          <w:bCs/>
+        </w:rPr>
+        <w:t xml:space="preserve">`repairGuideToneHitBand`</w:t>
+      </w:r>
+      <w:r>
+        <w:t xml:space="preserve">. </w:t>
+      </w:r>
+      <w:r>
+        <w:rPr>
+          <w:b/>
+          <w:bCs/>
+        </w:rPr>
+        <w:t xml:space="preserve">Frozen bar-level primary guide-tone track</w:t>
+      </w:r>
+      <w:r>
+        <w:t xml:space="preserve"> (</w:t>
+      </w:r>
+      <w:r>
+        <w:rPr>
+          <w:rFonts w:ascii="Consolas" w:cs="Consolas" w:eastAsia="Consolas" w:hAnsi="Consolas"/>
+          <w:sz w:val="20"/>
+          <w:szCs w:val="20"/>
+        </w:rPr>
+        <w:t xml:space="preserve">barPrimaryGuideTonePc</w:t>
+      </w:r>
+      <w:r>
+        <w:t xml:space="preserve">): B1 </w:t>
+      </w:r>
+      <w:r>
+        <w:rPr>
+          <w:b/>
+          <w:bCs/>
+        </w:rPr>
+        <w:t xml:space="preserve">F</w:t>
+      </w:r>
+      <w:r>
+        <w:t xml:space="preserve"> · B2 </w:t>
+      </w:r>
+      <w:r>
+        <w:rPr>
+          <w:b/>
+          <w:bCs/>
+        </w:rPr>
+        <w:t xml:space="preserve">F</w:t>
+      </w:r>
+      <w:r>
+        <w:t xml:space="preserve"> · B3 </w:t>
+      </w:r>
+      <w:r>
+        <w:rPr>
+          <w:b/>
+          <w:bCs/>
+        </w:rPr>
+        <w:t xml:space="preserve">E</w:t>
+      </w:r>
+      <w:r>
+        <w:t xml:space="preserve"> · B4 </w:t>
+      </w:r>
+      <w:r>
+        <w:rPr>
+          <w:b/>
+          <w:bCs/>
+        </w:rPr>
+        <w:t xml:space="preserve">F♯</w:t>
+      </w:r>
+      <w:r>
+        <w:t xml:space="preserve"> · B5 </w:t>
+      </w:r>
+      <w:r>
+        <w:rPr>
+          <w:b/>
+          <w:bCs/>
+        </w:rPr>
+        <w:t xml:space="preserve">G</w:t>
+      </w:r>
+      <w:r>
+        <w:t xml:space="preserve"> · B6 </w:t>
+      </w:r>
+      <w:r>
+        <w:rPr>
+          <w:b/>
+          <w:bCs/>
+        </w:rPr>
+        <w:t xml:space="preserve">A</w:t>
+      </w:r>
+      <w:r>
+        <w:t xml:space="preserve"> · B7 </w:t>
+      </w:r>
+      <w:r>
+        <w:rPr>
+          <w:b/>
+          <w:bCs/>
+        </w:rPr>
+        <w:t xml:space="preserve">F</w:t>
+      </w:r>
+      <w:r>
+        <w:t xml:space="preserve"> · B8 </w:t>
+      </w:r>
+      <w:r>
+        <w:rPr>
+          <w:b/>
+          <w:bCs/>
+        </w:rPr>
+        <w:t xml:space="preserve">E</w:t>
+      </w:r>
+      <w:r>
+        <w:t xml:space="preserve">. </w:t>
+      </w:r>
+      <w:r>
+        <w:rPr>
+          <w:b/>
+          <w:bCs/>
+        </w:rPr>
+        <w:t xml:space="preserve">Climax:</w:t>
+      </w:r>
+      <w:r>
+        <w:t xml:space="preserve"> ~65% phrase slot + colour-tone bias (9th/13th within </w:t>
+      </w:r>
+      <w:r>
+        <w:rPr>
+          <w:b/>
+          <w:bCs/>
+        </w:rPr>
+        <w:t xml:space="preserve">2</w:t>
+      </w:r>
+      <w:r>
+        <w:t xml:space="preserve"> semitones of guide track). </w:t>
+      </w:r>
+      <w:r>
+        <w:rPr>
+          <w:b/>
+          <w:bCs/>
+        </w:rPr>
+        <w:t xml:space="preserve">Pitch v2:</w:t>
+      </w:r>
+      <w:r>
+        <w:t xml:space="preserve"> guide-tone / climax-arc / approach-pattern (two-pass; approach intermediates filled before guide/climax repair). </w:t>
+      </w:r>
+      <w:r>
+        <w:rPr>
+          <w:b/>
+          <w:bCs/>
+        </w:rPr>
+        <w:t xml:space="preserve">Validation (`bePremiumMelodyValidation.ts`, FROZEN):</w:t>
+      </w:r>
+      <w:r>
+        <w:t xml:space="preserve"> rhythm gates unchanged; pitch v2 — guide-tone proximity </w:t>
+      </w:r>
+      <w:r>
+        <w:rPr>
+          <w:b/>
+          <w:bCs/>
+        </w:rPr>
+        <w:t xml:space="preserve">0.55–1.0</w:t>
+      </w:r>
+      <w:r>
+        <w:t xml:space="preserve"> (σ </w:t>
+      </w:r>
+      <w:r>
+        <w:rPr>
+          <w:b/>
+          <w:bCs/>
+        </w:rPr>
+        <w:t xml:space="preserve">1.5</w:t>
+      </w:r>
+      <w:r>
+        <w:t xml:space="preserve">), phrase exact-hit </w:t>
+      </w:r>
+      <w:r>
+        <w:rPr>
+          <w:b/>
+          <w:bCs/>
+        </w:rPr>
+        <w:t xml:space="preserve">0.60–0.70</w:t>
+      </w:r>
+      <w:r>
+        <w:t xml:space="preserve"> (per-bar floor </w:t>
+      </w:r>
+      <w:r>
+        <w:rPr>
+          <w:b/>
+          <w:bCs/>
+        </w:rPr>
+        <w:t xml:space="preserve">0.50</w:t>
+      </w:r>
+      <w:r>
+        <w:t xml:space="preserve"> on 2-note bars), approach </w:t>
+      </w:r>
+      <w:r>
+        <w:rPr>
+          <w:b/>
+          <w:bCs/>
+        </w:rPr>
+        <w:t xml:space="preserve">≥50%</w:t>
+      </w:r>
+      <w:r>
+        <w:t xml:space="preserve"> boundaries; </w:t>
+      </w:r>
+      <w:r>
+        <w:rPr>
+          <w:b/>
+          <w:bCs/>
+        </w:rPr>
+        <w:t xml:space="preserve">pitchTrace</w:t>
+      </w:r>
+      <w:r>
+        <w:t xml:space="preserve"> stepwise </w:t>
+      </w:r>
+      <w:r>
+        <w:rPr>
+          <w:b/>
+          <w:bCs/>
+        </w:rPr>
+        <w:t xml:space="preserve">≥0.53</w:t>
+      </w:r>
+      <w:r>
+        <w:t xml:space="preserve">, large leaps </w:t>
+      </w:r>
+      <w:r>
+        <w:rPr>
+          <w:b/>
+          <w:bCs/>
+        </w:rPr>
+        <w:t xml:space="preserve">≤0.31</w:t>
+      </w:r>
+      <w:r>
+        <w:t xml:space="preserve"> (calibrated on seed </w:t>
+      </w:r>
+      <w:r>
+        <w:rPr>
+          <w:b/>
+          <w:bCs/>
+        </w:rPr>
+        <w:t xml:space="preserve">90301</w:t>
+      </w:r>
+      <w:r>
+        <w:t xml:space="preserve">). </w:t>
+      </w:r>
+      <w:r>
+        <w:rPr>
+          <w:b/>
+          <w:bCs/>
+        </w:rPr>
+        <w:t xml:space="preserve">`beGoldenMaster.test.ts`</w:t>
+      </w:r>
+      <w:r>
+        <w:t xml:space="preserve"> + </w:t>
+      </w:r>
+      <w:r>
+        <w:rPr>
+          <w:b/>
+          <w:bCs/>
+        </w:rPr>
+        <w:t xml:space="preserve">`be-lyrical-seed90301.golden.*`</w:t>
+      </w:r>
+      <w:r>
+        <w:t xml:space="preserve"> (</w:t>
+      </w:r>
+      <w:r>
+        <w:rPr>
+          <w:b/>
+          <w:bCs/>
+        </w:rPr>
+        <w:t xml:space="preserve">FROZEN</w:t>
+      </w:r>
+      <w:r>
+        <w:t xml:space="preserve"> oracle alongside BH + Wayne; sha256 </w:t>
+      </w:r>
+      <w:r>
+        <w:rPr>
+          <w:b/>
+          <w:bCs/>
+        </w:rPr>
+        <w:t xml:space="preserve">53a2ca43075b</w:t>
+      </w:r>
+      <w:r>
+        <w:t xml:space="preserve"> / </w:t>
+      </w:r>
+      <w:r>
+        <w:rPr>
+          <w:b/>
+          <w:bCs/>
+        </w:rPr>
+        <w:t xml:space="preserve">4889a096763a</w:t>
+      </w:r>
+      <w:r>
+        <w:t xml:space="preserve">). QA: </w:t>
+      </w:r>
+      <w:r>
+        <w:rPr>
+          <w:b/>
+          <w:bCs/>
+        </w:rPr>
+        <w:t xml:space="preserve">Song Mode</w:t>
+      </w:r>
+      <w:r>
+        <w:t xml:space="preserve"> / </w:t>
+      </w:r>
+      <w:r>
+        <w:rPr>
+          <w:rFonts w:ascii="Consolas" w:cs="Consolas" w:eastAsia="Consolas" w:hAnsi="Consolas"/>
+          <w:sz w:val="20"/>
+          <w:szCs w:val="20"/>
+        </w:rPr>
+        <w:t xml:space="preserve">be-v86-2c-check.musicxml</w:t>
+      </w:r>
+      <w:r>
+        <w:t xml:space="preserve">. Regenerate fixtures only in a commit whose stated purpose is changing Bill Evans output.</w:t>
+      </w:r>
+    </w:p>
+    <w:p>
+      <w:pPr>
+        <w:spacing w:after="160"/>
+      </w:pPr>
+      <w:r>
+        <w:rPr>
+          <w:b/>
+          <w:bCs/>
+        </w:rPr>
+        <w:t xml:space="preserve">Bill Evans golden-master baseline (V87 Commit 2a — superseded):</w:t>
+      </w:r>
+      <w:r>
+        <w:t xml:space="preserve"> Isolation on </w:t>
+      </w:r>
+      <w:r>
+        <w:rPr>
+          <w:b/>
+          <w:bCs/>
+        </w:rPr>
+        <w:t xml:space="preserve">`BH_Benchmark_JazzMelody.musicxml`</w:t>
+      </w:r>
+      <w:r>
+        <w:t xml:space="preserve"> — replaced by </w:t>
+      </w:r>
+      <w:r>
+        <w:rPr>
+          <w:b/>
+          <w:bCs/>
+        </w:rPr>
+        <w:t xml:space="preserve">2c</w:t>
+      </w:r>
+      <w:r>
+        <w:t xml:space="preserve"> native lyrical benchmark.</w:t>
       </w:r>
     </w:p>
     <w:p>

</xml_diff>

<commit_message>
feat(hendrix): V89 2a/2b premium-melody pitch layer + call-response architecture
Ship jh_blues_lead_v1 with four additive optional pitch mechanisms, golden-path routing, validation, and provisional isolation fixtures while keeping BH/Wayne/Evans byte-identical.

Co-authored-by: Cursor <cursoragent@cursor.com>
</commit_message>
<xml_diff>
--- a/docs/COMPOSER_HANDBOOK.docx
+++ b/docs/COMPOSER_HANDBOOK.docx
@@ -15693,6 +15693,499 @@
       </w:r>
       <w:r>
         <w:t xml:space="preserve"> native lyrical benchmark.</w:t>
+      </w:r>
+    </w:p>
+    <w:p>
+      <w:pPr>
+        <w:spacing w:after="160"/>
+      </w:pPr>
+      <w:r>
+        <w:rPr>
+          <w:b/>
+          <w:bCs/>
+        </w:rPr>
+        <w:t xml:space="preserve">Jimi Hendrix premium-melody (V89 Commit 2a/2b — PROVISIONAL):</w:t>
+      </w:r>
+      <w:r>
+        <w:t xml:space="preserve"> Profile </w:t>
+      </w:r>
+      <w:r>
+        <w:rPr>
+          <w:b/>
+          <w:bCs/>
+        </w:rPr>
+        <w:t xml:space="preserve">`jh_blues_lead_v1`</w:t>
+      </w:r>
+      <w:r>
+        <w:t xml:space="preserve"> (</w:t>
+      </w:r>
+      <w:r>
+        <w:rPr>
+          <w:rFonts w:ascii="Consolas" w:cs="Consolas" w:eastAsia="Consolas" w:hAnsi="Consolas"/>
+          <w:sz w:val="20"/>
+          <w:szCs w:val="20"/>
+        </w:rPr>
+        <w:t xml:space="preserve">jhPremiumMelodyProfile.ts</w:t>
+      </w:r>
+      <w:r>
+        <w:t xml:space="preserve">) — blues-rock lead on reused </w:t>
+      </w:r>
+      <w:r>
+        <w:rPr>
+          <w:b/>
+          <w:bCs/>
+        </w:rPr>
+        <w:t xml:space="preserve">`BH_Benchmark_JazzMelody.musicxml`</w:t>
+      </w:r>
+      <w:r>
+        <w:t xml:space="preserve"> for isolation/determinism only (native benchmark in </w:t>
+      </w:r>
+      <w:r>
+        <w:rPr>
+          <w:b/>
+          <w:bCs/>
+        </w:rPr>
+        <w:t xml:space="preserve">2c</w:t>
+      </w:r>
+      <w:r>
+        <w:t xml:space="preserve">). Register </w:t>
+      </w:r>
+      <w:r>
+        <w:rPr>
+          <w:b/>
+          <w:bCs/>
+        </w:rPr>
+        <w:t xml:space="preserve">MIDI 52–74</w:t>
+      </w:r>
+      <w:r>
+        <w:t xml:space="preserve">, </w:t>
+      </w:r>
+      <w:r>
+        <w:rPr>
+          <w:b/>
+          <w:bCs/>
+        </w:rPr>
+        <w:t xml:space="preserve">`chord_root`</w:t>
+      </w:r>
+      <w:r>
+        <w:t xml:space="preserve">, </w:t>
+      </w:r>
+      <w:r>
+        <w:rPr>
+          <w:b/>
+          <w:bCs/>
+        </w:rPr>
+        <w:t xml:space="preserve">`call_response_variation`</w:t>
+      </w:r>
+      <w:r>
+        <w:t xml:space="preserve"> contour, dom7 chord-fit vector, temperature </w:t>
+      </w:r>
+      <w:r>
+        <w:rPr>
+          <w:b/>
+          <w:bCs/>
+        </w:rPr>
+        <w:t xml:space="preserve">0.52</w:t>
+      </w:r>
+      <w:r>
+        <w:t xml:space="preserve">, </w:t>
+      </w:r>
+      <w:r>
+        <w:rPr>
+          <w:b/>
+          <w:bCs/>
+        </w:rPr>
+        <w:t xml:space="preserve">`maxLeapSemitones` 12</w:t>
+      </w:r>
+      <w:r>
+        <w:t xml:space="preserve">. </w:t>
+      </w:r>
+      <w:r>
+        <w:rPr>
+          <w:b/>
+          <w:bCs/>
+        </w:rPr>
+        <w:t xml:space="preserve">Guide-tone / climax-arc / approach-pattern disabled</w:t>
+      </w:r>
+      <w:r>
+        <w:t xml:space="preserve"> — replaced by four </w:t>
+      </w:r>
+      <w:r>
+        <w:rPr>
+          <w:b/>
+          <w:bCs/>
+        </w:rPr>
+        <w:t xml:space="preserve">additive optional</w:t>
+      </w:r>
+      <w:r>
+        <w:t xml:space="preserve"> pitch mechanisms (absent on BH / Wayne / Evans profiles):</w:t>
+      </w:r>
+    </w:p>
+    <w:p>
+      <w:pPr>
+        <w:spacing w:after="80"/>
+        <w:ind w:left="360" w:hanging="260"/>
+      </w:pPr>
+      <w:r>
+        <w:rPr>
+          <w:b/>
+          <w:bCs/>
+        </w:rPr>
+        <w:t xml:space="preserve">`bluesInflection`</w:t>
+      </w:r>
+      <w:r>
+        <w:t xml:space="preserve"> — b3/b5 ×1.30, b7 ×1.20, weak-beat ×1.08, global </w:t>
+      </w:r>
+      <w:r>
+        <w:rPr>
+          <w:b/>
+          <w:bCs/>
+        </w:rPr>
+        <w:t xml:space="preserve">1.12</w:t>
+      </w:r>
+    </w:p>
+    <w:p>
+      <w:pPr>
+        <w:spacing w:after="80"/>
+        <w:ind w:left="360" w:hanging="260"/>
+      </w:pPr>
+      <w:r>
+        <w:rPr>
+          <w:b/>
+          <w:bCs/>
+        </w:rPr>
+        <w:t xml:space="preserve">`pentatonicAnchor`</w:t>
+      </w:r>
+      <w:r>
+        <w:t xml:space="preserve"> — anchor PCs </w:t>
+      </w:r>
+      <w:r>
+        <w:rPr>
+          <w:rFonts w:ascii="Consolas" w:cs="Consolas" w:eastAsia="Consolas" w:hAnsi="Consolas"/>
+          <w:sz w:val="20"/>
+          <w:szCs w:val="20"/>
+        </w:rPr>
+        <w:t xml:space="preserve">{0,3,5,7,10}</w:t>
+      </w:r>
+      <w:r>
+        <w:t xml:space="preserve"> relative to root; base </w:t>
+      </w:r>
+      <w:r>
+        <w:rPr>
+          <w:b/>
+          <w:bCs/>
+        </w:rPr>
+        <w:t xml:space="preserve">0.92</w:t>
+      </w:r>
+      <w:r>
+        <w:t xml:space="preserve">, hit bonus </w:t>
+      </w:r>
+      <w:r>
+        <w:rPr>
+          <w:b/>
+          <w:bCs/>
+        </w:rPr>
+        <w:t xml:space="preserve">×1.25</w:t>
+      </w:r>
+    </w:p>
+    <w:p>
+      <w:pPr>
+        <w:spacing w:after="80"/>
+        <w:ind w:left="360" w:hanging="260"/>
+      </w:pPr>
+      <w:r>
+        <w:rPr>
+          <w:b/>
+          <w:bCs/>
+        </w:rPr>
+        <w:t xml:space="preserve">`riffCellRecall`</w:t>
+      </w:r>
+      <w:r>
+        <w:t xml:space="preserve"> — five weighted interval cells (minor/blues pentatonic, major/chordal, chromatic connector); first recall </w:t>
+      </w:r>
+      <w:r>
+        <w:rPr>
+          <w:b/>
+          <w:bCs/>
+        </w:rPr>
+        <w:t xml:space="preserve">×1.24</w:t>
+      </w:r>
+      <w:r>
+        <w:t xml:space="preserve">, second </w:t>
+      </w:r>
+      <w:r>
+        <w:rPr>
+          <w:b/>
+          <w:bCs/>
+        </w:rPr>
+        <w:t xml:space="preserve">×1.18</w:t>
+      </w:r>
+      <w:r>
+        <w:t xml:space="preserve">, exact transposition </w:t>
+      </w:r>
+      <w:r>
+        <w:rPr>
+          <w:b/>
+          <w:bCs/>
+        </w:rPr>
+        <w:t xml:space="preserve">×1.10</w:t>
+      </w:r>
+      <w:r>
+        <w:t xml:space="preserve">, verbatim copy penalty </w:t>
+      </w:r>
+      <w:r>
+        <w:rPr>
+          <w:b/>
+          <w:bCs/>
+        </w:rPr>
+        <w:t xml:space="preserve">×0.60</w:t>
+      </w:r>
+    </w:p>
+    <w:p>
+      <w:pPr>
+        <w:spacing w:after="80"/>
+        <w:ind w:left="360" w:hanging="260"/>
+      </w:pPr>
+      <w:r>
+        <w:rPr>
+          <w:b/>
+          <w:bCs/>
+        </w:rPr>
+        <w:t xml:space="preserve">`callResponsePhraseScore`</w:t>
+      </w:r>
+      <w:r>
+        <w:t xml:space="preserve"> — phrase-pair pre-pass (call bar → response bar); </w:t>
+      </w:r>
+      <w:r>
+        <w:rPr>
+          <w:b/>
+          <w:bCs/>
+        </w:rPr>
+        <w:t xml:space="preserve">`callSimilarityTarget` 0.55</w:t>
+      </w:r>
+      <w:r>
+        <w:t xml:space="preserve"> design intent; response mutation bonus </w:t>
+      </w:r>
+      <w:r>
+        <w:rPr>
+          <w:b/>
+          <w:bCs/>
+        </w:rPr>
+        <w:t xml:space="preserve">×1.32</w:t>
+      </w:r>
+      <w:r>
+        <w:t xml:space="preserve">, verbatim repeat penalty </w:t>
+      </w:r>
+      <w:r>
+        <w:rPr>
+          <w:b/>
+          <w:bCs/>
+        </w:rPr>
+        <w:t xml:space="preserve">×0.52</w:t>
+      </w:r>
+      <w:r>
+        <w:t xml:space="preserve">, bar-3 intensity lift </w:t>
+      </w:r>
+      <w:r>
+        <w:rPr>
+          <w:b/>
+          <w:bCs/>
+        </w:rPr>
+        <w:t xml:space="preserve">×1.18</w:t>
+      </w:r>
+      <w:r>
+        <w:t xml:space="preserve">, phrase-end sustain </w:t>
+      </w:r>
+      <w:r>
+        <w:rPr>
+          <w:b/>
+          <w:bCs/>
+        </w:rPr>
+        <w:t xml:space="preserve">×1.25</w:t>
+      </w:r>
+      <w:r>
+        <w:t xml:space="preserve">, long-target vibrato </w:t>
+      </w:r>
+      <w:r>
+        <w:rPr>
+          <w:b/>
+          <w:bCs/>
+        </w:rPr>
+        <w:t xml:space="preserve">×1.20</w:t>
+      </w:r>
+      <w:r>
+        <w:t xml:space="preserve">. Deterministic mutation order: truncate → extend → invert → transpose → chromatic_swap.</w:t>
+      </w:r>
+    </w:p>
+    <w:p>
+      <w:pPr>
+        <w:spacing w:after="160"/>
+      </w:pPr>
+      <w:r>
+        <w:t xml:space="preserve">Surface: </w:t>
+      </w:r>
+      <w:r>
+        <w:rPr>
+          <w:b/>
+          <w:bCs/>
+        </w:rPr>
+        <w:t xml:space="preserve">`graceNoteRate` ~0.08</w:t>
+      </w:r>
+      <w:r>
+        <w:t xml:space="preserve">, </w:t>
+      </w:r>
+      <w:r>
+        <w:rPr>
+          <w:b/>
+          <w:bCs/>
+        </w:rPr>
+        <w:t xml:space="preserve">`bendTagRate` ~0.25</w:t>
+      </w:r>
+      <w:r>
+        <w:t xml:space="preserve">; no approach semitones. Routing: </w:t>
+      </w:r>
+      <w:r>
+        <w:rPr>
+          <w:b/>
+          <w:bCs/>
+        </w:rPr>
+        <w:t xml:space="preserve">`runGoldenPath.ts`</w:t>
+      </w:r>
+      <w:r>
+        <w:t xml:space="preserve"> (</w:t>
+      </w:r>
+      <w:r>
+        <w:rPr>
+          <w:rFonts w:ascii="Consolas" w:cs="Consolas" w:eastAsia="Consolas" w:hAnsi="Consolas"/>
+          <w:sz w:val="20"/>
+          <w:szCs w:val="20"/>
+        </w:rPr>
+        <w:t xml:space="preserve">hendrix</w:t>
+      </w:r>
+      <w:r>
+        <w:t xml:space="preserve"> + </w:t>
+      </w:r>
+      <w:r>
+        <w:rPr>
+          <w:rFonts w:ascii="Consolas" w:cs="Consolas" w:eastAsia="Consolas" w:hAnsi="Consolas"/>
+          <w:sz w:val="20"/>
+          <w:szCs w:val="20"/>
+        </w:rPr>
+        <w:t xml:space="preserve">guitar_bass_duo</w:t>
+      </w:r>
+      <w:r>
+        <w:t xml:space="preserve"> + import timeline harmony → </w:t>
+      </w:r>
+      <w:r>
+        <w:rPr>
+          <w:b/>
+          <w:bCs/>
+        </w:rPr>
+        <w:t xml:space="preserve">`applyPremiumMelodyPinExport`</w:t>
+      </w:r>
+      <w:r>
+        <w:t xml:space="preserve">). </w:t>
+      </w:r>
+      <w:r>
+        <w:rPr>
+          <w:b/>
+          <w:bCs/>
+        </w:rPr>
+        <w:t xml:space="preserve">`jhGoldenMaster.test.ts`</w:t>
+      </w:r>
+      <w:r>
+        <w:t xml:space="preserve"> + </w:t>
+      </w:r>
+      <w:r>
+        <w:rPr>
+          <w:b/>
+          <w:bCs/>
+        </w:rPr>
+        <w:t xml:space="preserve">`jh-isolation-seed90303.golden.*`</w:t>
+      </w:r>
+      <w:r>
+        <w:t xml:space="preserve"> (PROVISIONAL). Validation (</w:t>
+      </w:r>
+      <w:r>
+        <w:rPr>
+          <w:b/>
+          <w:bCs/>
+        </w:rPr>
+        <w:t xml:space="preserve">`jhPremiumMelodyValidation.ts`</w:t>
+      </w:r>
+      <w:r>
+        <w:t xml:space="preserve">, </w:t>
+      </w:r>
+      <w:r>
+        <w:rPr>
+          <w:b/>
+          <w:bCs/>
+        </w:rPr>
+        <w:t xml:space="preserve">`runJhPremiumMelodyAutoValidation.ts`</w:t>
+      </w:r>
+      <w:r>
+        <w:t xml:space="preserve">): rhythm + pitch-mechanism gates — thresholds </w:t>
+      </w:r>
+      <w:r>
+        <w:rPr>
+          <w:b/>
+          <w:bCs/>
+        </w:rPr>
+        <w:t xml:space="preserve">PROVISIONAL</w:t>
+      </w:r>
+      <w:r>
+        <w:t xml:space="preserve"> until </w:t>
+      </w:r>
+      <w:r>
+        <w:rPr>
+          <w:b/>
+          <w:bCs/>
+        </w:rPr>
+        <w:t xml:space="preserve">2c</w:t>
+      </w:r>
+      <w:r>
+        <w:t xml:space="preserve"> native benchmark freeze. QA export: </w:t>
+      </w:r>
+      <w:r>
+        <w:rPr>
+          <w:b/>
+          <w:bCs/>
+        </w:rPr>
+        <w:t xml:space="preserve">Song Mode</w:t>
+      </w:r>
+      <w:r>
+        <w:t xml:space="preserve"> / </w:t>
+      </w:r>
+      <w:r>
+        <w:rPr>
+          <w:rFonts w:ascii="Consolas" w:cs="Consolas" w:eastAsia="Consolas" w:hAnsi="Consolas"/>
+          <w:sz w:val="20"/>
+          <w:szCs w:val="20"/>
+        </w:rPr>
+        <w:t xml:space="preserve">jh-v86-2a2b-check.musicxml</w:t>
+      </w:r>
+      <w:r>
+        <w:t xml:space="preserve">. BH </w:t>
+      </w:r>
+      <w:r>
+        <w:rPr>
+          <w:b/>
+          <w:bCs/>
+        </w:rPr>
+        <w:t xml:space="preserve">1a</w:t>
+      </w:r>
+      <w:r>
+        <w:t xml:space="preserve"> golden master </w:t>
+      </w:r>
+      <w:r>
+        <w:rPr>
+          <w:b/>
+          <w:bCs/>
+        </w:rPr>
+        <w:t xml:space="preserve">byte-identical</w:t>
+      </w:r>
+      <w:r>
+        <w:t xml:space="preserve"> untouched.</w:t>
       </w:r>
     </w:p>
     <w:p>

</xml_diff>